<commit_message>
Give design verification its own Word export layout.
The DV template was a byte-for-byte copy of the investigation report, so
exports landed in a DMAIC document with the wrong download name.
</commit_message>
<xml_diff>
--- a/templates/design-verification-report-template.docx
+++ b/templates/design-verification-report-template.docx
@@ -19,7 +19,7 @@
           <w:insideH w:val="single" w:sz="4" w:space="0" w:color="auto"/>
           <w:insideV w:val="single" w:sz="4" w:space="0" w:color="auto"/>
         </w:tblBorders>
-        <w:tblLook w:val="01E0" w:firstRow="1" w:lastRow="1" w:firstColumn="1" w:lastColumn="1" w:noHBand="0" w:noVBand="0"/>
+        <w:tblLook w:val="01E0" w:firstRow="1" w:lastRow="0" w:firstColumn="1" w:lastColumn="1" w:noHBand="0" w:noVBand="0"/>
       </w:tblPr>
       <w:tblGrid>
         <w:gridCol w:w="1468"/>
@@ -29,24 +29,61 @@
       </w:tblGrid>
       <w:tr>
         <w:trPr>
-          <w:trHeight w:val="557"/>
+          <w:trHeight w:val="500"/>
           <w:jc w:val="center"/>
         </w:trPr>
         <w:tc>
           <w:tcPr>
-            <w:tcW w:w="702" w:type="pct"/>
+            <w:tcW w:w="5000" w:type="pct"/>
+            <w:gridSpan w:val="4"/>
             <w:tcBorders>
               <w:top w:val="single" w:sz="4" w:space="0" w:color="auto"/>
               <w:left w:val="single" w:sz="4" w:space="0" w:color="auto"/>
+              <w:bottom w:val="single" w:sz="4" w:space="0" w:color="auto"/>
               <w:right w:val="single" w:sz="4" w:space="0" w:color="auto"/>
             </w:tcBorders>
             <w:vAlign w:val="center"/>
-            <w:hideMark/>
           </w:tcPr>
           <w:p>
             <w:pPr>
-              <w:spacing w:before="60" w:line="276" w:lineRule="auto"/>
-              <w:jc w:val="both"/>
+              <w:spacing w:before="80" w:after="80" w:line="276" w:lineRule="auto"/>
+              <w:jc w:val="center"/>
+              <w:rPr>
+                <w:b/>
+                <w:sz w:val="28"/>
+                <w:szCs w:val="28"/>
+              </w:rPr>
+            </w:pPr>
+            <w:r>
+              <w:rPr>
+                <w:b/>
+                <w:sz w:val="28"/>
+                <w:szCs w:val="28"/>
+              </w:rPr>
+              <w:t>Design Verification Report</w:t>
+            </w:r>
+          </w:p>
+        </w:tc>
+      </w:tr>
+      <w:tr>
+        <w:trPr>
+          <w:trHeight w:val="500"/>
+          <w:jc w:val="center"/>
+        </w:trPr>
+        <w:tc>
+          <w:tcPr>
+            <w:tcW w:w="900" w:type="pct"/>
+            <w:tcBorders>
+              <w:top w:val="single" w:sz="4" w:space="0" w:color="auto"/>
+              <w:left w:val="single" w:sz="4" w:space="0" w:color="auto"/>
+              <w:bottom w:val="single" w:sz="4" w:space="0" w:color="auto"/>
+              <w:right w:val="single" w:sz="4" w:space="0" w:color="auto"/>
+            </w:tcBorders>
+            <w:vAlign w:val="center"/>
+          </w:tcPr>
+          <w:p>
+            <w:pPr>
+              <w:spacing w:before="60" w:after="40" w:line="276" w:lineRule="auto"/>
               <w:rPr>
                 <w:b/>
                 <w:sz w:val="24"/>
@@ -65,18 +102,18 @@
         </w:tc>
         <w:tc>
           <w:tcPr>
-            <w:tcW w:w="1643" w:type="pct"/>
+            <w:tcW w:w="1600" w:type="pct"/>
             <w:tcBorders>
               <w:top w:val="single" w:sz="4" w:space="0" w:color="auto"/>
               <w:left w:val="single" w:sz="4" w:space="0" w:color="auto"/>
+              <w:bottom w:val="single" w:sz="4" w:space="0" w:color="auto"/>
               <w:right w:val="single" w:sz="4" w:space="0" w:color="auto"/>
             </w:tcBorders>
             <w:vAlign w:val="center"/>
           </w:tcPr>
           <w:p>
             <w:pPr>
-              <w:spacing w:before="60" w:line="276" w:lineRule="auto"/>
-              <w:jc w:val="left"/>
+              <w:spacing w:before="60" w:after="40" w:line="276" w:lineRule="auto"/>
               <w:rPr>
                 <w:sz w:val="24"/>
                 <w:szCs w:val="24"/>
@@ -93,18 +130,18 @@
         </w:tc>
         <w:tc>
           <w:tcPr>
-            <w:tcW w:w="1197" w:type="pct"/>
+            <w:tcW w:w="1100" w:type="pct"/>
             <w:tcBorders>
               <w:top w:val="single" w:sz="4" w:space="0" w:color="auto"/>
               <w:left w:val="single" w:sz="4" w:space="0" w:color="auto"/>
+              <w:bottom w:val="single" w:sz="4" w:space="0" w:color="auto"/>
               <w:right w:val="single" w:sz="4" w:space="0" w:color="auto"/>
             </w:tcBorders>
             <w:vAlign w:val="center"/>
-            <w:hideMark/>
           </w:tcPr>
           <w:p>
             <w:pPr>
-              <w:spacing w:before="60" w:line="276" w:lineRule="auto"/>
+              <w:spacing w:before="60" w:after="40" w:line="276" w:lineRule="auto"/>
               <w:rPr>
                 <w:b/>
                 <w:sz w:val="24"/>
@@ -117,24 +154,24 @@
                 <w:sz w:val="24"/>
                 <w:szCs w:val="24"/>
               </w:rPr>
-              <w:t>Deviation No.</w:t>
+              <w:t>Document No.:</w:t>
             </w:r>
           </w:p>
         </w:tc>
         <w:tc>
           <w:tcPr>
-            <w:tcW w:w="1458" w:type="pct"/>
+            <w:tcW w:w="1400" w:type="pct"/>
             <w:tcBorders>
               <w:top w:val="single" w:sz="4" w:space="0" w:color="auto"/>
               <w:left w:val="single" w:sz="4" w:space="0" w:color="auto"/>
+              <w:bottom w:val="single" w:sz="4" w:space="0" w:color="auto"/>
               <w:right w:val="single" w:sz="4" w:space="0" w:color="auto"/>
             </w:tcBorders>
             <w:vAlign w:val="center"/>
           </w:tcPr>
           <w:p>
             <w:pPr>
-              <w:spacing w:before="60" w:line="276" w:lineRule="auto"/>
-              <w:jc w:val="left"/>
+              <w:spacing w:before="60" w:after="40" w:line="276" w:lineRule="auto"/>
               <w:rPr>
                 <w:sz w:val="24"/>
                 <w:szCs w:val="24"/>
@@ -145,32 +182,30 @@
                 <w:sz w:val="24"/>
                 <w:szCs w:val="24"/>
               </w:rPr>
-              <w:t xml:space="preserve">{deviationNo}</w:t>
+              <w:t xml:space="preserve">{documentNo}</w:t>
             </w:r>
           </w:p>
         </w:tc>
       </w:tr>
       <w:tr>
         <w:trPr>
-          <w:trHeight w:val="407"/>
+          <w:trHeight w:val="500"/>
           <w:jc w:val="center"/>
         </w:trPr>
         <w:tc>
           <w:tcPr>
-            <w:tcW w:w="5000" w:type="pct"/>
-            <w:gridSpan w:val="4"/>
+            <w:tcW w:w="900" w:type="pct"/>
             <w:tcBorders>
               <w:top w:val="single" w:sz="4" w:space="0" w:color="auto"/>
               <w:left w:val="single" w:sz="4" w:space="0" w:color="auto"/>
               <w:bottom w:val="single" w:sz="4" w:space="0" w:color="auto"/>
               <w:right w:val="single" w:sz="4" w:space="0" w:color="auto"/>
             </w:tcBorders>
-            <w:hideMark/>
+            <w:vAlign w:val="center"/>
           </w:tcPr>
           <w:p>
             <w:pPr>
-              <w:spacing w:before="60" w:line="276" w:lineRule="auto"/>
-              <w:jc w:val="left"/>
+              <w:spacing w:before="60" w:after="40" w:line="276" w:lineRule="auto"/>
               <w:rPr>
                 <w:b/>
                 <w:sz w:val="24"/>
@@ -183,187 +218,52 @@
                 <w:sz w:val="24"/>
                 <w:szCs w:val="24"/>
               </w:rPr>
-              <w:t xml:space="preserve">Investigation tool used:  </w:t>
-            </w:r>
-            <w:r>
-              <w:rPr>
-                <w:sz w:val="24"/>
-                <w:szCs w:val="24"/>
-              </w:rPr>
-              <w:fldChar w:fldCharType="begin">
-                <w:ffData>
-                  <w:name w:val="toolSixM"/>
-                  <w:enabled/>
-                  <w:calcOnExit w:val="0"/>
-                  <w:checkBox>
-                    <w:sizeAuto/>
-                    <w:default w:val="0"/>
-                  </w:checkBox>
-                </w:ffData>
-              </w:fldChar>
-            </w:r>
-            <w:r>
-              <w:rPr>
-                <w:sz w:val="24"/>
-                <w:szCs w:val="24"/>
-              </w:rPr>
-              <w:instrText xml:space="preserve"> FORMCHECKBOX </w:instrText>
-            </w:r>
-            <w:r>
-              <w:rPr>
-                <w:sz w:val="24"/>
-                <w:szCs w:val="24"/>
-              </w:rPr>
-            </w:r>
-            <w:r>
-              <w:rPr>
-                <w:sz w:val="24"/>
-                <w:szCs w:val="24"/>
-              </w:rPr>
-              <w:fldChar w:fldCharType="separate"/>
-            </w:r>
-            <w:r>
-              <w:rPr>
-                <w:sz w:val="24"/>
-                <w:szCs w:val="24"/>
-              </w:rPr>
-              <w:fldChar w:fldCharType="end"/>
-            </w:r>
-            <w:r>
-              <w:rPr>
-                <w:b/>
-                <w:sz w:val="24"/>
-                <w:szCs w:val="24"/>
-              </w:rPr>
-              <w:t xml:space="preserve"> 6M     </w:t>
-            </w:r>
-            <w:r>
-              <w:rPr>
-                <w:sz w:val="24"/>
-                <w:szCs w:val="24"/>
-              </w:rPr>
-              <w:fldChar w:fldCharType="begin">
-                <w:ffData>
-                  <w:name w:val="toolFiveWhy"/>
-                  <w:enabled/>
-                  <w:calcOnExit w:val="0"/>
-                  <w:checkBox>
-                    <w:sizeAuto/>
-                    <w:default w:val="0"/>
-                  </w:checkBox>
-                </w:ffData>
-              </w:fldChar>
-            </w:r>
-            <w:r>
-              <w:rPr>
-                <w:sz w:val="24"/>
-                <w:szCs w:val="24"/>
-              </w:rPr>
-              <w:instrText xml:space="preserve"> FORMCHECKBOX </w:instrText>
-            </w:r>
-            <w:r>
-              <w:rPr>
-                <w:sz w:val="24"/>
-                <w:szCs w:val="24"/>
-              </w:rPr>
-            </w:r>
-            <w:r>
-              <w:rPr>
-                <w:sz w:val="24"/>
-                <w:szCs w:val="24"/>
-              </w:rPr>
-              <w:fldChar w:fldCharType="separate"/>
-            </w:r>
-            <w:r>
-              <w:rPr>
-                <w:sz w:val="24"/>
-                <w:szCs w:val="24"/>
-              </w:rPr>
-              <w:fldChar w:fldCharType="end"/>
-            </w:r>
-            <w:r>
-              <w:rPr>
-                <w:b/>
-                <w:sz w:val="24"/>
-                <w:szCs w:val="24"/>
-              </w:rPr>
-              <w:t xml:space="preserve"> 5 Why     </w:t>
-            </w:r>
-            <w:r>
-              <w:rPr>
-                <w:sz w:val="24"/>
-                <w:szCs w:val="24"/>
-              </w:rPr>
-              <w:fldChar w:fldCharType="begin">
-                <w:ffData>
-                  <w:name w:val="toolBrainstorming"/>
-                  <w:enabled/>
-                  <w:calcOnExit w:val="0"/>
-                  <w:checkBox>
-                    <w:sizeAuto/>
-                    <w:default w:val="0"/>
-                  </w:checkBox>
-                </w:ffData>
-              </w:fldChar>
-            </w:r>
-            <w:r>
-              <w:rPr>
-                <w:sz w:val="24"/>
-                <w:szCs w:val="24"/>
-              </w:rPr>
-              <w:instrText xml:space="preserve"> FORMCHECKBOX </w:instrText>
-            </w:r>
-            <w:r>
-              <w:rPr>
-                <w:sz w:val="24"/>
-                <w:szCs w:val="24"/>
-              </w:rPr>
-            </w:r>
-            <w:r>
-              <w:rPr>
-                <w:sz w:val="24"/>
-                <w:szCs w:val="24"/>
-              </w:rPr>
-              <w:fldChar w:fldCharType="separate"/>
-            </w:r>
-            <w:r>
-              <w:rPr>
-                <w:sz w:val="24"/>
-                <w:szCs w:val="24"/>
-              </w:rPr>
-              <w:fldChar w:fldCharType="end"/>
-            </w:r>
-            <w:r>
-              <w:rPr>
-                <w:b/>
-                <w:sz w:val="24"/>
-                <w:szCs w:val="24"/>
-              </w:rPr>
-              <w:t xml:space="preserve"> Brainstorming</w:t>
+              <w:t>Product:</w:t>
             </w:r>
           </w:p>
         </w:tc>
-      </w:tr>
-      <w:tr>
-        <w:trPr>
-          <w:trHeight w:val="407"/>
-          <w:jc w:val="center"/>
-        </w:trPr>
         <w:tc>
           <w:tcPr>
-            <w:tcW w:w="5000" w:type="pct"/>
-            <w:gridSpan w:val="4"/>
+            <w:tcW w:w="1600" w:type="pct"/>
             <w:tcBorders>
               <w:top w:val="single" w:sz="4" w:space="0" w:color="auto"/>
               <w:left w:val="single" w:sz="4" w:space="0" w:color="auto"/>
               <w:bottom w:val="single" w:sz="4" w:space="0" w:color="auto"/>
               <w:right w:val="single" w:sz="4" w:space="0" w:color="auto"/>
             </w:tcBorders>
+            <w:vAlign w:val="center"/>
           </w:tcPr>
           <w:p>
             <w:pPr>
-              <w:spacing w:before="60" w:line="276" w:lineRule="auto"/>
-              <w:jc w:val="left"/>
+              <w:spacing w:before="60" w:after="40" w:line="276" w:lineRule="auto"/>
+              <w:rPr>
+                <w:sz w:val="24"/>
+                <w:szCs w:val="24"/>
+              </w:rPr>
+            </w:pPr>
+            <w:r>
+              <w:rPr>
+                <w:sz w:val="24"/>
+                <w:szCs w:val="24"/>
+              </w:rPr>
+              <w:t xml:space="preserve">{productName}</w:t>
+            </w:r>
+          </w:p>
+        </w:tc>
+        <w:tc>
+          <w:tcPr>
+            <w:tcW w:w="1100" w:type="pct"/>
+            <w:tcBorders>
+              <w:top w:val="single" w:sz="4" w:space="0" w:color="auto"/>
+              <w:left w:val="single" w:sz="4" w:space="0" w:color="auto"/>
+              <w:bottom w:val="single" w:sz="4" w:space="0" w:color="auto"/>
+              <w:right w:val="single" w:sz="4" w:space="0" w:color="auto"/>
+            </w:tcBorders>
+            <w:vAlign w:val="center"/>
+          </w:tcPr>
+          <w:p>
+            <w:pPr>
+              <w:spacing w:before="60" w:after="40" w:line="276" w:lineRule="auto"/>
               <w:rPr>
                 <w:b/>
                 <w:sz w:val="24"/>
@@ -376,38 +276,24 @@
                 <w:sz w:val="24"/>
                 <w:szCs w:val="24"/>
               </w:rPr>
-              <w:t xml:space="preserve">Other Tools (If any): </w:t>
-            </w:r>
-            <w:r>
-              <w:rPr>
-                <w:sz w:val="24"/>
-                <w:szCs w:val="24"/>
-              </w:rPr>
-              <w:t xml:space="preserve">{otherToolsDisplay}</w:t>
+              <w:t>Revision:</w:t>
             </w:r>
           </w:p>
         </w:tc>
-      </w:tr>
-      <w:tr>
-        <w:trPr>
-          <w:trHeight w:val="386"/>
-          <w:jc w:val="center"/>
-        </w:trPr>
         <w:tc>
           <w:tcPr>
-            <w:tcW w:w="5000" w:type="pct"/>
-            <w:gridSpan w:val="4"/>
+            <w:tcW w:w="1400" w:type="pct"/>
             <w:tcBorders>
               <w:top w:val="single" w:sz="4" w:space="0" w:color="auto"/>
               <w:left w:val="single" w:sz="4" w:space="0" w:color="auto"/>
               <w:bottom w:val="single" w:sz="4" w:space="0" w:color="auto"/>
               <w:right w:val="single" w:sz="4" w:space="0" w:color="auto"/>
             </w:tcBorders>
+            <w:vAlign w:val="center"/>
           </w:tcPr>
           <w:p>
             <w:pPr>
-              <w:spacing w:before="60" w:line="276" w:lineRule="auto"/>
-              <w:jc w:val="left"/>
+              <w:spacing w:before="60" w:after="40" w:line="276" w:lineRule="auto"/>
               <w:rPr>
                 <w:sz w:val="24"/>
                 <w:szCs w:val="24"/>
@@ -418,1451 +304,7 @@
                 <w:sz w:val="24"/>
                 <w:szCs w:val="24"/>
               </w:rPr>
-              <w:t xml:space="preserve"> </w:t>
-            </w:r>
-          </w:p>
-        </w:tc>
-      </w:tr>
-      <w:tr>
-        <w:trPr>
-          <w:trHeight w:val="360"/>
-          <w:jc w:val="center"/>
-        </w:trPr>
-        <w:tc>
-          <w:tcPr>
-            <w:tcW w:w="5000" w:type="pct"/>
-            <w:gridSpan w:val="4"/>
-            <w:tcBorders>
-              <w:top w:val="single" w:sz="4" w:space="0" w:color="auto"/>
-              <w:left w:val="single" w:sz="4" w:space="0" w:color="auto"/>
-              <w:bottom w:val="single" w:sz="4" w:space="0" w:color="auto"/>
-              <w:right w:val="single" w:sz="4" w:space="0" w:color="auto"/>
-            </w:tcBorders>
-          </w:tcPr>
-          <w:p>
-            <w:pPr>
-              <w:spacing w:before="60" w:line="276" w:lineRule="auto"/>
-              <w:jc w:val="both"/>
-              <w:rPr>
-                <w:b/>
-                <w:sz w:val="24"/>
-                <w:szCs w:val="24"/>
-              </w:rPr>
-            </w:pPr>
-            <w:r>
-              <w:rPr>
-                <w:b/>
-                <w:sz w:val="24"/>
-                <w:szCs w:val="24"/>
-              </w:rPr>
-              <w:t>Define:</w:t>
-            </w:r>
-          </w:p>
-        </w:tc>
-      </w:tr>
-      <w:tr>
-        <w:trPr>
-          <w:trHeight w:val="10583"/>
-          <w:jc w:val="center"/>
-        </w:trPr>
-        <w:tc>
-          <w:tcPr>
-            <w:tcW w:w="5000" w:type="pct"/>
-            <w:gridSpan w:val="4"/>
-            <w:tcBorders>
-              <w:top w:val="single" w:sz="4" w:space="0" w:color="auto"/>
-              <w:left w:val="single" w:sz="4" w:space="0" w:color="auto"/>
-              <w:bottom w:val="single" w:sz="4" w:space="0" w:color="auto"/>
-              <w:right w:val="single" w:sz="4" w:space="0" w:color="auto"/>
-            </w:tcBorders>
-          </w:tcPr>
-          <w:p>
-            <w:pPr>
-              <w:spacing w:before="60" w:line="276" w:lineRule="auto"/>
-              <w:jc w:val="left"/>
-              <w:rPr>
-                <w:sz w:val="24"/>
-                <w:szCs w:val="24"/>
-              </w:rPr>
-            </w:pPr>
-            <w:r>
-              <w:rPr>
-                <w:sz w:val="24"/>
-                <w:szCs w:val="24"/>
-              </w:rPr>
-              <w:t xml:space="preserve">{@defineNarrativeXml}</w:t>
-            </w:r>
-          </w:p>
-        </w:tc>
-      </w:tr>
-      <w:tr>
-        <w:trPr>
-          <w:trHeight w:val="70"/>
-          <w:jc w:val="center"/>
-        </w:trPr>
-        <w:tc>
-          <w:tcPr>
-            <w:tcW w:w="5000" w:type="pct"/>
-            <w:gridSpan w:val="4"/>
-            <w:tcBorders>
-              <w:top w:val="single" w:sz="4" w:space="0" w:color="auto"/>
-              <w:left w:val="single" w:sz="4" w:space="0" w:color="auto"/>
-              <w:bottom w:val="single" w:sz="4" w:space="0" w:color="auto"/>
-              <w:right w:val="single" w:sz="4" w:space="0" w:color="auto"/>
-            </w:tcBorders>
-            <w:hideMark/>
-          </w:tcPr>
-          <w:p>
-            <w:pPr>
-              <w:spacing w:before="60" w:line="276" w:lineRule="auto"/>
-              <w:jc w:val="both"/>
-              <w:rPr>
-                <w:b/>
-                <w:sz w:val="24"/>
-                <w:szCs w:val="24"/>
-              </w:rPr>
-            </w:pPr>
-            <w:r>
-              <w:rPr>
-                <w:b/>
-                <w:sz w:val="24"/>
-                <w:szCs w:val="24"/>
-              </w:rPr>
-              <w:t>Details Investigation:</w:t>
-            </w:r>
-          </w:p>
-        </w:tc>
-      </w:tr>
-      <w:tr>
-        <w:trPr>
-          <w:trHeight w:val="70"/>
-          <w:jc w:val="center"/>
-        </w:trPr>
-        <w:tc>
-          <w:tcPr>
-            <w:tcW w:w="5000" w:type="pct"/>
-            <w:gridSpan w:val="4"/>
-            <w:tcBorders>
-              <w:top w:val="single" w:sz="4" w:space="0" w:color="auto"/>
-              <w:left w:val="single" w:sz="4" w:space="0" w:color="auto"/>
-              <w:bottom w:val="single" w:sz="4" w:space="0" w:color="auto"/>
-              <w:right w:val="single" w:sz="4" w:space="0" w:color="auto"/>
-            </w:tcBorders>
-          </w:tcPr>
-          <w:p>
-            <w:pPr>
-              <w:spacing w:before="60" w:line="276" w:lineRule="auto"/>
-              <w:jc w:val="left"/>
-              <w:rPr>
-                <w:b/>
-                <w:sz w:val="24"/>
-                <w:szCs w:val="24"/>
-              </w:rPr>
-            </w:pPr>
-            <w:r>
-              <w:rPr>
-                <w:b/>
-                <w:sz w:val="24"/>
-                <w:szCs w:val="24"/>
-              </w:rPr>
-              <w:t xml:space="preserve">Measure:</w:t>
-            </w:r>
-          </w:p>
-          <w:p>
-            <w:pPr>
-              <w:spacing w:before="60" w:line="276" w:lineRule="auto"/>
-              <w:jc w:val="left"/>
-              <w:rPr>
-                <w:sz w:val="24"/>
-                <w:szCs w:val="24"/>
-              </w:rPr>
-            </w:pPr>
-            <w:r>
-              <w:rPr>
-                <w:sz w:val="24"/>
-                <w:szCs w:val="24"/>
-              </w:rPr>
-              <w:t xml:space="preserve">{@measureNarrativeXml}</w:t>
-            </w:r>
-          </w:p>
-        </w:tc>
-      </w:tr>
-      <w:tr>
-        <w:trPr>
-          <w:trHeight w:val="70"/>
-          <w:jc w:val="center"/>
-        </w:trPr>
-        <w:tc>
-          <w:tcPr>
-            <w:tcW w:w="5000" w:type="pct"/>
-            <w:gridSpan w:val="4"/>
-            <w:tcBorders>
-              <w:top w:val="single" w:sz="4" w:space="0" w:color="auto"/>
-              <w:left w:val="single" w:sz="4" w:space="0" w:color="auto"/>
-              <w:bottom w:val="single" w:sz="4" w:space="0" w:color="auto"/>
-              <w:right w:val="single" w:sz="4" w:space="0" w:color="auto"/>
-            </w:tcBorders>
-            <w:vAlign w:val="center"/>
-          </w:tcPr>
-          <w:p>
-            <w:pPr>
-              <w:spacing w:before="60" w:line="276" w:lineRule="auto"/>
-              <w:jc w:val="both"/>
-              <w:rPr>
-                <w:b/>
-                <w:sz w:val="24"/>
-                <w:szCs w:val="24"/>
-              </w:rPr>
-            </w:pPr>
-            <w:r>
-              <w:rPr>
-                <w:b/>
-                <w:sz w:val="24"/>
-                <w:szCs w:val="24"/>
-              </w:rPr>
-              <w:t>Analyze: Various investigation tools used to analyze the root cause like 6M, 5 Why, Personnel interview, Brainstorming etc.</w:t>
-            </w:r>
-          </w:p>
-        </w:tc>
-      </w:tr>
-      <w:tr>
-        <w:trPr>
-          <w:trHeight w:val="824"/>
-          <w:jc w:val="center"/>
-        </w:trPr>
-        <w:tc>
-          <w:tcPr>
-            <w:tcW w:w="5000" w:type="pct"/>
-            <w:gridSpan w:val="4"/>
-            <w:tcBorders>
-              <w:top w:val="single" w:sz="4" w:space="0" w:color="auto"/>
-              <w:left w:val="single" w:sz="4" w:space="0" w:color="auto"/>
-              <w:bottom w:val="single" w:sz="4" w:space="0" w:color="auto"/>
-              <w:right w:val="single" w:sz="4" w:space="0" w:color="auto"/>
-            </w:tcBorders>
-          </w:tcPr>
-          <w:p>
-            <w:pPr>
-              <w:spacing w:before="60" w:line="276" w:lineRule="auto"/>
-              <w:jc w:val="left"/>
-              <w:rPr>
-                <w:b/>
-                <w:sz w:val="24"/>
-                <w:szCs w:val="24"/>
-              </w:rPr>
-            </w:pPr>
-            <w:r>
-              <w:rPr>
-                <w:b/>
-                <w:sz w:val="24"/>
-                <w:szCs w:val="24"/>
-              </w:rPr>
-              <w:t xml:space="preserve">6 M Method (If Applicable):</w:t>
-            </w:r>
-          </w:p>
-          <w:p>
-            <w:pPr>
-              <w:spacing w:before="60" w:line="276" w:lineRule="auto"/>
-              <w:jc w:val="left"/>
-              <w:rPr>
-                <w:b/>
-                <w:sz w:val="24"/>
-                <w:szCs w:val="24"/>
-              </w:rPr>
-            </w:pPr>
-            <w:r>
-              <w:rPr>
-                <w:b/>
-                <w:sz w:val="24"/>
-                <w:szCs w:val="24"/>
-              </w:rPr>
-              <w:t xml:space="preserve">Man: </w:t>
-            </w:r>
-            <w:r>
-              <w:rPr>
-                <w:sz w:val="24"/>
-                <w:szCs w:val="24"/>
-              </w:rPr>
-              <w:t xml:space="preserve">{sixMMan}</w:t>
-            </w:r>
-          </w:p>
-          <w:p>
-            <w:pPr>
-              <w:spacing w:before="60" w:line="276" w:lineRule="auto"/>
-              <w:jc w:val="left"/>
-              <w:rPr>
-                <w:b/>
-                <w:sz w:val="24"/>
-                <w:szCs w:val="24"/>
-              </w:rPr>
-            </w:pPr>
-            <w:r>
-              <w:rPr>
-                <w:b/>
-                <w:sz w:val="24"/>
-                <w:szCs w:val="24"/>
-              </w:rPr>
-              <w:t xml:space="preserve">Machine: </w:t>
-            </w:r>
-            <w:r>
-              <w:rPr>
-                <w:sz w:val="24"/>
-                <w:szCs w:val="24"/>
-              </w:rPr>
-              <w:t xml:space="preserve">{sixMMachine}</w:t>
-            </w:r>
-          </w:p>
-          <w:p>
-            <w:pPr>
-              <w:spacing w:before="60" w:line="276" w:lineRule="auto"/>
-              <w:jc w:val="left"/>
-              <w:rPr>
-                <w:b/>
-                <w:sz w:val="24"/>
-                <w:szCs w:val="24"/>
-              </w:rPr>
-            </w:pPr>
-            <w:r>
-              <w:rPr>
-                <w:b/>
-                <w:sz w:val="24"/>
-                <w:szCs w:val="24"/>
-              </w:rPr>
-              <w:t xml:space="preserve">Measurement: </w:t>
-            </w:r>
-            <w:r>
-              <w:rPr>
-                <w:sz w:val="24"/>
-                <w:szCs w:val="24"/>
-              </w:rPr>
-              <w:t xml:space="preserve">{sixMMeasurement}</w:t>
-            </w:r>
-          </w:p>
-          <w:p>
-            <w:pPr>
-              <w:spacing w:before="60" w:line="276" w:lineRule="auto"/>
-              <w:jc w:val="left"/>
-              <w:rPr>
-                <w:b/>
-                <w:sz w:val="24"/>
-                <w:szCs w:val="24"/>
-              </w:rPr>
-            </w:pPr>
-            <w:r>
-              <w:rPr>
-                <w:b/>
-                <w:sz w:val="24"/>
-                <w:szCs w:val="24"/>
-              </w:rPr>
-              <w:t xml:space="preserve">Material: </w:t>
-            </w:r>
-            <w:r>
-              <w:rPr>
-                <w:sz w:val="24"/>
-                <w:szCs w:val="24"/>
-              </w:rPr>
-              <w:t xml:space="preserve">{sixMMaterial}</w:t>
-            </w:r>
-          </w:p>
-          <w:p>
-            <w:pPr>
-              <w:spacing w:before="60" w:line="276" w:lineRule="auto"/>
-              <w:jc w:val="left"/>
-              <w:rPr>
-                <w:b/>
-                <w:sz w:val="24"/>
-                <w:szCs w:val="24"/>
-              </w:rPr>
-            </w:pPr>
-            <w:r>
-              <w:rPr>
-                <w:b/>
-                <w:sz w:val="24"/>
-                <w:szCs w:val="24"/>
-              </w:rPr>
-              <w:t xml:space="preserve">Method: </w:t>
-            </w:r>
-            <w:r>
-              <w:rPr>
-                <w:sz w:val="24"/>
-                <w:szCs w:val="24"/>
-              </w:rPr>
-              <w:t xml:space="preserve">{sixMMethod}</w:t>
-            </w:r>
-          </w:p>
-          <w:p>
-            <w:pPr>
-              <w:spacing w:before="60" w:line="276" w:lineRule="auto"/>
-              <w:jc w:val="left"/>
-              <w:rPr>
-                <w:b/>
-                <w:sz w:val="24"/>
-                <w:szCs w:val="24"/>
-              </w:rPr>
-            </w:pPr>
-            <w:r>
-              <w:rPr>
-                <w:b/>
-                <w:sz w:val="24"/>
-                <w:szCs w:val="24"/>
-              </w:rPr>
-              <w:t xml:space="preserve">Milieu (Environment): </w:t>
-            </w:r>
-            <w:r>
-              <w:rPr>
-                <w:sz w:val="24"/>
-                <w:szCs w:val="24"/>
-              </w:rPr>
-              <w:t xml:space="preserve">{sixMMilieu}</w:t>
-            </w:r>
-          </w:p>
-          <w:p>
-            <w:pPr>
-              <w:spacing w:before="60" w:line="276" w:lineRule="auto"/>
-              <w:jc w:val="left"/>
-              <w:rPr>
-                <w:b/>
-                <w:sz w:val="24"/>
-                <w:szCs w:val="24"/>
-              </w:rPr>
-            </w:pPr>
-            <w:r>
-              <w:rPr>
-                <w:b/>
-                <w:sz w:val="24"/>
-                <w:szCs w:val="24"/>
-              </w:rPr>
-              <w:t xml:space="preserve">Conclusion: </w:t>
-            </w:r>
-            <w:r>
-              <w:rPr>
-                <w:sz w:val="24"/>
-                <w:szCs w:val="24"/>
-              </w:rPr>
-              <w:t xml:space="preserve">{sixMConclusion}</w:t>
-            </w:r>
-          </w:p>
-        </w:tc>
-      </w:tr>
-      <w:tr>
-        <w:trPr>
-          <w:trHeight w:val="70"/>
-          <w:jc w:val="center"/>
-        </w:trPr>
-        <w:tc>
-          <w:tcPr>
-            <w:tcW w:w="5000" w:type="pct"/>
-            <w:gridSpan w:val="4"/>
-            <w:tcBorders>
-              <w:top w:val="single" w:sz="4" w:space="0" w:color="auto"/>
-              <w:left w:val="single" w:sz="4" w:space="0" w:color="auto"/>
-              <w:bottom w:val="single" w:sz="4" w:space="0" w:color="auto"/>
-              <w:right w:val="single" w:sz="4" w:space="0" w:color="auto"/>
-            </w:tcBorders>
-          </w:tcPr>
-          <w:p>
-            <w:pPr>
-              <w:spacing w:before="60" w:line="276" w:lineRule="auto"/>
-              <w:jc w:val="both"/>
-              <w:rPr>
-                <w:b/>
-                <w:sz w:val="24"/>
-                <w:szCs w:val="24"/>
-              </w:rPr>
-            </w:pPr>
-            <w:r>
-              <w:rPr>
-                <w:b/>
-                <w:sz w:val="24"/>
-                <w:szCs w:val="24"/>
-              </w:rPr>
-              <w:t xml:space="preserve">Note: </w:t>
-            </w:r>
-            <w:r>
-              <w:rPr>
-                <w:b/>
-                <w:sz w:val="24"/>
-                <w:szCs w:val="24"/>
-              </w:rPr>
-              <w:t>No</w:t>
-            </w:r>
-            <w:r>
-              <w:rPr>
-                <w:b/>
-                <w:sz w:val="24"/>
-                <w:szCs w:val="24"/>
-              </w:rPr>
-              <w:t xml:space="preserve"> 6 M question shall be deleted in </w:t>
-            </w:r>
-            <w:r>
-              <w:rPr>
-                <w:b/>
-                <w:sz w:val="24"/>
-                <w:szCs w:val="24"/>
-              </w:rPr>
-              <w:t xml:space="preserve">the </w:t>
-            </w:r>
-            <w:r>
-              <w:rPr>
-                <w:b/>
-                <w:sz w:val="24"/>
-                <w:szCs w:val="24"/>
-              </w:rPr>
-              <w:t xml:space="preserve">investigation, </w:t>
-            </w:r>
-            <w:r>
-              <w:rPr>
-                <w:b/>
-                <w:sz w:val="24"/>
-                <w:szCs w:val="24"/>
-              </w:rPr>
-              <w:t>if</w:t>
-            </w:r>
-            <w:r>
-              <w:rPr>
-                <w:b/>
-                <w:sz w:val="24"/>
-                <w:szCs w:val="24"/>
-              </w:rPr>
-              <w:t xml:space="preserve"> any question is not applicable, then mention in ans. as “Not Applicable”.</w:t>
-            </w:r>
-          </w:p>
-        </w:tc>
-      </w:tr>
-      <w:tr>
-        <w:trPr>
-          <w:trHeight w:val="7820"/>
-          <w:jc w:val="center"/>
-        </w:trPr>
-        <w:tc>
-          <w:tcPr>
-            <w:tcW w:w="5000" w:type="pct"/>
-            <w:gridSpan w:val="4"/>
-            <w:tcBorders>
-              <w:top w:val="single" w:sz="4" w:space="0" w:color="auto"/>
-              <w:left w:val="single" w:sz="4" w:space="0" w:color="auto"/>
-              <w:bottom w:val="single" w:sz="4" w:space="0" w:color="auto"/>
-              <w:right w:val="single" w:sz="4" w:space="0" w:color="auto"/>
-            </w:tcBorders>
-          </w:tcPr>
-          <w:p>
-            <w:pPr>
-              <w:spacing w:before="60" w:line="276" w:lineRule="auto"/>
-              <w:jc w:val="left"/>
-              <w:rPr>
-                <w:b/>
-                <w:sz w:val="24"/>
-                <w:szCs w:val="24"/>
-              </w:rPr>
-            </w:pPr>
-            <w:r>
-              <w:rPr>
-                <w:b/>
-                <w:sz w:val="24"/>
-                <w:szCs w:val="24"/>
-              </w:rPr>
-              <w:t xml:space="preserve">5 Why Approach (If Applicable):</w:t>
-            </w:r>
-          </w:p>
-          <w:p>
-            <w:pPr>
-              <w:spacing w:before="60" w:line="276" w:lineRule="auto"/>
-              <w:jc w:val="left"/>
-              <w:rPr>
-                <w:sz w:val="24"/>
-                <w:szCs w:val="24"/>
-              </w:rPr>
-            </w:pPr>
-            <w:r>
-              <w:rPr>
-                <w:sz w:val="24"/>
-                <w:szCs w:val="24"/>
-              </w:rPr>
-              <w:t xml:space="preserve">{@fiveWhyNarrativeXml}</w:t>
-            </w:r>
-          </w:p>
-        </w:tc>
-      </w:tr>
-      <w:tr>
-        <w:trPr>
-          <w:trHeight w:val="878"/>
-          <w:jc w:val="center"/>
-        </w:trPr>
-        <w:tc>
-          <w:tcPr>
-            <w:tcW w:w="5000" w:type="pct"/>
-            <w:gridSpan w:val="4"/>
-            <w:tcBorders>
-              <w:top w:val="single" w:sz="4" w:space="0" w:color="auto"/>
-              <w:left w:val="single" w:sz="4" w:space="0" w:color="auto"/>
-              <w:bottom w:val="single" w:sz="4" w:space="0" w:color="auto"/>
-              <w:right w:val="single" w:sz="4" w:space="0" w:color="auto"/>
-            </w:tcBorders>
-          </w:tcPr>
-          <w:p>
-            <w:pPr>
-              <w:spacing w:before="60" w:line="276" w:lineRule="auto"/>
-              <w:jc w:val="left"/>
-              <w:rPr>
-                <w:b/>
-                <w:sz w:val="24"/>
-                <w:szCs w:val="24"/>
-              </w:rPr>
-            </w:pPr>
-            <w:r>
-              <w:rPr>
-                <w:b/>
-                <w:sz w:val="24"/>
-                <w:szCs w:val="24"/>
-              </w:rPr>
-              <w:t xml:space="preserve">Brainstorming:</w:t>
-            </w:r>
-          </w:p>
-          <w:p>
-            <w:pPr>
-              <w:spacing w:before="60" w:line="276" w:lineRule="auto"/>
-              <w:jc w:val="left"/>
-              <w:rPr>
-                <w:sz w:val="24"/>
-                <w:szCs w:val="24"/>
-              </w:rPr>
-            </w:pPr>
-            <w:r>
-              <w:rPr>
-                <w:sz w:val="24"/>
-                <w:szCs w:val="24"/>
-              </w:rPr>
-              <w:t xml:space="preserve">{@brainstormingXml}</w:t>
-            </w:r>
-          </w:p>
-        </w:tc>
-      </w:tr>
-      <w:tr>
-        <w:trPr>
-          <w:trHeight w:val="144"/>
-          <w:jc w:val="center"/>
-        </w:trPr>
-        <w:tc>
-          <w:tcPr>
-            <w:tcW w:w="5000" w:type="pct"/>
-            <w:gridSpan w:val="4"/>
-            <w:tcBorders>
-              <w:top w:val="single" w:sz="4" w:space="0" w:color="auto"/>
-              <w:left w:val="single" w:sz="4" w:space="0" w:color="auto"/>
-              <w:bottom w:val="single" w:sz="4" w:space="0" w:color="auto"/>
-              <w:right w:val="single" w:sz="4" w:space="0" w:color="auto"/>
-            </w:tcBorders>
-          </w:tcPr>
-          <w:p>
-            <w:pPr>
-              <w:spacing w:before="60" w:line="276" w:lineRule="auto"/>
-              <w:jc w:val="left"/>
-              <w:rPr>
-                <w:b/>
-                <w:sz w:val="24"/>
-                <w:szCs w:val="24"/>
-              </w:rPr>
-            </w:pPr>
-            <w:r>
-              <w:rPr>
-                <w:b/>
-                <w:sz w:val="24"/>
-                <w:szCs w:val="24"/>
-              </w:rPr>
-              <w:t xml:space="preserve">Other Tool if Any:</w:t>
-            </w:r>
-          </w:p>
-        </w:tc>
-      </w:tr>
-      <w:tr>
-        <w:trPr>
-          <w:trHeight w:val="863"/>
-          <w:jc w:val="center"/>
-        </w:trPr>
-        <w:tc>
-          <w:tcPr>
-            <w:tcW w:w="5000" w:type="pct"/>
-            <w:gridSpan w:val="4"/>
-            <w:tcBorders>
-              <w:top w:val="single" w:sz="4" w:space="0" w:color="auto"/>
-              <w:left w:val="single" w:sz="4" w:space="0" w:color="auto"/>
-              <w:bottom w:val="single" w:sz="4" w:space="0" w:color="auto"/>
-              <w:right w:val="single" w:sz="4" w:space="0" w:color="auto"/>
-            </w:tcBorders>
-          </w:tcPr>
-          <w:p>
-            <w:pPr>
-              <w:spacing w:before="60" w:line="276" w:lineRule="auto"/>
-              <w:jc w:val="left"/>
-              <w:rPr>
-                <w:b/>
-                <w:sz w:val="24"/>
-                <w:szCs w:val="24"/>
-              </w:rPr>
-            </w:pPr>
-            <w:r>
-              <w:rPr>
-                <w:b/>
-                <w:sz w:val="24"/>
-                <w:szCs w:val="24"/>
-              </w:rPr>
-              <w:t xml:space="preserve">Other Tool if Any:</w:t>
-            </w:r>
-          </w:p>
-          <w:p>
-            <w:pPr>
-              <w:spacing w:before="60" w:line="276" w:lineRule="auto"/>
-              <w:jc w:val="left"/>
-              <w:rPr>
-                <w:sz w:val="24"/>
-                <w:szCs w:val="24"/>
-              </w:rPr>
-            </w:pPr>
-            <w:r>
-              <w:rPr>
-                <w:sz w:val="24"/>
-                <w:szCs w:val="24"/>
-              </w:rPr>
-              <w:t xml:space="preserve">{@analyzeOtherToolsXml}</w:t>
-            </w:r>
-          </w:p>
-        </w:tc>
-      </w:tr>
-      <w:tr>
-        <w:trPr>
-          <w:trHeight w:val="399"/>
-          <w:jc w:val="center"/>
-        </w:trPr>
-        <w:tc>
-          <w:tcPr>
-            <w:tcW w:w="5000" w:type="pct"/>
-            <w:gridSpan w:val="4"/>
-            <w:tcBorders>
-              <w:top w:val="single" w:sz="4" w:space="0" w:color="auto"/>
-              <w:left w:val="single" w:sz="4" w:space="0" w:color="auto"/>
-              <w:bottom w:val="single" w:sz="4" w:space="0" w:color="auto"/>
-              <w:right w:val="single" w:sz="4" w:space="0" w:color="auto"/>
-            </w:tcBorders>
-          </w:tcPr>
-          <w:p>
-            <w:pPr>
-              <w:spacing w:before="60" w:line="276" w:lineRule="auto"/>
-              <w:jc w:val="both"/>
-              <w:rPr>
-                <w:b/>
-                <w:sz w:val="24"/>
-                <w:szCs w:val="24"/>
-              </w:rPr>
-            </w:pPr>
-            <w:r>
-              <w:rPr>
-                <w:b/>
-                <w:sz w:val="24"/>
-                <w:szCs w:val="24"/>
-              </w:rPr>
-              <w:t>Investigation Outcome:</w:t>
-            </w:r>
-          </w:p>
-        </w:tc>
-      </w:tr>
-      <w:tr>
-        <w:trPr>
-          <w:trHeight w:val="5813"/>
-          <w:jc w:val="center"/>
-        </w:trPr>
-        <w:tc>
-          <w:tcPr>
-            <w:tcW w:w="5000" w:type="pct"/>
-            <w:gridSpan w:val="4"/>
-            <w:tcBorders>
-              <w:top w:val="single" w:sz="4" w:space="0" w:color="auto"/>
-              <w:left w:val="single" w:sz="4" w:space="0" w:color="auto"/>
-              <w:bottom w:val="single" w:sz="4" w:space="0" w:color="auto"/>
-              <w:right w:val="single" w:sz="4" w:space="0" w:color="auto"/>
-            </w:tcBorders>
-          </w:tcPr>
-          <w:p>
-            <w:pPr>
-              <w:spacing w:before="60" w:line="276" w:lineRule="auto"/>
-              <w:jc w:val="left"/>
-              <w:rPr>
-                <w:sz w:val="24"/>
-                <w:szCs w:val="24"/>
-              </w:rPr>
-            </w:pPr>
-            <w:r>
-              <w:rPr>
-                <w:sz w:val="24"/>
-                <w:szCs w:val="24"/>
-              </w:rPr>
-              <w:t xml:space="preserve">{@investigationOutcomeXml}</w:t>
-            </w:r>
-          </w:p>
-        </w:tc>
-      </w:tr>
-      <w:tr>
-        <w:trPr>
-          <w:trHeight w:val="276"/>
-          <w:jc w:val="center"/>
-        </w:trPr>
-        <w:tc>
-          <w:tcPr>
-            <w:tcW w:w="5000" w:type="pct"/>
-            <w:gridSpan w:val="4"/>
-            <w:tcBorders>
-              <w:top w:val="single" w:sz="4" w:space="0" w:color="auto"/>
-              <w:left w:val="single" w:sz="4" w:space="0" w:color="auto"/>
-              <w:bottom w:val="single" w:sz="4" w:space="0" w:color="auto"/>
-              <w:right w:val="single" w:sz="4" w:space="0" w:color="auto"/>
-            </w:tcBorders>
-            <w:hideMark/>
-          </w:tcPr>
-          <w:p>
-            <w:pPr>
-              <w:spacing w:before="60" w:line="276" w:lineRule="auto"/>
-              <w:jc w:val="both"/>
-              <w:rPr>
-                <w:b/>
-                <w:sz w:val="24"/>
-                <w:szCs w:val="24"/>
-              </w:rPr>
-            </w:pPr>
-            <w:r>
-              <w:rPr>
-                <w:b/>
-                <w:sz w:val="24"/>
-                <w:szCs w:val="24"/>
-              </w:rPr>
-              <w:t>Identified Root Cause/ Probable Cause:</w:t>
-            </w:r>
-          </w:p>
-        </w:tc>
-      </w:tr>
-      <w:tr>
-        <w:trPr>
-          <w:trHeight w:val="1528"/>
-          <w:jc w:val="center"/>
-        </w:trPr>
-        <w:tc>
-          <w:tcPr>
-            <w:tcW w:w="5000" w:type="pct"/>
-            <w:gridSpan w:val="4"/>
-            <w:tcBorders>
-              <w:top w:val="single" w:sz="4" w:space="0" w:color="auto"/>
-              <w:left w:val="single" w:sz="4" w:space="0" w:color="auto"/>
-              <w:bottom w:val="single" w:sz="4" w:space="0" w:color="auto"/>
-              <w:right w:val="single" w:sz="4" w:space="0" w:color="auto"/>
-            </w:tcBorders>
-          </w:tcPr>
-          <w:p>
-            <w:pPr>
-              <w:spacing w:before="60" w:line="276" w:lineRule="auto"/>
-              <w:jc w:val="left"/>
-              <w:rPr>
-                <w:sz w:val="24"/>
-                <w:szCs w:val="24"/>
-              </w:rPr>
-            </w:pPr>
-            <w:r>
-              <w:rPr>
-                <w:sz w:val="24"/>
-                <w:szCs w:val="24"/>
-              </w:rPr>
-              <w:t xml:space="preserve">{@rootCauseNarrativeXml}</w:t>
-            </w:r>
-          </w:p>
-        </w:tc>
-      </w:tr>
-      <w:tr>
-        <w:trPr>
-          <w:trHeight w:val="425"/>
-          <w:jc w:val="center"/>
-        </w:trPr>
-        <w:tc>
-          <w:tcPr>
-            <w:tcW w:w="5000" w:type="pct"/>
-            <w:gridSpan w:val="4"/>
-            <w:tcBorders>
-              <w:top w:val="single" w:sz="4" w:space="0" w:color="auto"/>
-              <w:left w:val="single" w:sz="4" w:space="0" w:color="auto"/>
-              <w:bottom w:val="single" w:sz="4" w:space="0" w:color="auto"/>
-              <w:right w:val="single" w:sz="4" w:space="0" w:color="auto"/>
-            </w:tcBorders>
-            <w:hideMark/>
-          </w:tcPr>
-          <w:p>
-            <w:pPr>
-              <w:spacing w:before="60" w:line="276" w:lineRule="auto"/>
-              <w:jc w:val="both"/>
-              <w:rPr>
-                <w:b/>
-                <w:sz w:val="24"/>
-                <w:szCs w:val="24"/>
-              </w:rPr>
-            </w:pPr>
-            <w:r>
-              <w:rPr>
-                <w:b/>
-                <w:sz w:val="24"/>
-                <w:szCs w:val="24"/>
-              </w:rPr>
-              <w:t>Impact Assessment (System/ Document/ Product/ Equipment/Patient safety/Past batches):</w:t>
-            </w:r>
-          </w:p>
-        </w:tc>
-      </w:tr>
-      <w:tr>
-        <w:trPr>
-          <w:trHeight w:val="1358"/>
-          <w:jc w:val="center"/>
-        </w:trPr>
-        <w:tc>
-          <w:tcPr>
-            <w:tcW w:w="5000" w:type="pct"/>
-            <w:gridSpan w:val="4"/>
-            <w:tcBorders>
-              <w:top w:val="single" w:sz="4" w:space="0" w:color="auto"/>
-              <w:left w:val="single" w:sz="4" w:space="0" w:color="auto"/>
-              <w:bottom w:val="single" w:sz="4" w:space="0" w:color="auto"/>
-              <w:right w:val="single" w:sz="4" w:space="0" w:color="auto"/>
-            </w:tcBorders>
-          </w:tcPr>
-          <w:p>
-            <w:pPr>
-              <w:spacing w:before="60" w:line="276" w:lineRule="auto"/>
-              <w:jc w:val="left"/>
-              <w:rPr>
-                <w:sz w:val="24"/>
-                <w:szCs w:val="24"/>
-              </w:rPr>
-            </w:pPr>
-            <w:r>
-              <w:rPr>
-                <w:sz w:val="24"/>
-                <w:szCs w:val="24"/>
-              </w:rPr>
-              <w:t xml:space="preserve">{@impactAssessmentXml}</w:t>
-            </w:r>
-          </w:p>
-        </w:tc>
-      </w:tr>
-      <w:tr>
-        <w:trPr>
-          <w:trHeight w:val="4084"/>
-          <w:jc w:val="center"/>
-        </w:trPr>
-        <w:tc>
-          <w:tcPr>
-            <w:tcW w:w="5000" w:type="pct"/>
-            <w:gridSpan w:val="4"/>
-            <w:tcBorders>
-              <w:top w:val="single" w:sz="4" w:space="0" w:color="auto"/>
-              <w:left w:val="single" w:sz="4" w:space="0" w:color="auto"/>
-              <w:bottom w:val="single" w:sz="4" w:space="0" w:color="auto"/>
-              <w:right w:val="single" w:sz="4" w:space="0" w:color="auto"/>
-            </w:tcBorders>
-            <w:hideMark/>
-          </w:tcPr>
-          <w:p>
-            <w:pPr>
-              <w:spacing w:before="60" w:line="276" w:lineRule="auto"/>
-              <w:jc w:val="left"/>
-              <w:rPr>
-                <w:b/>
-                <w:sz w:val="24"/>
-                <w:szCs w:val="24"/>
-              </w:rPr>
-            </w:pPr>
-            <w:r>
-              <w:rPr>
-                <w:b/>
-                <w:sz w:val="24"/>
-                <w:szCs w:val="24"/>
-              </w:rPr>
-              <w:t xml:space="preserve">Improve:</w:t>
-            </w:r>
-          </w:p>
-          <w:p>
-            <w:pPr>
-              <w:spacing w:before="60" w:line="276" w:lineRule="auto"/>
-              <w:jc w:val="left"/>
-              <w:rPr>
-                <w:sz w:val="24"/>
-                <w:szCs w:val="24"/>
-              </w:rPr>
-            </w:pPr>
-            <w:r>
-              <w:rPr>
-                <w:sz w:val="24"/>
-                <w:szCs w:val="24"/>
-              </w:rPr>
-              <w:t xml:space="preserve">{@improveNarrativeXml}</w:t>
-            </w:r>
-          </w:p>
-        </w:tc>
-      </w:tr>
-      <w:tr>
-        <w:trPr>
-          <w:trHeight w:val="368"/>
-          <w:jc w:val="center"/>
-        </w:trPr>
-        <w:tc>
-          <w:tcPr>
-            <w:tcW w:w="5000" w:type="pct"/>
-            <w:gridSpan w:val="4"/>
-            <w:tcBorders>
-              <w:top w:val="single" w:sz="4" w:space="0" w:color="auto"/>
-              <w:left w:val="single" w:sz="4" w:space="0" w:color="auto"/>
-              <w:bottom w:val="single" w:sz="4" w:space="0" w:color="auto"/>
-              <w:right w:val="single" w:sz="4" w:space="0" w:color="auto"/>
-            </w:tcBorders>
-          </w:tcPr>
-          <w:p>
-            <w:pPr>
-              <w:spacing w:before="60" w:line="276" w:lineRule="auto"/>
-              <w:rPr>
-                <w:b/>
-                <w:sz w:val="24"/>
-                <w:szCs w:val="24"/>
-              </w:rPr>
-            </w:pPr>
-            <w:r>
-              <w:rPr>
-                <w:b/>
-                <w:sz w:val="24"/>
-                <w:szCs w:val="24"/>
-              </w:rPr>
-              <w:t>Corrective Action:</w:t>
-            </w:r>
-          </w:p>
-        </w:tc>
-      </w:tr>
-      <w:tr>
-        <w:trPr>
-          <w:trHeight w:val="966"/>
-          <w:jc w:val="center"/>
-        </w:trPr>
-        <w:tc>
-          <w:tcPr>
-            <w:tcW w:w="5000" w:type="pct"/>
-            <w:gridSpan w:val="4"/>
-            <w:tcBorders>
-              <w:top w:val="single" w:sz="4" w:space="0" w:color="auto"/>
-              <w:left w:val="single" w:sz="4" w:space="0" w:color="auto"/>
-              <w:bottom w:val="single" w:sz="4" w:space="0" w:color="auto"/>
-              <w:right w:val="single" w:sz="4" w:space="0" w:color="auto"/>
-            </w:tcBorders>
-          </w:tcPr>
-          <w:p>
-            <w:pPr>
-              <w:spacing w:before="60" w:line="276" w:lineRule="auto"/>
-              <w:jc w:val="left"/>
-              <w:rPr>
-                <w:sz w:val="24"/>
-                <w:szCs w:val="24"/>
-              </w:rPr>
-            </w:pPr>
-            <w:r>
-              <w:rPr>
-                <w:sz w:val="24"/>
-                <w:szCs w:val="24"/>
-              </w:rPr>
-              <w:t xml:space="preserve">{@correctiveActionsXml}</w:t>
-            </w:r>
-          </w:p>
-        </w:tc>
-      </w:tr>
-      <w:tr>
-        <w:trPr>
-          <w:trHeight w:val="7981"/>
-          <w:jc w:val="center"/>
-        </w:trPr>
-        <w:tc>
-          <w:tcPr>
-            <w:tcW w:w="5000" w:type="pct"/>
-            <w:gridSpan w:val="4"/>
-            <w:tcBorders>
-              <w:top w:val="single" w:sz="4" w:space="0" w:color="auto"/>
-              <w:left w:val="single" w:sz="4" w:space="0" w:color="auto"/>
-              <w:bottom w:val="single" w:sz="4" w:space="0" w:color="auto"/>
-              <w:right w:val="single" w:sz="4" w:space="0" w:color="auto"/>
-            </w:tcBorders>
-          </w:tcPr>
-          <w:p>
-            <w:pPr>
-              <w:spacing w:before="60" w:line="276" w:lineRule="auto"/>
-              <w:jc w:val="left"/>
-              <w:rPr>
-                <w:b/>
-                <w:sz w:val="24"/>
-                <w:szCs w:val="24"/>
-              </w:rPr>
-            </w:pPr>
-            <w:r>
-              <w:rPr>
-                <w:b/>
-                <w:sz w:val="24"/>
-                <w:szCs w:val="24"/>
-              </w:rPr>
-              <w:t xml:space="preserve">Control:</w:t>
-            </w:r>
-          </w:p>
-          <w:p>
-            <w:pPr>
-              <w:spacing w:before="60" w:line="276" w:lineRule="auto"/>
-              <w:jc w:val="left"/>
-              <w:rPr>
-                <w:sz w:val="24"/>
-                <w:szCs w:val="24"/>
-              </w:rPr>
-            </w:pPr>
-            <w:r>
-              <w:rPr>
-                <w:sz w:val="24"/>
-                <w:szCs w:val="24"/>
-              </w:rPr>
-              <w:t xml:space="preserve">{@controlNarrativeXml}</w:t>
-            </w:r>
-          </w:p>
-        </w:tc>
-      </w:tr>
-      <w:tr>
-        <w:trPr>
-          <w:trHeight w:val="368"/>
-          <w:jc w:val="center"/>
-        </w:trPr>
-        <w:tc>
-          <w:tcPr>
-            <w:tcW w:w="5000" w:type="pct"/>
-            <w:gridSpan w:val="4"/>
-            <w:tcBorders>
-              <w:top w:val="single" w:sz="4" w:space="0" w:color="auto"/>
-              <w:left w:val="single" w:sz="4" w:space="0" w:color="auto"/>
-              <w:bottom w:val="single" w:sz="4" w:space="0" w:color="auto"/>
-              <w:right w:val="single" w:sz="4" w:space="0" w:color="auto"/>
-            </w:tcBorders>
-          </w:tcPr>
-          <w:p>
-            <w:pPr>
-              <w:spacing w:before="60" w:line="276" w:lineRule="auto"/>
-              <w:rPr>
-                <w:b/>
-                <w:sz w:val="24"/>
-                <w:szCs w:val="24"/>
-              </w:rPr>
-            </w:pPr>
-            <w:r>
-              <w:rPr>
-                <w:b/>
-                <w:sz w:val="24"/>
-                <w:szCs w:val="24"/>
-              </w:rPr>
-              <w:t>Preventive Action:</w:t>
-            </w:r>
-          </w:p>
-        </w:tc>
-      </w:tr>
-      <w:tr>
-        <w:trPr>
-          <w:trHeight w:val="368"/>
-          <w:jc w:val="center"/>
-        </w:trPr>
-        <w:tc>
-          <w:tcPr>
-            <w:tcW w:w="5000" w:type="pct"/>
-            <w:gridSpan w:val="4"/>
-            <w:tcBorders>
-              <w:top w:val="single" w:sz="4" w:space="0" w:color="auto"/>
-              <w:left w:val="single" w:sz="4" w:space="0" w:color="auto"/>
-              <w:bottom w:val="single" w:sz="4" w:space="0" w:color="auto"/>
-              <w:right w:val="single" w:sz="4" w:space="0" w:color="auto"/>
-            </w:tcBorders>
-          </w:tcPr>
-          <w:p>
-            <w:pPr>
-              <w:spacing w:before="60" w:line="276" w:lineRule="auto"/>
-              <w:jc w:val="left"/>
-              <w:rPr>
-                <w:sz w:val="24"/>
-                <w:szCs w:val="24"/>
-              </w:rPr>
-            </w:pPr>
-            <w:r>
-              <w:rPr>
-                <w:sz w:val="24"/>
-                <w:szCs w:val="24"/>
-              </w:rPr>
-              <w:t xml:space="preserve">{@preventiveActionsXml}</w:t>
-            </w:r>
-          </w:p>
-        </w:tc>
-      </w:tr>
-      <w:tr>
-        <w:trPr>
-          <w:trHeight w:val="368"/>
-          <w:jc w:val="center"/>
-        </w:trPr>
-        <w:tc>
-          <w:tcPr>
-            <w:tcW w:w="5000" w:type="pct"/>
-            <w:gridSpan w:val="4"/>
-            <w:tcBorders>
-              <w:top w:val="single" w:sz="4" w:space="0" w:color="auto"/>
-              <w:left w:val="single" w:sz="4" w:space="0" w:color="auto"/>
-              <w:bottom w:val="single" w:sz="4" w:space="0" w:color="auto"/>
-              <w:right w:val="single" w:sz="4" w:space="0" w:color="auto"/>
-            </w:tcBorders>
-          </w:tcPr>
-          <w:p>
-            <w:pPr>
-              <w:spacing w:before="60" w:line="276" w:lineRule="auto"/>
-              <w:jc w:val="left"/>
-              <w:rPr>
-                <w:b/>
-                <w:sz w:val="24"/>
-                <w:szCs w:val="24"/>
-              </w:rPr>
-            </w:pPr>
-            <w:r>
-              <w:rPr>
-                <w:b/>
-                <w:sz w:val="24"/>
-                <w:szCs w:val="24"/>
-              </w:rPr>
-              <w:t xml:space="preserve">Conclusion:</w:t>
-            </w:r>
-          </w:p>
-        </w:tc>
-      </w:tr>
-      <w:tr>
-        <w:trPr>
-          <w:trHeight w:val="368"/>
-          <w:jc w:val="center"/>
-        </w:trPr>
-        <w:tc>
-          <w:tcPr>
-            <w:tcW w:w="5000" w:type="pct"/>
-            <w:gridSpan w:val="4"/>
-            <w:tcBorders>
-              <w:top w:val="single" w:sz="4" w:space="0" w:color="auto"/>
-              <w:left w:val="single" w:sz="4" w:space="0" w:color="auto"/>
-              <w:bottom w:val="single" w:sz="4" w:space="0" w:color="auto"/>
-              <w:right w:val="single" w:sz="4" w:space="0" w:color="auto"/>
-            </w:tcBorders>
-          </w:tcPr>
-          <w:p>
-            <w:pPr>
-              <w:spacing w:before="60" w:line="276" w:lineRule="auto"/>
-              <w:jc w:val="left"/>
-              <w:rPr>
-                <w:sz w:val="24"/>
-                <w:szCs w:val="24"/>
-              </w:rPr>
-            </w:pPr>
-            <w:r>
-              <w:rPr>
-                <w:sz w:val="24"/>
-                <w:szCs w:val="24"/>
-              </w:rPr>
-              <w:t xml:space="preserve">{@conclusionNarrativeXml}</w:t>
-            </w:r>
-          </w:p>
-        </w:tc>
-      </w:tr>
-      <w:tr>
-        <w:trPr>
-          <w:trHeight w:hRule="exact" w:val="448"/>
-          <w:jc w:val="center"/>
-        </w:trPr>
-        <w:tc>
-          <w:tcPr>
-            <w:tcW w:w="5000" w:type="pct"/>
-            <w:gridSpan w:val="4"/>
-            <w:tcBorders>
-              <w:top w:val="single" w:sz="4" w:space="0" w:color="auto"/>
-              <w:left w:val="single" w:sz="4" w:space="0" w:color="auto"/>
-              <w:bottom w:val="single" w:sz="4" w:space="0" w:color="auto"/>
-              <w:right w:val="single" w:sz="4" w:space="0" w:color="auto"/>
-            </w:tcBorders>
-          </w:tcPr>
-          <w:p>
-            <w:pPr>
-              <w:spacing w:before="60" w:line="276" w:lineRule="auto"/>
-              <w:rPr>
-                <w:b/>
-                <w:sz w:val="24"/>
-                <w:szCs w:val="24"/>
-              </w:rPr>
-            </w:pPr>
-            <w:r>
-              <w:rPr>
-                <w:b/>
-                <w:sz w:val="24"/>
-                <w:szCs w:val="24"/>
-              </w:rPr>
-              <w:t>Document Reviewed:</w:t>
-            </w:r>
-          </w:p>
-          <w:p>
-            <w:pPr>
-              <w:pStyle w:val="ListParagraph"/>
-              <w:spacing w:before="60" w:line="276" w:lineRule="auto"/>
-              <w:rPr>
-                <w:bCs/>
-                <w:sz w:val="24"/>
-                <w:szCs w:val="24"/>
-              </w:rPr>
-            </w:pPr>
-          </w:p>
-          <w:p>
-            <w:pPr>
-              <w:pStyle w:val="ListParagraph"/>
-              <w:spacing w:before="60" w:line="276" w:lineRule="auto"/>
-              <w:rPr>
-                <w:bCs/>
-                <w:sz w:val="24"/>
-                <w:szCs w:val="24"/>
-              </w:rPr>
-            </w:pPr>
-          </w:p>
-        </w:tc>
-      </w:tr>
-      <w:tr>
-        <w:trPr>
-          <w:trHeight w:hRule="exact" w:val="802"/>
-          <w:jc w:val="center"/>
-        </w:trPr>
-        <w:tc>
-          <w:tcPr>
-            <w:tcW w:w="5000" w:type="pct"/>
-            <w:gridSpan w:val="4"/>
-            <w:tcBorders>
-              <w:top w:val="single" w:sz="4" w:space="0" w:color="auto"/>
-              <w:left w:val="single" w:sz="4" w:space="0" w:color="auto"/>
-              <w:bottom w:val="single" w:sz="4" w:space="0" w:color="auto"/>
-              <w:right w:val="single" w:sz="4" w:space="0" w:color="auto"/>
-            </w:tcBorders>
-          </w:tcPr>
-          <w:p>
-            <w:pPr>
-              <w:spacing w:before="60" w:line="276" w:lineRule="auto"/>
-              <w:jc w:val="left"/>
-              <w:rPr>
-                <w:sz w:val="24"/>
-                <w:szCs w:val="24"/>
-              </w:rPr>
-            </w:pPr>
-            <w:r>
-              <w:rPr>
-                <w:sz w:val="24"/>
-                <w:szCs w:val="24"/>
-              </w:rPr>
-              <w:t xml:space="preserve">{@documentsReviewedXml}</w:t>
-            </w:r>
-          </w:p>
-        </w:tc>
-      </w:tr>
-      <w:tr>
-        <w:trPr>
-          <w:trHeight w:hRule="exact" w:val="412"/>
-          <w:jc w:val="center"/>
-        </w:trPr>
-        <w:tc>
-          <w:tcPr>
-            <w:tcW w:w="5000" w:type="pct"/>
-            <w:gridSpan w:val="4"/>
-            <w:tcBorders>
-              <w:top w:val="single" w:sz="4" w:space="0" w:color="auto"/>
-              <w:left w:val="single" w:sz="4" w:space="0" w:color="auto"/>
-              <w:bottom w:val="single" w:sz="4" w:space="0" w:color="auto"/>
-              <w:right w:val="single" w:sz="4" w:space="0" w:color="auto"/>
-            </w:tcBorders>
-          </w:tcPr>
-          <w:p>
-            <w:pPr>
-              <w:spacing w:before="60" w:line="276" w:lineRule="auto"/>
-              <w:rPr>
-                <w:b/>
-                <w:sz w:val="24"/>
-                <w:szCs w:val="24"/>
-              </w:rPr>
-            </w:pPr>
-            <w:r>
-              <w:rPr>
-                <w:b/>
-                <w:sz w:val="24"/>
-                <w:szCs w:val="24"/>
-              </w:rPr>
-              <w:t>List of attachment (If applicable):</w:t>
-            </w:r>
-          </w:p>
-        </w:tc>
-      </w:tr>
-      <w:tr>
-        <w:trPr>
-          <w:trHeight w:hRule="exact" w:val="2009"/>
-          <w:jc w:val="center"/>
-        </w:trPr>
-        <w:tc>
-          <w:tcPr>
-            <w:tcW w:w="5000" w:type="pct"/>
-            <w:gridSpan w:val="4"/>
-            <w:tcBorders>
-              <w:top w:val="single" w:sz="4" w:space="0" w:color="auto"/>
-              <w:left w:val="single" w:sz="4" w:space="0" w:color="auto"/>
-              <w:bottom w:val="single" w:sz="4" w:space="0" w:color="auto"/>
-              <w:right w:val="single" w:sz="4" w:space="0" w:color="auto"/>
-            </w:tcBorders>
-          </w:tcPr>
-          <w:p>
-            <w:pPr>
-              <w:spacing w:before="60" w:line="276" w:lineRule="auto"/>
-              <w:jc w:val="left"/>
-              <w:rPr>
-                <w:sz w:val="24"/>
-                <w:szCs w:val="24"/>
-              </w:rPr>
-            </w:pPr>
-            <w:r>
-              <w:rPr>
-                <w:sz w:val="24"/>
-                <w:szCs w:val="24"/>
-              </w:rPr>
-              <w:t xml:space="preserve">{#attachments}</w:t>
-            </w:r>
-          </w:p>
-          <w:p>
-            <w:pPr>
-              <w:spacing w:before="60" w:line="276" w:lineRule="auto"/>
-              <w:jc w:val="left"/>
-              <w:rPr>
-                <w:sz w:val="24"/>
-                <w:szCs w:val="24"/>
-              </w:rPr>
-            </w:pPr>
-            <w:r>
-              <w:rPr>
-                <w:sz w:val="24"/>
-                <w:szCs w:val="24"/>
-              </w:rPr>
-              <w:t xml:space="preserve">Attachment No. {romanNumeral}: {attachmentDescription}</w:t>
-            </w:r>
-          </w:p>
-          <w:p>
-            <w:pPr>
-              <w:spacing w:before="60" w:line="276" w:lineRule="auto"/>
-              <w:jc w:val="left"/>
-              <w:rPr>
-                <w:sz w:val="24"/>
-                <w:szCs w:val="24"/>
-              </w:rPr>
-            </w:pPr>
-            <w:r>
-              <w:rPr>
-                <w:sz w:val="24"/>
-                <w:szCs w:val="24"/>
-              </w:rPr>
-              <w:t xml:space="preserve">{/attachments}</w:t>
+              <w:t xml:space="preserve">{revision}</w:t>
             </w:r>
           </w:p>
         </w:tc>
@@ -1875,602 +317,315 @@
     </w:p>
     <w:p>
       <w:pPr>
-        <w:spacing w:line="276" w:lineRule="auto"/>
-      </w:pPr>
+        <w:spacing w:before="280" w:after="40" w:line="276" w:lineRule="auto"/>
+        <w:rPr>
+          <w:b/>
+          <w:sz w:val="24"/>
+          <w:szCs w:val="24"/>
+        </w:rPr>
+      </w:pPr>
+      <w:r>
+        <w:rPr>
+          <w:b/>
+          <w:sz w:val="24"/>
+          <w:szCs w:val="24"/>
+        </w:rPr>
+        <w:t>Purpose &amp; Scope</w:t>
+      </w:r>
     </w:p>
     <w:p>
       <w:pPr>
+        <w:spacing w:before="80" w:after="40" w:line="276" w:lineRule="auto"/>
+        <w:rPr>
+          <w:sz w:val="24"/>
+          <w:szCs w:val="24"/>
+        </w:rPr>
+      </w:pPr>
+      <w:r>
+        <w:rPr>
+          <w:sz w:val="24"/>
+          <w:szCs w:val="24"/>
+        </w:rPr>
+        <w:t xml:space="preserve">{@purposeScopeXml}</w:t>
+      </w:r>
+    </w:p>
+    <w:p>
+      <w:pPr>
+        <w:spacing w:before="280" w:after="40" w:line="276" w:lineRule="auto"/>
+        <w:rPr>
+          <w:b/>
+          <w:sz w:val="24"/>
+          <w:szCs w:val="24"/>
+        </w:rPr>
+      </w:pPr>
+      <w:r>
+        <w:rPr>
+          <w:b/>
+          <w:sz w:val="24"/>
+          <w:szCs w:val="24"/>
+        </w:rPr>
+        <w:t>References</w:t>
+      </w:r>
+    </w:p>
+    <w:p>
+      <w:pPr>
+        <w:spacing w:before="80" w:after="40" w:line="276" w:lineRule="auto"/>
+        <w:rPr>
+          <w:sz w:val="24"/>
+          <w:szCs w:val="24"/>
+        </w:rPr>
+      </w:pPr>
+      <w:r>
+        <w:rPr>
+          <w:sz w:val="24"/>
+          <w:szCs w:val="24"/>
+        </w:rPr>
+        <w:t xml:space="preserve">{@referencesXml}</w:t>
+      </w:r>
+    </w:p>
+    <w:p>
+      <w:pPr>
+        <w:spacing w:before="280" w:after="40" w:line="276" w:lineRule="auto"/>
+        <w:rPr>
+          <w:b/>
+          <w:sz w:val="24"/>
+          <w:szCs w:val="24"/>
+        </w:rPr>
+      </w:pPr>
+      <w:r>
+        <w:rPr>
+          <w:b/>
+          <w:sz w:val="24"/>
+          <w:szCs w:val="24"/>
+        </w:rPr>
+        <w:t>Traceability</w:t>
+      </w:r>
+    </w:p>
+    <w:p>
+      <w:pPr>
+        <w:spacing w:before="80" w:after="40" w:line="276" w:lineRule="auto"/>
+        <w:rPr>
+          <w:sz w:val="24"/>
+          <w:szCs w:val="24"/>
+        </w:rPr>
+      </w:pPr>
+      <w:r>
+        <w:rPr>
+          <w:sz w:val="24"/>
+          <w:szCs w:val="24"/>
+        </w:rPr>
+        <w:t xml:space="preserve">{@traceabilityXml}</w:t>
+      </w:r>
+    </w:p>
+    <w:p>
+      <w:pPr>
+        <w:spacing w:before="280" w:after="40" w:line="276" w:lineRule="auto"/>
+        <w:rPr>
+          <w:b/>
+          <w:sz w:val="24"/>
+          <w:szCs w:val="24"/>
+        </w:rPr>
+      </w:pPr>
+      <w:r>
+        <w:rPr>
+          <w:b/>
+          <w:sz w:val="24"/>
+          <w:szCs w:val="24"/>
+        </w:rPr>
+        <w:t>Test Methods / Protocol Summary</w:t>
+      </w:r>
+    </w:p>
+    <w:p>
+      <w:pPr>
+        <w:spacing w:before="80" w:after="40" w:line="276" w:lineRule="auto"/>
+        <w:rPr>
+          <w:sz w:val="24"/>
+          <w:szCs w:val="24"/>
+        </w:rPr>
+      </w:pPr>
+      <w:r>
+        <w:rPr>
+          <w:sz w:val="24"/>
+          <w:szCs w:val="24"/>
+        </w:rPr>
+        <w:t xml:space="preserve">{@testMethodsXml}</w:t>
+      </w:r>
+    </w:p>
+    <w:p>
+      <w:pPr>
+        <w:spacing w:before="280" w:after="40" w:line="276" w:lineRule="auto"/>
+        <w:rPr>
+          <w:b/>
+          <w:sz w:val="24"/>
+          <w:szCs w:val="24"/>
+        </w:rPr>
+      </w:pPr>
+      <w:r>
+        <w:rPr>
+          <w:b/>
+          <w:sz w:val="24"/>
+          <w:szCs w:val="24"/>
+        </w:rPr>
+        <w:t>Test Results</w:t>
+      </w:r>
+    </w:p>
+    <w:p>
+      <w:pPr>
+        <w:spacing w:before="80" w:after="40" w:line="276" w:lineRule="auto"/>
+        <w:rPr>
+          <w:sz w:val="24"/>
+          <w:szCs w:val="24"/>
+        </w:rPr>
+      </w:pPr>
+      <w:r>
+        <w:rPr>
+          <w:sz w:val="24"/>
+          <w:szCs w:val="24"/>
+        </w:rPr>
+        <w:t xml:space="preserve">{@testResultsXml}</w:t>
+      </w:r>
+    </w:p>
+    <w:p>
+      <w:pPr>
+        <w:spacing w:before="280" w:after="40" w:line="276" w:lineRule="auto"/>
+        <w:rPr>
+          <w:b/>
+          <w:sz w:val="24"/>
+          <w:szCs w:val="24"/>
+        </w:rPr>
+      </w:pPr>
+      <w:r>
+        <w:rPr>
+          <w:b/>
+          <w:sz w:val="24"/>
+          <w:szCs w:val="24"/>
+        </w:rPr>
+        <w:t>Deviations &amp; Nonconformances</w:t>
+      </w:r>
+    </w:p>
+    <w:p>
+      <w:pPr>
+        <w:spacing w:before="80" w:after="40" w:line="276" w:lineRule="auto"/>
+        <w:rPr>
+          <w:sz w:val="24"/>
+          <w:szCs w:val="24"/>
+        </w:rPr>
+      </w:pPr>
+      <w:r>
+        <w:rPr>
+          <w:sz w:val="24"/>
+          <w:szCs w:val="24"/>
+        </w:rPr>
+        <w:t xml:space="preserve">{@deviationsXml}</w:t>
+      </w:r>
+    </w:p>
+    <w:p>
+      <w:pPr>
+        <w:spacing w:before="280" w:after="40" w:line="276" w:lineRule="auto"/>
+        <w:rPr>
+          <w:b/>
+          <w:sz w:val="24"/>
+          <w:szCs w:val="24"/>
+        </w:rPr>
+      </w:pPr>
+      <w:r>
+        <w:rPr>
+          <w:b/>
+          <w:sz w:val="24"/>
+          <w:szCs w:val="24"/>
+        </w:rPr>
+        <w:t>Conclusion</w:t>
+      </w:r>
+    </w:p>
+    <w:p>
+      <w:pPr>
+        <w:spacing w:before="80" w:after="40" w:line="276" w:lineRule="auto"/>
+        <w:rPr>
+          <w:sz w:val="24"/>
+          <w:szCs w:val="24"/>
+        </w:rPr>
+      </w:pPr>
+      <w:r>
+        <w:rPr>
+          <w:sz w:val="24"/>
+          <w:szCs w:val="24"/>
+        </w:rPr>
+        <w:t xml:space="preserve">{@conclusionXml}</w:t>
+      </w:r>
+    </w:p>
+    <w:p>
+      <w:pPr>
+        <w:spacing w:before="280" w:after="40" w:line="276" w:lineRule="auto"/>
+        <w:rPr>
+          <w:b/>
+          <w:sz w:val="24"/>
+          <w:szCs w:val="24"/>
+        </w:rPr>
+      </w:pPr>
+      <w:r>
+        <w:rPr>
+          <w:b/>
+          <w:sz w:val="24"/>
+          <w:szCs w:val="24"/>
+        </w:rPr>
+        <w:t>Approval / Sign-off</w:t>
+      </w:r>
+    </w:p>
+    <w:p>
+      <w:pPr>
+        <w:spacing w:before="80" w:after="40" w:line="276" w:lineRule="auto"/>
+        <w:rPr>
+          <w:sz w:val="24"/>
+          <w:szCs w:val="24"/>
+        </w:rPr>
+      </w:pPr>
+      <w:r>
+        <w:rPr>
+          <w:sz w:val="24"/>
+          <w:szCs w:val="24"/>
+        </w:rPr>
+        <w:t xml:space="preserve">{@approvalSignoffXml}</w:t>
+      </w:r>
+    </w:p>
+    <w:p>
+      <w:pPr>
+        <w:spacing w:before="280" w:after="40" w:line="276" w:lineRule="auto"/>
+        <w:rPr>
+          <w:b/>
+          <w:sz w:val="24"/>
+          <w:szCs w:val="24"/>
+        </w:rPr>
+      </w:pPr>
+      <w:r>
+        <w:rPr>
+          <w:b/>
+          <w:sz w:val="24"/>
+          <w:szCs w:val="24"/>
+        </w:rPr>
+        <w:t>Appendices</w:t>
+      </w:r>
+    </w:p>
+    <w:p>
+      <w:pPr>
+        <w:spacing w:before="80" w:after="40" w:line="276" w:lineRule="auto"/>
+        <w:rPr>
+          <w:sz w:val="24"/>
+          <w:szCs w:val="24"/>
+        </w:rPr>
+      </w:pPr>
+      <w:r>
+        <w:rPr>
+          <w:sz w:val="24"/>
+          <w:szCs w:val="24"/>
+        </w:rPr>
+        <w:t xml:space="preserve">{@appendicesXml}</w:t>
+      </w:r>
+    </w:p>
+    <w:p>
+      <w:pPr>
         <w:spacing w:line="276" w:lineRule="auto"/>
       </w:pPr>
     </w:p>
-    <w:tbl>
-      <w:tblPr>
-        <w:tblW w:w="10656" w:type="dxa"/>
-        <w:jc w:val="center"/>
-        <w:tblBorders>
-          <w:top w:val="single" w:sz="4" w:space="0" w:color="auto"/>
-          <w:left w:val="single" w:sz="4" w:space="0" w:color="auto"/>
-          <w:bottom w:val="single" w:sz="4" w:space="0" w:color="auto"/>
-          <w:right w:val="single" w:sz="4" w:space="0" w:color="auto"/>
-          <w:insideH w:val="single" w:sz="4" w:space="0" w:color="auto"/>
-          <w:insideV w:val="single" w:sz="4" w:space="0" w:color="auto"/>
-        </w:tblBorders>
-        <w:tblLook w:val="04A0" w:firstRow="1" w:lastRow="0" w:firstColumn="1" w:lastColumn="0" w:noHBand="0" w:noVBand="1"/>
-      </w:tblPr>
-      <w:tr>
-        <w:trPr>
-          <w:trHeight w:val="863"/>
-          <w:jc w:val="center"/>
-        </w:trPr>
-        <w:tc>
-          <w:tcPr>
-            <w:tcW w:w="988" w:type="pct"/>
-            <w:vAlign w:val="center"/>
-          </w:tcPr>
-          <w:p>
-            <w:pPr>
-              <w:pStyle w:val="Header"/>
-              <w:tabs>
-                <w:tab w:val="center" w:pos="4802"/>
-              </w:tabs>
-              <w:spacing w:line="276" w:lineRule="auto"/>
-              <w:ind w:left="-155" w:right="-152"/>
-              <w:jc w:val="center"/>
-              <w:rPr>
-                <w:b/>
-                <w:bCs/>
-                <w:iCs/>
-                <w:sz w:val="24"/>
-                <w:szCs w:val="24"/>
-              </w:rPr>
-            </w:pPr>
-            <w:r>
-              <w:rPr>
-                <w:b/>
-                <w:bCs/>
-                <w:iCs/>
-                <w:sz w:val="24"/>
-                <w:szCs w:val="24"/>
-              </w:rPr>
-              <w:t>Prepared                   By QC</w:t>
-            </w:r>
-          </w:p>
-          <w:p>
-            <w:pPr>
-              <w:pStyle w:val="Header"/>
-              <w:tabs>
-                <w:tab w:val="center" w:pos="4802"/>
-              </w:tabs>
-              <w:spacing w:line="276" w:lineRule="auto"/>
-              <w:ind w:left="-155" w:right="-152"/>
-              <w:jc w:val="center"/>
-              <w:rPr>
-                <w:b/>
-                <w:bCs/>
-                <w:iCs/>
-                <w:sz w:val="24"/>
-                <w:szCs w:val="24"/>
-              </w:rPr>
-            </w:pPr>
-            <w:r>
-              <w:rPr>
-                <w:b/>
-                <w:bCs/>
-                <w:iCs/>
-                <w:sz w:val="24"/>
-                <w:szCs w:val="24"/>
-              </w:rPr>
-              <w:t>(Sign/Date)</w:t>
-            </w:r>
-          </w:p>
-        </w:tc>
-        <w:tc>
-          <w:tcPr>
-            <w:tcW w:w="903" w:type="pct"/>
-            <w:vAlign w:val="center"/>
-          </w:tcPr>
-          <w:p>
-            <w:pPr>
-              <w:pStyle w:val="Header"/>
-              <w:tabs>
-                <w:tab w:val="center" w:pos="4802"/>
-              </w:tabs>
-              <w:spacing w:line="276" w:lineRule="auto"/>
-              <w:ind w:left="-155" w:right="-152"/>
-              <w:jc w:val="center"/>
-              <w:rPr>
-                <w:b/>
-                <w:bCs/>
-                <w:iCs/>
-                <w:sz w:val="24"/>
-                <w:szCs w:val="24"/>
-              </w:rPr>
-            </w:pPr>
-            <w:r>
-              <w:rPr>
-                <w:b/>
-                <w:bCs/>
-                <w:iCs/>
-                <w:sz w:val="24"/>
-                <w:szCs w:val="24"/>
-              </w:rPr>
-              <w:t>Reviewed</w:t>
-            </w:r>
-            <w:r>
-              <w:rPr>
-                <w:b/>
-                <w:bCs/>
-                <w:iCs/>
-                <w:sz w:val="24"/>
-                <w:szCs w:val="24"/>
-              </w:rPr>
-              <w:t xml:space="preserve"> </w:t>
-            </w:r>
-          </w:p>
-          <w:p>
-            <w:pPr>
-              <w:pStyle w:val="Header"/>
-              <w:tabs>
-                <w:tab w:val="center" w:pos="4802"/>
-              </w:tabs>
-              <w:spacing w:line="276" w:lineRule="auto"/>
-              <w:ind w:left="-155" w:right="-152"/>
-              <w:jc w:val="center"/>
-              <w:rPr>
-                <w:b/>
-                <w:bCs/>
-                <w:iCs/>
-                <w:sz w:val="24"/>
-                <w:szCs w:val="24"/>
-              </w:rPr>
-            </w:pPr>
-            <w:r>
-              <w:rPr>
-                <w:b/>
-                <w:bCs/>
-                <w:iCs/>
-                <w:sz w:val="24"/>
-                <w:szCs w:val="24"/>
-              </w:rPr>
-              <w:t>By QC</w:t>
-            </w:r>
-          </w:p>
-          <w:p>
-            <w:pPr>
-              <w:pStyle w:val="Header"/>
-              <w:tabs>
-                <w:tab w:val="center" w:pos="4802"/>
-              </w:tabs>
-              <w:spacing w:line="276" w:lineRule="auto"/>
-              <w:ind w:left="-155" w:right="-152"/>
-              <w:jc w:val="center"/>
-              <w:rPr>
-                <w:b/>
-                <w:bCs/>
-                <w:iCs/>
-                <w:sz w:val="24"/>
-                <w:szCs w:val="24"/>
-              </w:rPr>
-            </w:pPr>
-            <w:r>
-              <w:rPr>
-                <w:b/>
-                <w:bCs/>
-                <w:iCs/>
-                <w:sz w:val="24"/>
-                <w:szCs w:val="24"/>
-              </w:rPr>
-              <w:t>(Sign/Date)</w:t>
-            </w:r>
-          </w:p>
-        </w:tc>
-        <w:tc>
-          <w:tcPr>
-            <w:tcW w:w="1161" w:type="pct"/>
-            <w:vAlign w:val="center"/>
-          </w:tcPr>
-          <w:p>
-            <w:pPr>
-              <w:pStyle w:val="Header"/>
-              <w:tabs>
-                <w:tab w:val="center" w:pos="4802"/>
-              </w:tabs>
-              <w:spacing w:line="276" w:lineRule="auto"/>
-              <w:ind w:left="-155" w:right="-152"/>
-              <w:rPr>
-                <w:b/>
-                <w:bCs/>
-                <w:iCs/>
-                <w:sz w:val="24"/>
-                <w:szCs w:val="24"/>
-              </w:rPr>
-            </w:pPr>
-            <w:r>
-              <w:rPr>
-                <w:b/>
-                <w:bCs/>
-                <w:iCs/>
-                <w:sz w:val="24"/>
-                <w:szCs w:val="24"/>
-              </w:rPr>
-              <w:t xml:space="preserve">           </w:t>
-            </w:r>
-            <w:r>
-              <w:rPr>
-                <w:b/>
-                <w:bCs/>
-                <w:iCs/>
-                <w:sz w:val="24"/>
-                <w:szCs w:val="24"/>
-              </w:rPr>
-              <w:t xml:space="preserve">Reviewed </w:t>
-            </w:r>
-          </w:p>
-          <w:p>
-            <w:pPr>
-              <w:pStyle w:val="Header"/>
-              <w:tabs>
-                <w:tab w:val="center" w:pos="4802"/>
-              </w:tabs>
-              <w:spacing w:line="276" w:lineRule="auto"/>
-              <w:ind w:left="-155" w:right="-152"/>
-              <w:jc w:val="center"/>
-              <w:rPr>
-                <w:b/>
-                <w:bCs/>
-                <w:iCs/>
-                <w:sz w:val="24"/>
-                <w:szCs w:val="24"/>
-              </w:rPr>
-            </w:pPr>
-            <w:r>
-              <w:rPr>
-                <w:b/>
-                <w:bCs/>
-                <w:iCs/>
-                <w:sz w:val="24"/>
-                <w:szCs w:val="24"/>
-              </w:rPr>
-              <w:t>By QC</w:t>
-            </w:r>
-          </w:p>
-          <w:p>
-            <w:pPr>
-              <w:pStyle w:val="Header"/>
-              <w:tabs>
-                <w:tab w:val="center" w:pos="4802"/>
-              </w:tabs>
-              <w:spacing w:line="276" w:lineRule="auto"/>
-              <w:ind w:left="-155" w:right="-152"/>
-              <w:jc w:val="center"/>
-              <w:rPr>
-                <w:b/>
-                <w:bCs/>
-                <w:iCs/>
-                <w:sz w:val="24"/>
-                <w:szCs w:val="24"/>
-              </w:rPr>
-            </w:pPr>
-            <w:r>
-              <w:rPr>
-                <w:b/>
-                <w:bCs/>
-                <w:iCs/>
-                <w:sz w:val="24"/>
-                <w:szCs w:val="24"/>
-              </w:rPr>
-              <w:t>(Sign/Date)</w:t>
-            </w:r>
-          </w:p>
-        </w:tc>
-        <w:tc>
-          <w:tcPr>
-            <w:tcW w:w="1033" w:type="pct"/>
-            <w:vAlign w:val="center"/>
-          </w:tcPr>
-          <w:p>
-            <w:pPr>
-              <w:pStyle w:val="Header"/>
-              <w:tabs>
-                <w:tab w:val="center" w:pos="4802"/>
-              </w:tabs>
-              <w:spacing w:line="276" w:lineRule="auto"/>
-              <w:ind w:left="-155" w:right="-152"/>
-              <w:jc w:val="center"/>
-              <w:rPr>
-                <w:b/>
-                <w:bCs/>
-                <w:iCs/>
-                <w:sz w:val="24"/>
-                <w:szCs w:val="24"/>
-              </w:rPr>
-            </w:pPr>
-            <w:r>
-              <w:rPr>
-                <w:b/>
-                <w:bCs/>
-                <w:iCs/>
-                <w:sz w:val="24"/>
-                <w:szCs w:val="24"/>
-              </w:rPr>
-              <w:t xml:space="preserve">Reviewed </w:t>
-            </w:r>
-          </w:p>
-          <w:p>
-            <w:pPr>
-              <w:pStyle w:val="Header"/>
-              <w:tabs>
-                <w:tab w:val="center" w:pos="4802"/>
-              </w:tabs>
-              <w:spacing w:line="276" w:lineRule="auto"/>
-              <w:ind w:left="-155" w:right="-152"/>
-              <w:jc w:val="center"/>
-              <w:rPr>
-                <w:b/>
-                <w:bCs/>
-                <w:iCs/>
-                <w:sz w:val="24"/>
-                <w:szCs w:val="24"/>
-              </w:rPr>
-            </w:pPr>
-            <w:r>
-              <w:rPr>
-                <w:b/>
-                <w:bCs/>
-                <w:iCs/>
-                <w:sz w:val="24"/>
-                <w:szCs w:val="24"/>
-              </w:rPr>
-              <w:t>By QA</w:t>
-            </w:r>
-          </w:p>
-          <w:p>
-            <w:pPr>
-              <w:pStyle w:val="Header"/>
-              <w:tabs>
-                <w:tab w:val="center" w:pos="4802"/>
-              </w:tabs>
-              <w:spacing w:line="276" w:lineRule="auto"/>
-              <w:ind w:left="-155" w:right="-152"/>
-              <w:jc w:val="center"/>
-              <w:rPr>
-                <w:b/>
-                <w:bCs/>
-                <w:iCs/>
-                <w:sz w:val="24"/>
-                <w:szCs w:val="24"/>
-              </w:rPr>
-            </w:pPr>
-            <w:r>
-              <w:rPr>
-                <w:b/>
-                <w:bCs/>
-                <w:iCs/>
-                <w:sz w:val="24"/>
-                <w:szCs w:val="24"/>
-              </w:rPr>
-              <w:t>(Sign/Date)</w:t>
-            </w:r>
-          </w:p>
-        </w:tc>
-        <w:tc>
-          <w:tcPr>
-            <w:tcW w:w="915" w:type="pct"/>
-            <w:vAlign w:val="center"/>
-          </w:tcPr>
-          <w:p>
-            <w:pPr>
-              <w:pStyle w:val="Header"/>
-              <w:tabs>
-                <w:tab w:val="center" w:pos="4802"/>
-              </w:tabs>
-              <w:spacing w:line="276" w:lineRule="auto"/>
-              <w:ind w:left="-155" w:right="-152"/>
-              <w:jc w:val="center"/>
-              <w:rPr>
-                <w:b/>
-                <w:bCs/>
-                <w:iCs/>
-                <w:sz w:val="24"/>
-                <w:szCs w:val="24"/>
-              </w:rPr>
-            </w:pPr>
-            <w:r>
-              <w:rPr>
-                <w:b/>
-                <w:bCs/>
-                <w:iCs/>
-                <w:sz w:val="24"/>
-                <w:szCs w:val="24"/>
-              </w:rPr>
-              <w:t xml:space="preserve">Approved </w:t>
-            </w:r>
-          </w:p>
-          <w:p>
-            <w:pPr>
-              <w:pStyle w:val="Header"/>
-              <w:tabs>
-                <w:tab w:val="center" w:pos="4802"/>
-              </w:tabs>
-              <w:spacing w:line="276" w:lineRule="auto"/>
-              <w:ind w:left="-155" w:right="-152"/>
-              <w:jc w:val="center"/>
-              <w:rPr>
-                <w:b/>
-                <w:bCs/>
-                <w:iCs/>
-                <w:sz w:val="24"/>
-                <w:szCs w:val="24"/>
-              </w:rPr>
-            </w:pPr>
-            <w:r>
-              <w:rPr>
-                <w:b/>
-                <w:bCs/>
-                <w:iCs/>
-                <w:sz w:val="24"/>
-                <w:szCs w:val="24"/>
-              </w:rPr>
-              <w:t>By QA</w:t>
-            </w:r>
-          </w:p>
-          <w:p>
-            <w:pPr>
-              <w:pStyle w:val="Header"/>
-              <w:tabs>
-                <w:tab w:val="center" w:pos="4802"/>
-              </w:tabs>
-              <w:spacing w:line="276" w:lineRule="auto"/>
-              <w:ind w:left="-155" w:right="-152"/>
-              <w:jc w:val="center"/>
-              <w:rPr>
-                <w:b/>
-                <w:bCs/>
-                <w:iCs/>
-                <w:sz w:val="24"/>
-                <w:szCs w:val="24"/>
-              </w:rPr>
-            </w:pPr>
-            <w:r>
-              <w:rPr>
-                <w:b/>
-                <w:bCs/>
-                <w:iCs/>
-                <w:sz w:val="24"/>
-                <w:szCs w:val="24"/>
-              </w:rPr>
-              <w:t>(Sign/Date)</w:t>
-            </w:r>
-          </w:p>
-        </w:tc>
-      </w:tr>
-      <w:tr>
-        <w:trPr>
-          <w:trHeight w:val="1088"/>
-          <w:jc w:val="center"/>
-        </w:trPr>
-        <w:tc>
-          <w:tcPr>
-            <w:tcW w:w="988" w:type="pct"/>
-          </w:tcPr>
-          <w:p>
-            <w:pPr>
-              <w:pStyle w:val="Header"/>
-              <w:tabs>
-                <w:tab w:val="center" w:pos="4802"/>
-              </w:tabs>
-              <w:spacing w:line="276" w:lineRule="auto"/>
-              <w:rPr>
-                <w:b/>
-                <w:bCs/>
-                <w:iCs/>
-                <w:sz w:val="24"/>
-                <w:szCs w:val="24"/>
-              </w:rPr>
-            </w:pPr>
-          </w:p>
-        </w:tc>
-        <w:tc>
-          <w:tcPr>
-            <w:tcW w:w="903" w:type="pct"/>
-          </w:tcPr>
-          <w:p>
-            <w:pPr>
-              <w:pStyle w:val="Header"/>
-              <w:tabs>
-                <w:tab w:val="center" w:pos="4802"/>
-              </w:tabs>
-              <w:spacing w:line="276" w:lineRule="auto"/>
-              <w:ind w:hanging="720"/>
-              <w:rPr>
-                <w:b/>
-                <w:bCs/>
-                <w:iCs/>
-                <w:sz w:val="24"/>
-                <w:szCs w:val="24"/>
-              </w:rPr>
-            </w:pPr>
-            <w:r>
-              <w:rPr>
-                <w:b/>
-                <w:bCs/>
-                <w:iCs/>
-                <w:sz w:val="24"/>
-                <w:szCs w:val="24"/>
-              </w:rPr>
-              <w:t xml:space="preserve"/>
-            </w:r>
-          </w:p>
-        </w:tc>
-        <w:tc>
-          <w:tcPr>
-            <w:tcW w:w="1161" w:type="pct"/>
-          </w:tcPr>
-          <w:p>
-            <w:pPr>
-              <w:pStyle w:val="Header"/>
-              <w:tabs>
-                <w:tab w:val="center" w:pos="4802"/>
-              </w:tabs>
-              <w:spacing w:line="276" w:lineRule="auto"/>
-              <w:ind w:left="-49" w:hanging="56"/>
-              <w:rPr>
-                <w:b/>
-                <w:bCs/>
-                <w:iCs/>
-                <w:sz w:val="24"/>
-                <w:szCs w:val="24"/>
-              </w:rPr>
-            </w:pPr>
-          </w:p>
-        </w:tc>
-        <w:tc>
-          <w:tcPr>
-            <w:tcW w:w="1033" w:type="pct"/>
-          </w:tcPr>
-          <w:p>
-            <w:pPr>
-              <w:pStyle w:val="Header"/>
-              <w:tabs>
-                <w:tab w:val="center" w:pos="4802"/>
-              </w:tabs>
-              <w:spacing w:line="276" w:lineRule="auto"/>
-              <w:ind w:hanging="720"/>
-              <w:rPr>
-                <w:b/>
-                <w:bCs/>
-                <w:iCs/>
-                <w:sz w:val="24"/>
-                <w:szCs w:val="24"/>
-              </w:rPr>
-            </w:pPr>
-          </w:p>
-        </w:tc>
-        <w:tc>
-          <w:tcPr>
-            <w:tcW w:w="915" w:type="pct"/>
-          </w:tcPr>
-          <w:p>
-            <w:pPr>
-              <w:pStyle w:val="Header"/>
-              <w:tabs>
-                <w:tab w:val="center" w:pos="4802"/>
-              </w:tabs>
-              <w:spacing w:line="276" w:lineRule="auto"/>
-              <w:ind w:hanging="720"/>
-              <w:rPr>
-                <w:b/>
-                <w:bCs/>
-                <w:iCs/>
-                <w:sz w:val="24"/>
-                <w:szCs w:val="24"/>
-              </w:rPr>
-            </w:pPr>
-          </w:p>
-        </w:tc>
-      </w:tr>
-    </w:tbl>
-    <w:p/>
     <w:sectPr>
       <w:headerReference w:type="even" r:id="rId8"/>
       <w:headerReference w:type="default" r:id="rId9"/>
@@ -2754,7 +909,7 @@
         <w:sz w:val="24"/>
         <w:szCs w:val="24"/>
       </w:rPr>
-      <w:t>/DP/QA/008/F04</w:t>
+      <w:t>/DVR</w:t>
     </w:r>
     <w:r>
       <w:rPr>
@@ -3167,7 +1322,7 @@
               <w:sz w:val="24"/>
               <w:szCs w:val="24"/>
             </w:rPr>
-            <w:t>Investigation Report</w:t>
+            <w:t>Design Verification Report</w:t>
           </w:r>
         </w:p>
       </w:tc>

</xml_diff>

<commit_message>
Clean Word headers of leftover Refe text, stray quotes, and a stretched logo.
</commit_message>
<xml_diff>
--- a/templates/design-verification-report-template.docx
+++ b/templates/design-verification-report-template.docx
@@ -996,110 +996,6 @@
 
 <file path=word/header2.xml><?xml version="1.0" encoding="utf-8"?>
 <w:hdr xmlns:wpc="http://schemas.microsoft.com/office/word/2010/wordprocessingCanvas" xmlns:cx="http://schemas.microsoft.com/office/drawing/2014/chartex" xmlns:cx1="http://schemas.microsoft.com/office/drawing/2015/9/8/chartex" xmlns:cx2="http://schemas.microsoft.com/office/drawing/2015/10/21/chartex" xmlns:cx3="http://schemas.microsoft.com/office/drawing/2016/5/9/chartex" xmlns:cx4="http://schemas.microsoft.com/office/drawing/2016/5/10/chartex" xmlns:cx5="http://schemas.microsoft.com/office/drawing/2016/5/11/chartex" xmlns:cx6="http://schemas.microsoft.com/office/drawing/2016/5/12/chartex" xmlns:cx7="http://schemas.microsoft.com/office/drawing/2016/5/13/chartex" xmlns:cx8="http://schemas.microsoft.com/office/drawing/2016/5/14/chartex" xmlns:mc="http://schemas.openxmlformats.org/markup-compatibility/2006" xmlns:aink="http://schemas.microsoft.com/office/drawing/2016/ink" xmlns:am3d="http://schemas.microsoft.com/office/drawing/2017/model3d" xmlns:o="urn:schemas-microsoft-com:office:office" xmlns:oel="http://schemas.microsoft.com/office/2019/extlst" xmlns:r="http://schemas.openxmlformats.org/officeDocument/2006/relationships" xmlns:m="http://schemas.openxmlformats.org/officeDocument/2006/math" xmlns:v="urn:schemas-microsoft-com:vml" xmlns:wp14="http://schemas.microsoft.com/office/word/2010/wordprocessingDrawing" xmlns:wp="http://schemas.openxmlformats.org/drawingml/2006/wordprocessingDrawing" xmlns:w10="urn:schemas-microsoft-com:office:word" xmlns:w="http://schemas.openxmlformats.org/wordprocessingml/2006/main" xmlns:w14="http://schemas.microsoft.com/office/word/2010/wordml" xmlns:w15="http://schemas.microsoft.com/office/word/2012/wordml" xmlns:w16cex="http://schemas.microsoft.com/office/word/2018/wordml/cex" xmlns:w16cid="http://schemas.microsoft.com/office/word/2016/wordml/cid" xmlns:w16="http://schemas.microsoft.com/office/word/2018/wordml" xmlns:w16du="http://schemas.microsoft.com/office/word/2023/wordml/word16du" xmlns:w16sdtdh="http://schemas.microsoft.com/office/word/2020/wordml/sdtdatahash" xmlns:w16sdtfl="http://schemas.microsoft.com/office/word/2024/wordml/sdtformatlock" xmlns:w16se="http://schemas.microsoft.com/office/word/2015/wordml/symex" xmlns:wpg="http://schemas.microsoft.com/office/word/2010/wordprocessingGroup" xmlns:wpi="http://schemas.microsoft.com/office/word/2010/wordprocessingInk" xmlns:wne="http://schemas.microsoft.com/office/word/2006/wordml" xmlns:wps="http://schemas.microsoft.com/office/word/2010/wordprocessingShape" mc:Ignorable="w14 w15 w16se w16cid w16 w16cex w16sdtdh w16sdtfl w16du wp14">
-  <w:p>
-    <w:pPr>
-      <w:tabs>
-        <w:tab w:val="left" w:pos="1080"/>
-        <w:tab w:val="left" w:pos="7995"/>
-      </w:tabs>
-      <w:spacing w:line="276" w:lineRule="auto"/>
-      <w:ind w:right="-144"/>
-      <w:rPr>
-        <w:b/>
-        <w:sz w:val="24"/>
-        <w:szCs w:val="24"/>
-        <w:u w:val="single"/>
-      </w:rPr>
-    </w:pPr>
-    <w:r>
-      <w:rPr>
-        <w:b/>
-        <w:sz w:val="24"/>
-        <w:szCs w:val="24"/>
-      </w:rPr>
-      <w:t>Ref</w:t>
-    </w:r>
-    <w:r>
-      <w:rPr>
-        <w:b/>
-        <w:sz w:val="24"/>
-        <w:szCs w:val="24"/>
-      </w:rPr>
-      <w:t>e</w:t>
-    </w:r>
-    <w:r>
-      <w:rPr>
-        <w:b/>
-        <w:sz w:val="24"/>
-        <w:szCs w:val="24"/>
-      </w:rPr>
-      <w:t/>
-    </w:r>
-    <w:r>
-      <w:rPr>
-        <w:b/>
-        <w:sz w:val="24"/>
-        <w:szCs w:val="24"/>
-      </w:rPr>
-      <w:t xml:space="preserve"> </w:t>
-    </w:r>
-    <w:r>
-      <w:rPr>
-        <w:b/>
-        <w:sz w:val="24"/>
-        <w:szCs w:val="24"/>
-      </w:rPr>
-      <w:t/>
-    </w:r>
-    <w:r>
-      <w:rPr>
-        <w:b/>
-        <w:sz w:val="24"/>
-        <w:szCs w:val="24"/>
-      </w:rPr>
-      <w:t/>
-    </w:r>
-    <w:r>
-      <w:rPr>
-        <w:b/>
-        <w:sz w:val="24"/>
-        <w:szCs w:val="24"/>
-      </w:rPr>
-      <w:t/>
-    </w:r>
-    <w:r>
-      <w:rPr>
-        <w:b/>
-        <w:sz w:val="24"/>
-        <w:szCs w:val="24"/>
-      </w:rPr>
-      <w:t/>
-    </w:r>
-    <w:r>
-      <w:rPr>
-        <w:b/>
-        <w:sz w:val="24"/>
-        <w:szCs w:val="24"/>
-      </w:rPr>
-      <w:t xml:space="preserve">                                                                           </w:t>
-    </w:r>
-    <w:r>
-      <w:rPr>
-        <w:b/>
-        <w:sz w:val="24"/>
-        <w:szCs w:val="24"/>
-      </w:rPr>
-      <w:t xml:space="preserve">  </w:t>
-    </w:r>
-    <w:r>
-      <w:rPr>
-        <w:b/>
-        <w:sz w:val="24"/>
-        <w:szCs w:val="24"/>
-      </w:rPr>
-      <w:t/>
-    </w:r>
-  </w:p>
   <w:tbl>
     <w:tblPr>
       <w:tblW w:w="5000" w:type="pct"/>
@@ -1164,51 +1060,6 @@
             <w:t>Andrei</w:t>
           </w:r>
         </w:p>
-        <w:p>
-          <w:pPr>
-            <w:pStyle w:val="Heading1"/>
-            <w:spacing w:line="240" w:lineRule="atLeast"/>
-            <w:jc w:val="center"/>
-            <w:rPr>
-              <w:rFonts w:cs="Arial"/>
-              <w:b w:val="0"/>
-              <w:szCs w:val="24"/>
-              <w:lang w:val="en-US" w:eastAsia="en-US"/>
-            </w:rPr>
-          </w:pPr>
-          <w:r>
-            <w:rPr>
-              <w:bCs/>
-              <w:szCs w:val="24"/>
-              <w:lang w:val="en-IN" w:eastAsia="en-US"/>
-            </w:rPr>
-            <w:t/>
-          </w:r>
-          <w:r>
-            <w:rPr>
-              <w:bCs/>
-              <w:szCs w:val="24"/>
-              <w:lang w:val="en-IN" w:eastAsia="en-US"/>
-            </w:rPr>
-            <w:t>,</w:t>
-          </w:r>
-          <w:r>
-            <w:rPr>
-              <w:bCs/>
-              <w:szCs w:val="24"/>
-              <w:lang w:val="en-IN" w:eastAsia="en-US"/>
-            </w:rPr>
-            <w:t xml:space="preserve"/>
-          </w:r>
-          <w:r>
-            <w:rPr>
-              <w:bCs/>
-              <w:szCs w:val="24"/>
-              <w:lang w:val="en-IN" w:eastAsia="en-US"/>
-            </w:rPr>
-            <w:t>.</w:t>
-          </w:r>
-        </w:p>
       </w:tc>
       <w:tc>
         <w:tcPr>
@@ -1237,7 +1088,7 @@
             </w:rPr>
             <w:drawing>
               <wp:inline distT="0" distB="0" distL="0" distR="0" wp14:anchorId="2CF035CD" wp14:editId="164CD796">
-                <wp:extent cx="457200" cy="365760"/>
+                <wp:extent cx="457200" cy="157044"/>
                 <wp:effectExtent l="0" t="0" r="0" b="0"/>
                 <wp:docPr id="250025808" name="Picture 250025808"/>
                 <wp:cNvGraphicFramePr>
@@ -1268,7 +1119,7 @@
                       <pic:spPr bwMode="auto">
                         <a:xfrm>
                           <a:off x="0" y="0"/>
-                          <a:ext cx="457200" cy="365760"/>
+                          <a:ext cx="457200" cy="157044"/>
                         </a:xfrm>
                         <a:prstGeom prst="rect">
                           <a:avLst/>

</xml_diff>

<commit_message>
Give design verification its own Word export layout (#122)
* Give design verification its own Word export layout.

The DV template was a byte-for-byte copy of the investigation report, so
exports landed in a DMAIC document with the wrong download name.

* Clean Word headers of leftover Refe text, stray quotes, and a stretched logo.
</commit_message>
<xml_diff>
--- a/templates/design-verification-report-template.docx
+++ b/templates/design-verification-report-template.docx
@@ -19,7 +19,7 @@
           <w:insideH w:val="single" w:sz="4" w:space="0" w:color="auto"/>
           <w:insideV w:val="single" w:sz="4" w:space="0" w:color="auto"/>
         </w:tblBorders>
-        <w:tblLook w:val="01E0" w:firstRow="1" w:lastRow="1" w:firstColumn="1" w:lastColumn="1" w:noHBand="0" w:noVBand="0"/>
+        <w:tblLook w:val="01E0" w:firstRow="1" w:lastRow="0" w:firstColumn="1" w:lastColumn="1" w:noHBand="0" w:noVBand="0"/>
       </w:tblPr>
       <w:tblGrid>
         <w:gridCol w:w="1468"/>
@@ -29,24 +29,61 @@
       </w:tblGrid>
       <w:tr>
         <w:trPr>
-          <w:trHeight w:val="557"/>
+          <w:trHeight w:val="500"/>
           <w:jc w:val="center"/>
         </w:trPr>
         <w:tc>
           <w:tcPr>
-            <w:tcW w:w="702" w:type="pct"/>
+            <w:tcW w:w="5000" w:type="pct"/>
+            <w:gridSpan w:val="4"/>
             <w:tcBorders>
               <w:top w:val="single" w:sz="4" w:space="0" w:color="auto"/>
               <w:left w:val="single" w:sz="4" w:space="0" w:color="auto"/>
+              <w:bottom w:val="single" w:sz="4" w:space="0" w:color="auto"/>
               <w:right w:val="single" w:sz="4" w:space="0" w:color="auto"/>
             </w:tcBorders>
             <w:vAlign w:val="center"/>
-            <w:hideMark/>
           </w:tcPr>
           <w:p>
             <w:pPr>
-              <w:spacing w:before="60" w:line="276" w:lineRule="auto"/>
-              <w:jc w:val="both"/>
+              <w:spacing w:before="80" w:after="80" w:line="276" w:lineRule="auto"/>
+              <w:jc w:val="center"/>
+              <w:rPr>
+                <w:b/>
+                <w:sz w:val="28"/>
+                <w:szCs w:val="28"/>
+              </w:rPr>
+            </w:pPr>
+            <w:r>
+              <w:rPr>
+                <w:b/>
+                <w:sz w:val="28"/>
+                <w:szCs w:val="28"/>
+              </w:rPr>
+              <w:t>Design Verification Report</w:t>
+            </w:r>
+          </w:p>
+        </w:tc>
+      </w:tr>
+      <w:tr>
+        <w:trPr>
+          <w:trHeight w:val="500"/>
+          <w:jc w:val="center"/>
+        </w:trPr>
+        <w:tc>
+          <w:tcPr>
+            <w:tcW w:w="900" w:type="pct"/>
+            <w:tcBorders>
+              <w:top w:val="single" w:sz="4" w:space="0" w:color="auto"/>
+              <w:left w:val="single" w:sz="4" w:space="0" w:color="auto"/>
+              <w:bottom w:val="single" w:sz="4" w:space="0" w:color="auto"/>
+              <w:right w:val="single" w:sz="4" w:space="0" w:color="auto"/>
+            </w:tcBorders>
+            <w:vAlign w:val="center"/>
+          </w:tcPr>
+          <w:p>
+            <w:pPr>
+              <w:spacing w:before="60" w:after="40" w:line="276" w:lineRule="auto"/>
               <w:rPr>
                 <w:b/>
                 <w:sz w:val="24"/>
@@ -65,18 +102,18 @@
         </w:tc>
         <w:tc>
           <w:tcPr>
-            <w:tcW w:w="1643" w:type="pct"/>
+            <w:tcW w:w="1600" w:type="pct"/>
             <w:tcBorders>
               <w:top w:val="single" w:sz="4" w:space="0" w:color="auto"/>
               <w:left w:val="single" w:sz="4" w:space="0" w:color="auto"/>
+              <w:bottom w:val="single" w:sz="4" w:space="0" w:color="auto"/>
               <w:right w:val="single" w:sz="4" w:space="0" w:color="auto"/>
             </w:tcBorders>
             <w:vAlign w:val="center"/>
           </w:tcPr>
           <w:p>
             <w:pPr>
-              <w:spacing w:before="60" w:line="276" w:lineRule="auto"/>
-              <w:jc w:val="left"/>
+              <w:spacing w:before="60" w:after="40" w:line="276" w:lineRule="auto"/>
               <w:rPr>
                 <w:sz w:val="24"/>
                 <w:szCs w:val="24"/>
@@ -93,18 +130,18 @@
         </w:tc>
         <w:tc>
           <w:tcPr>
-            <w:tcW w:w="1197" w:type="pct"/>
+            <w:tcW w:w="1100" w:type="pct"/>
             <w:tcBorders>
               <w:top w:val="single" w:sz="4" w:space="0" w:color="auto"/>
               <w:left w:val="single" w:sz="4" w:space="0" w:color="auto"/>
+              <w:bottom w:val="single" w:sz="4" w:space="0" w:color="auto"/>
               <w:right w:val="single" w:sz="4" w:space="0" w:color="auto"/>
             </w:tcBorders>
             <w:vAlign w:val="center"/>
-            <w:hideMark/>
           </w:tcPr>
           <w:p>
             <w:pPr>
-              <w:spacing w:before="60" w:line="276" w:lineRule="auto"/>
+              <w:spacing w:before="60" w:after="40" w:line="276" w:lineRule="auto"/>
               <w:rPr>
                 <w:b/>
                 <w:sz w:val="24"/>
@@ -117,24 +154,24 @@
                 <w:sz w:val="24"/>
                 <w:szCs w:val="24"/>
               </w:rPr>
-              <w:t>Deviation No.</w:t>
+              <w:t>Document No.:</w:t>
             </w:r>
           </w:p>
         </w:tc>
         <w:tc>
           <w:tcPr>
-            <w:tcW w:w="1458" w:type="pct"/>
+            <w:tcW w:w="1400" w:type="pct"/>
             <w:tcBorders>
               <w:top w:val="single" w:sz="4" w:space="0" w:color="auto"/>
               <w:left w:val="single" w:sz="4" w:space="0" w:color="auto"/>
+              <w:bottom w:val="single" w:sz="4" w:space="0" w:color="auto"/>
               <w:right w:val="single" w:sz="4" w:space="0" w:color="auto"/>
             </w:tcBorders>
             <w:vAlign w:val="center"/>
           </w:tcPr>
           <w:p>
             <w:pPr>
-              <w:spacing w:before="60" w:line="276" w:lineRule="auto"/>
-              <w:jc w:val="left"/>
+              <w:spacing w:before="60" w:after="40" w:line="276" w:lineRule="auto"/>
               <w:rPr>
                 <w:sz w:val="24"/>
                 <w:szCs w:val="24"/>
@@ -145,32 +182,30 @@
                 <w:sz w:val="24"/>
                 <w:szCs w:val="24"/>
               </w:rPr>
-              <w:t xml:space="preserve">{deviationNo}</w:t>
+              <w:t xml:space="preserve">{documentNo}</w:t>
             </w:r>
           </w:p>
         </w:tc>
       </w:tr>
       <w:tr>
         <w:trPr>
-          <w:trHeight w:val="407"/>
+          <w:trHeight w:val="500"/>
           <w:jc w:val="center"/>
         </w:trPr>
         <w:tc>
           <w:tcPr>
-            <w:tcW w:w="5000" w:type="pct"/>
-            <w:gridSpan w:val="4"/>
+            <w:tcW w:w="900" w:type="pct"/>
             <w:tcBorders>
               <w:top w:val="single" w:sz="4" w:space="0" w:color="auto"/>
               <w:left w:val="single" w:sz="4" w:space="0" w:color="auto"/>
               <w:bottom w:val="single" w:sz="4" w:space="0" w:color="auto"/>
               <w:right w:val="single" w:sz="4" w:space="0" w:color="auto"/>
             </w:tcBorders>
-            <w:hideMark/>
+            <w:vAlign w:val="center"/>
           </w:tcPr>
           <w:p>
             <w:pPr>
-              <w:spacing w:before="60" w:line="276" w:lineRule="auto"/>
-              <w:jc w:val="left"/>
+              <w:spacing w:before="60" w:after="40" w:line="276" w:lineRule="auto"/>
               <w:rPr>
                 <w:b/>
                 <w:sz w:val="24"/>
@@ -183,187 +218,52 @@
                 <w:sz w:val="24"/>
                 <w:szCs w:val="24"/>
               </w:rPr>
-              <w:t xml:space="preserve">Investigation tool used:  </w:t>
-            </w:r>
-            <w:r>
-              <w:rPr>
-                <w:sz w:val="24"/>
-                <w:szCs w:val="24"/>
-              </w:rPr>
-              <w:fldChar w:fldCharType="begin">
-                <w:ffData>
-                  <w:name w:val="toolSixM"/>
-                  <w:enabled/>
-                  <w:calcOnExit w:val="0"/>
-                  <w:checkBox>
-                    <w:sizeAuto/>
-                    <w:default w:val="0"/>
-                  </w:checkBox>
-                </w:ffData>
-              </w:fldChar>
-            </w:r>
-            <w:r>
-              <w:rPr>
-                <w:sz w:val="24"/>
-                <w:szCs w:val="24"/>
-              </w:rPr>
-              <w:instrText xml:space="preserve"> FORMCHECKBOX </w:instrText>
-            </w:r>
-            <w:r>
-              <w:rPr>
-                <w:sz w:val="24"/>
-                <w:szCs w:val="24"/>
-              </w:rPr>
-            </w:r>
-            <w:r>
-              <w:rPr>
-                <w:sz w:val="24"/>
-                <w:szCs w:val="24"/>
-              </w:rPr>
-              <w:fldChar w:fldCharType="separate"/>
-            </w:r>
-            <w:r>
-              <w:rPr>
-                <w:sz w:val="24"/>
-                <w:szCs w:val="24"/>
-              </w:rPr>
-              <w:fldChar w:fldCharType="end"/>
-            </w:r>
-            <w:r>
-              <w:rPr>
-                <w:b/>
-                <w:sz w:val="24"/>
-                <w:szCs w:val="24"/>
-              </w:rPr>
-              <w:t xml:space="preserve"> 6M     </w:t>
-            </w:r>
-            <w:r>
-              <w:rPr>
-                <w:sz w:val="24"/>
-                <w:szCs w:val="24"/>
-              </w:rPr>
-              <w:fldChar w:fldCharType="begin">
-                <w:ffData>
-                  <w:name w:val="toolFiveWhy"/>
-                  <w:enabled/>
-                  <w:calcOnExit w:val="0"/>
-                  <w:checkBox>
-                    <w:sizeAuto/>
-                    <w:default w:val="0"/>
-                  </w:checkBox>
-                </w:ffData>
-              </w:fldChar>
-            </w:r>
-            <w:r>
-              <w:rPr>
-                <w:sz w:val="24"/>
-                <w:szCs w:val="24"/>
-              </w:rPr>
-              <w:instrText xml:space="preserve"> FORMCHECKBOX </w:instrText>
-            </w:r>
-            <w:r>
-              <w:rPr>
-                <w:sz w:val="24"/>
-                <w:szCs w:val="24"/>
-              </w:rPr>
-            </w:r>
-            <w:r>
-              <w:rPr>
-                <w:sz w:val="24"/>
-                <w:szCs w:val="24"/>
-              </w:rPr>
-              <w:fldChar w:fldCharType="separate"/>
-            </w:r>
-            <w:r>
-              <w:rPr>
-                <w:sz w:val="24"/>
-                <w:szCs w:val="24"/>
-              </w:rPr>
-              <w:fldChar w:fldCharType="end"/>
-            </w:r>
-            <w:r>
-              <w:rPr>
-                <w:b/>
-                <w:sz w:val="24"/>
-                <w:szCs w:val="24"/>
-              </w:rPr>
-              <w:t xml:space="preserve"> 5 Why     </w:t>
-            </w:r>
-            <w:r>
-              <w:rPr>
-                <w:sz w:val="24"/>
-                <w:szCs w:val="24"/>
-              </w:rPr>
-              <w:fldChar w:fldCharType="begin">
-                <w:ffData>
-                  <w:name w:val="toolBrainstorming"/>
-                  <w:enabled/>
-                  <w:calcOnExit w:val="0"/>
-                  <w:checkBox>
-                    <w:sizeAuto/>
-                    <w:default w:val="0"/>
-                  </w:checkBox>
-                </w:ffData>
-              </w:fldChar>
-            </w:r>
-            <w:r>
-              <w:rPr>
-                <w:sz w:val="24"/>
-                <w:szCs w:val="24"/>
-              </w:rPr>
-              <w:instrText xml:space="preserve"> FORMCHECKBOX </w:instrText>
-            </w:r>
-            <w:r>
-              <w:rPr>
-                <w:sz w:val="24"/>
-                <w:szCs w:val="24"/>
-              </w:rPr>
-            </w:r>
-            <w:r>
-              <w:rPr>
-                <w:sz w:val="24"/>
-                <w:szCs w:val="24"/>
-              </w:rPr>
-              <w:fldChar w:fldCharType="separate"/>
-            </w:r>
-            <w:r>
-              <w:rPr>
-                <w:sz w:val="24"/>
-                <w:szCs w:val="24"/>
-              </w:rPr>
-              <w:fldChar w:fldCharType="end"/>
-            </w:r>
-            <w:r>
-              <w:rPr>
-                <w:b/>
-                <w:sz w:val="24"/>
-                <w:szCs w:val="24"/>
-              </w:rPr>
-              <w:t xml:space="preserve"> Brainstorming</w:t>
+              <w:t>Product:</w:t>
             </w:r>
           </w:p>
         </w:tc>
-      </w:tr>
-      <w:tr>
-        <w:trPr>
-          <w:trHeight w:val="407"/>
-          <w:jc w:val="center"/>
-        </w:trPr>
         <w:tc>
           <w:tcPr>
-            <w:tcW w:w="5000" w:type="pct"/>
-            <w:gridSpan w:val="4"/>
+            <w:tcW w:w="1600" w:type="pct"/>
             <w:tcBorders>
               <w:top w:val="single" w:sz="4" w:space="0" w:color="auto"/>
               <w:left w:val="single" w:sz="4" w:space="0" w:color="auto"/>
               <w:bottom w:val="single" w:sz="4" w:space="0" w:color="auto"/>
               <w:right w:val="single" w:sz="4" w:space="0" w:color="auto"/>
             </w:tcBorders>
+            <w:vAlign w:val="center"/>
           </w:tcPr>
           <w:p>
             <w:pPr>
-              <w:spacing w:before="60" w:line="276" w:lineRule="auto"/>
-              <w:jc w:val="left"/>
+              <w:spacing w:before="60" w:after="40" w:line="276" w:lineRule="auto"/>
+              <w:rPr>
+                <w:sz w:val="24"/>
+                <w:szCs w:val="24"/>
+              </w:rPr>
+            </w:pPr>
+            <w:r>
+              <w:rPr>
+                <w:sz w:val="24"/>
+                <w:szCs w:val="24"/>
+              </w:rPr>
+              <w:t xml:space="preserve">{productName}</w:t>
+            </w:r>
+          </w:p>
+        </w:tc>
+        <w:tc>
+          <w:tcPr>
+            <w:tcW w:w="1100" w:type="pct"/>
+            <w:tcBorders>
+              <w:top w:val="single" w:sz="4" w:space="0" w:color="auto"/>
+              <w:left w:val="single" w:sz="4" w:space="0" w:color="auto"/>
+              <w:bottom w:val="single" w:sz="4" w:space="0" w:color="auto"/>
+              <w:right w:val="single" w:sz="4" w:space="0" w:color="auto"/>
+            </w:tcBorders>
+            <w:vAlign w:val="center"/>
+          </w:tcPr>
+          <w:p>
+            <w:pPr>
+              <w:spacing w:before="60" w:after="40" w:line="276" w:lineRule="auto"/>
               <w:rPr>
                 <w:b/>
                 <w:sz w:val="24"/>
@@ -376,38 +276,24 @@
                 <w:sz w:val="24"/>
                 <w:szCs w:val="24"/>
               </w:rPr>
-              <w:t xml:space="preserve">Other Tools (If any): </w:t>
-            </w:r>
-            <w:r>
-              <w:rPr>
-                <w:sz w:val="24"/>
-                <w:szCs w:val="24"/>
-              </w:rPr>
-              <w:t xml:space="preserve">{otherToolsDisplay}</w:t>
+              <w:t>Revision:</w:t>
             </w:r>
           </w:p>
         </w:tc>
-      </w:tr>
-      <w:tr>
-        <w:trPr>
-          <w:trHeight w:val="386"/>
-          <w:jc w:val="center"/>
-        </w:trPr>
         <w:tc>
           <w:tcPr>
-            <w:tcW w:w="5000" w:type="pct"/>
-            <w:gridSpan w:val="4"/>
+            <w:tcW w:w="1400" w:type="pct"/>
             <w:tcBorders>
               <w:top w:val="single" w:sz="4" w:space="0" w:color="auto"/>
               <w:left w:val="single" w:sz="4" w:space="0" w:color="auto"/>
               <w:bottom w:val="single" w:sz="4" w:space="0" w:color="auto"/>
               <w:right w:val="single" w:sz="4" w:space="0" w:color="auto"/>
             </w:tcBorders>
+            <w:vAlign w:val="center"/>
           </w:tcPr>
           <w:p>
             <w:pPr>
-              <w:spacing w:before="60" w:line="276" w:lineRule="auto"/>
-              <w:jc w:val="left"/>
+              <w:spacing w:before="60" w:after="40" w:line="276" w:lineRule="auto"/>
               <w:rPr>
                 <w:sz w:val="24"/>
                 <w:szCs w:val="24"/>
@@ -418,1451 +304,7 @@
                 <w:sz w:val="24"/>
                 <w:szCs w:val="24"/>
               </w:rPr>
-              <w:t xml:space="preserve"> </w:t>
-            </w:r>
-          </w:p>
-        </w:tc>
-      </w:tr>
-      <w:tr>
-        <w:trPr>
-          <w:trHeight w:val="360"/>
-          <w:jc w:val="center"/>
-        </w:trPr>
-        <w:tc>
-          <w:tcPr>
-            <w:tcW w:w="5000" w:type="pct"/>
-            <w:gridSpan w:val="4"/>
-            <w:tcBorders>
-              <w:top w:val="single" w:sz="4" w:space="0" w:color="auto"/>
-              <w:left w:val="single" w:sz="4" w:space="0" w:color="auto"/>
-              <w:bottom w:val="single" w:sz="4" w:space="0" w:color="auto"/>
-              <w:right w:val="single" w:sz="4" w:space="0" w:color="auto"/>
-            </w:tcBorders>
-          </w:tcPr>
-          <w:p>
-            <w:pPr>
-              <w:spacing w:before="60" w:line="276" w:lineRule="auto"/>
-              <w:jc w:val="both"/>
-              <w:rPr>
-                <w:b/>
-                <w:sz w:val="24"/>
-                <w:szCs w:val="24"/>
-              </w:rPr>
-            </w:pPr>
-            <w:r>
-              <w:rPr>
-                <w:b/>
-                <w:sz w:val="24"/>
-                <w:szCs w:val="24"/>
-              </w:rPr>
-              <w:t>Define:</w:t>
-            </w:r>
-          </w:p>
-        </w:tc>
-      </w:tr>
-      <w:tr>
-        <w:trPr>
-          <w:trHeight w:val="10583"/>
-          <w:jc w:val="center"/>
-        </w:trPr>
-        <w:tc>
-          <w:tcPr>
-            <w:tcW w:w="5000" w:type="pct"/>
-            <w:gridSpan w:val="4"/>
-            <w:tcBorders>
-              <w:top w:val="single" w:sz="4" w:space="0" w:color="auto"/>
-              <w:left w:val="single" w:sz="4" w:space="0" w:color="auto"/>
-              <w:bottom w:val="single" w:sz="4" w:space="0" w:color="auto"/>
-              <w:right w:val="single" w:sz="4" w:space="0" w:color="auto"/>
-            </w:tcBorders>
-          </w:tcPr>
-          <w:p>
-            <w:pPr>
-              <w:spacing w:before="60" w:line="276" w:lineRule="auto"/>
-              <w:jc w:val="left"/>
-              <w:rPr>
-                <w:sz w:val="24"/>
-                <w:szCs w:val="24"/>
-              </w:rPr>
-            </w:pPr>
-            <w:r>
-              <w:rPr>
-                <w:sz w:val="24"/>
-                <w:szCs w:val="24"/>
-              </w:rPr>
-              <w:t xml:space="preserve">{@defineNarrativeXml}</w:t>
-            </w:r>
-          </w:p>
-        </w:tc>
-      </w:tr>
-      <w:tr>
-        <w:trPr>
-          <w:trHeight w:val="70"/>
-          <w:jc w:val="center"/>
-        </w:trPr>
-        <w:tc>
-          <w:tcPr>
-            <w:tcW w:w="5000" w:type="pct"/>
-            <w:gridSpan w:val="4"/>
-            <w:tcBorders>
-              <w:top w:val="single" w:sz="4" w:space="0" w:color="auto"/>
-              <w:left w:val="single" w:sz="4" w:space="0" w:color="auto"/>
-              <w:bottom w:val="single" w:sz="4" w:space="0" w:color="auto"/>
-              <w:right w:val="single" w:sz="4" w:space="0" w:color="auto"/>
-            </w:tcBorders>
-            <w:hideMark/>
-          </w:tcPr>
-          <w:p>
-            <w:pPr>
-              <w:spacing w:before="60" w:line="276" w:lineRule="auto"/>
-              <w:jc w:val="both"/>
-              <w:rPr>
-                <w:b/>
-                <w:sz w:val="24"/>
-                <w:szCs w:val="24"/>
-              </w:rPr>
-            </w:pPr>
-            <w:r>
-              <w:rPr>
-                <w:b/>
-                <w:sz w:val="24"/>
-                <w:szCs w:val="24"/>
-              </w:rPr>
-              <w:t>Details Investigation:</w:t>
-            </w:r>
-          </w:p>
-        </w:tc>
-      </w:tr>
-      <w:tr>
-        <w:trPr>
-          <w:trHeight w:val="70"/>
-          <w:jc w:val="center"/>
-        </w:trPr>
-        <w:tc>
-          <w:tcPr>
-            <w:tcW w:w="5000" w:type="pct"/>
-            <w:gridSpan w:val="4"/>
-            <w:tcBorders>
-              <w:top w:val="single" w:sz="4" w:space="0" w:color="auto"/>
-              <w:left w:val="single" w:sz="4" w:space="0" w:color="auto"/>
-              <w:bottom w:val="single" w:sz="4" w:space="0" w:color="auto"/>
-              <w:right w:val="single" w:sz="4" w:space="0" w:color="auto"/>
-            </w:tcBorders>
-          </w:tcPr>
-          <w:p>
-            <w:pPr>
-              <w:spacing w:before="60" w:line="276" w:lineRule="auto"/>
-              <w:jc w:val="left"/>
-              <w:rPr>
-                <w:b/>
-                <w:sz w:val="24"/>
-                <w:szCs w:val="24"/>
-              </w:rPr>
-            </w:pPr>
-            <w:r>
-              <w:rPr>
-                <w:b/>
-                <w:sz w:val="24"/>
-                <w:szCs w:val="24"/>
-              </w:rPr>
-              <w:t xml:space="preserve">Measure:</w:t>
-            </w:r>
-          </w:p>
-          <w:p>
-            <w:pPr>
-              <w:spacing w:before="60" w:line="276" w:lineRule="auto"/>
-              <w:jc w:val="left"/>
-              <w:rPr>
-                <w:sz w:val="24"/>
-                <w:szCs w:val="24"/>
-              </w:rPr>
-            </w:pPr>
-            <w:r>
-              <w:rPr>
-                <w:sz w:val="24"/>
-                <w:szCs w:val="24"/>
-              </w:rPr>
-              <w:t xml:space="preserve">{@measureNarrativeXml}</w:t>
-            </w:r>
-          </w:p>
-        </w:tc>
-      </w:tr>
-      <w:tr>
-        <w:trPr>
-          <w:trHeight w:val="70"/>
-          <w:jc w:val="center"/>
-        </w:trPr>
-        <w:tc>
-          <w:tcPr>
-            <w:tcW w:w="5000" w:type="pct"/>
-            <w:gridSpan w:val="4"/>
-            <w:tcBorders>
-              <w:top w:val="single" w:sz="4" w:space="0" w:color="auto"/>
-              <w:left w:val="single" w:sz="4" w:space="0" w:color="auto"/>
-              <w:bottom w:val="single" w:sz="4" w:space="0" w:color="auto"/>
-              <w:right w:val="single" w:sz="4" w:space="0" w:color="auto"/>
-            </w:tcBorders>
-            <w:vAlign w:val="center"/>
-          </w:tcPr>
-          <w:p>
-            <w:pPr>
-              <w:spacing w:before="60" w:line="276" w:lineRule="auto"/>
-              <w:jc w:val="both"/>
-              <w:rPr>
-                <w:b/>
-                <w:sz w:val="24"/>
-                <w:szCs w:val="24"/>
-              </w:rPr>
-            </w:pPr>
-            <w:r>
-              <w:rPr>
-                <w:b/>
-                <w:sz w:val="24"/>
-                <w:szCs w:val="24"/>
-              </w:rPr>
-              <w:t>Analyze: Various investigation tools used to analyze the root cause like 6M, 5 Why, Personnel interview, Brainstorming etc.</w:t>
-            </w:r>
-          </w:p>
-        </w:tc>
-      </w:tr>
-      <w:tr>
-        <w:trPr>
-          <w:trHeight w:val="824"/>
-          <w:jc w:val="center"/>
-        </w:trPr>
-        <w:tc>
-          <w:tcPr>
-            <w:tcW w:w="5000" w:type="pct"/>
-            <w:gridSpan w:val="4"/>
-            <w:tcBorders>
-              <w:top w:val="single" w:sz="4" w:space="0" w:color="auto"/>
-              <w:left w:val="single" w:sz="4" w:space="0" w:color="auto"/>
-              <w:bottom w:val="single" w:sz="4" w:space="0" w:color="auto"/>
-              <w:right w:val="single" w:sz="4" w:space="0" w:color="auto"/>
-            </w:tcBorders>
-          </w:tcPr>
-          <w:p>
-            <w:pPr>
-              <w:spacing w:before="60" w:line="276" w:lineRule="auto"/>
-              <w:jc w:val="left"/>
-              <w:rPr>
-                <w:b/>
-                <w:sz w:val="24"/>
-                <w:szCs w:val="24"/>
-              </w:rPr>
-            </w:pPr>
-            <w:r>
-              <w:rPr>
-                <w:b/>
-                <w:sz w:val="24"/>
-                <w:szCs w:val="24"/>
-              </w:rPr>
-              <w:t xml:space="preserve">6 M Method (If Applicable):</w:t>
-            </w:r>
-          </w:p>
-          <w:p>
-            <w:pPr>
-              <w:spacing w:before="60" w:line="276" w:lineRule="auto"/>
-              <w:jc w:val="left"/>
-              <w:rPr>
-                <w:b/>
-                <w:sz w:val="24"/>
-                <w:szCs w:val="24"/>
-              </w:rPr>
-            </w:pPr>
-            <w:r>
-              <w:rPr>
-                <w:b/>
-                <w:sz w:val="24"/>
-                <w:szCs w:val="24"/>
-              </w:rPr>
-              <w:t xml:space="preserve">Man: </w:t>
-            </w:r>
-            <w:r>
-              <w:rPr>
-                <w:sz w:val="24"/>
-                <w:szCs w:val="24"/>
-              </w:rPr>
-              <w:t xml:space="preserve">{sixMMan}</w:t>
-            </w:r>
-          </w:p>
-          <w:p>
-            <w:pPr>
-              <w:spacing w:before="60" w:line="276" w:lineRule="auto"/>
-              <w:jc w:val="left"/>
-              <w:rPr>
-                <w:b/>
-                <w:sz w:val="24"/>
-                <w:szCs w:val="24"/>
-              </w:rPr>
-            </w:pPr>
-            <w:r>
-              <w:rPr>
-                <w:b/>
-                <w:sz w:val="24"/>
-                <w:szCs w:val="24"/>
-              </w:rPr>
-              <w:t xml:space="preserve">Machine: </w:t>
-            </w:r>
-            <w:r>
-              <w:rPr>
-                <w:sz w:val="24"/>
-                <w:szCs w:val="24"/>
-              </w:rPr>
-              <w:t xml:space="preserve">{sixMMachine}</w:t>
-            </w:r>
-          </w:p>
-          <w:p>
-            <w:pPr>
-              <w:spacing w:before="60" w:line="276" w:lineRule="auto"/>
-              <w:jc w:val="left"/>
-              <w:rPr>
-                <w:b/>
-                <w:sz w:val="24"/>
-                <w:szCs w:val="24"/>
-              </w:rPr>
-            </w:pPr>
-            <w:r>
-              <w:rPr>
-                <w:b/>
-                <w:sz w:val="24"/>
-                <w:szCs w:val="24"/>
-              </w:rPr>
-              <w:t xml:space="preserve">Measurement: </w:t>
-            </w:r>
-            <w:r>
-              <w:rPr>
-                <w:sz w:val="24"/>
-                <w:szCs w:val="24"/>
-              </w:rPr>
-              <w:t xml:space="preserve">{sixMMeasurement}</w:t>
-            </w:r>
-          </w:p>
-          <w:p>
-            <w:pPr>
-              <w:spacing w:before="60" w:line="276" w:lineRule="auto"/>
-              <w:jc w:val="left"/>
-              <w:rPr>
-                <w:b/>
-                <w:sz w:val="24"/>
-                <w:szCs w:val="24"/>
-              </w:rPr>
-            </w:pPr>
-            <w:r>
-              <w:rPr>
-                <w:b/>
-                <w:sz w:val="24"/>
-                <w:szCs w:val="24"/>
-              </w:rPr>
-              <w:t xml:space="preserve">Material: </w:t>
-            </w:r>
-            <w:r>
-              <w:rPr>
-                <w:sz w:val="24"/>
-                <w:szCs w:val="24"/>
-              </w:rPr>
-              <w:t xml:space="preserve">{sixMMaterial}</w:t>
-            </w:r>
-          </w:p>
-          <w:p>
-            <w:pPr>
-              <w:spacing w:before="60" w:line="276" w:lineRule="auto"/>
-              <w:jc w:val="left"/>
-              <w:rPr>
-                <w:b/>
-                <w:sz w:val="24"/>
-                <w:szCs w:val="24"/>
-              </w:rPr>
-            </w:pPr>
-            <w:r>
-              <w:rPr>
-                <w:b/>
-                <w:sz w:val="24"/>
-                <w:szCs w:val="24"/>
-              </w:rPr>
-              <w:t xml:space="preserve">Method: </w:t>
-            </w:r>
-            <w:r>
-              <w:rPr>
-                <w:sz w:val="24"/>
-                <w:szCs w:val="24"/>
-              </w:rPr>
-              <w:t xml:space="preserve">{sixMMethod}</w:t>
-            </w:r>
-          </w:p>
-          <w:p>
-            <w:pPr>
-              <w:spacing w:before="60" w:line="276" w:lineRule="auto"/>
-              <w:jc w:val="left"/>
-              <w:rPr>
-                <w:b/>
-                <w:sz w:val="24"/>
-                <w:szCs w:val="24"/>
-              </w:rPr>
-            </w:pPr>
-            <w:r>
-              <w:rPr>
-                <w:b/>
-                <w:sz w:val="24"/>
-                <w:szCs w:val="24"/>
-              </w:rPr>
-              <w:t xml:space="preserve">Milieu (Environment): </w:t>
-            </w:r>
-            <w:r>
-              <w:rPr>
-                <w:sz w:val="24"/>
-                <w:szCs w:val="24"/>
-              </w:rPr>
-              <w:t xml:space="preserve">{sixMMilieu}</w:t>
-            </w:r>
-          </w:p>
-          <w:p>
-            <w:pPr>
-              <w:spacing w:before="60" w:line="276" w:lineRule="auto"/>
-              <w:jc w:val="left"/>
-              <w:rPr>
-                <w:b/>
-                <w:sz w:val="24"/>
-                <w:szCs w:val="24"/>
-              </w:rPr>
-            </w:pPr>
-            <w:r>
-              <w:rPr>
-                <w:b/>
-                <w:sz w:val="24"/>
-                <w:szCs w:val="24"/>
-              </w:rPr>
-              <w:t xml:space="preserve">Conclusion: </w:t>
-            </w:r>
-            <w:r>
-              <w:rPr>
-                <w:sz w:val="24"/>
-                <w:szCs w:val="24"/>
-              </w:rPr>
-              <w:t xml:space="preserve">{sixMConclusion}</w:t>
-            </w:r>
-          </w:p>
-        </w:tc>
-      </w:tr>
-      <w:tr>
-        <w:trPr>
-          <w:trHeight w:val="70"/>
-          <w:jc w:val="center"/>
-        </w:trPr>
-        <w:tc>
-          <w:tcPr>
-            <w:tcW w:w="5000" w:type="pct"/>
-            <w:gridSpan w:val="4"/>
-            <w:tcBorders>
-              <w:top w:val="single" w:sz="4" w:space="0" w:color="auto"/>
-              <w:left w:val="single" w:sz="4" w:space="0" w:color="auto"/>
-              <w:bottom w:val="single" w:sz="4" w:space="0" w:color="auto"/>
-              <w:right w:val="single" w:sz="4" w:space="0" w:color="auto"/>
-            </w:tcBorders>
-          </w:tcPr>
-          <w:p>
-            <w:pPr>
-              <w:spacing w:before="60" w:line="276" w:lineRule="auto"/>
-              <w:jc w:val="both"/>
-              <w:rPr>
-                <w:b/>
-                <w:sz w:val="24"/>
-                <w:szCs w:val="24"/>
-              </w:rPr>
-            </w:pPr>
-            <w:r>
-              <w:rPr>
-                <w:b/>
-                <w:sz w:val="24"/>
-                <w:szCs w:val="24"/>
-              </w:rPr>
-              <w:t xml:space="preserve">Note: </w:t>
-            </w:r>
-            <w:r>
-              <w:rPr>
-                <w:b/>
-                <w:sz w:val="24"/>
-                <w:szCs w:val="24"/>
-              </w:rPr>
-              <w:t>No</w:t>
-            </w:r>
-            <w:r>
-              <w:rPr>
-                <w:b/>
-                <w:sz w:val="24"/>
-                <w:szCs w:val="24"/>
-              </w:rPr>
-              <w:t xml:space="preserve"> 6 M question shall be deleted in </w:t>
-            </w:r>
-            <w:r>
-              <w:rPr>
-                <w:b/>
-                <w:sz w:val="24"/>
-                <w:szCs w:val="24"/>
-              </w:rPr>
-              <w:t xml:space="preserve">the </w:t>
-            </w:r>
-            <w:r>
-              <w:rPr>
-                <w:b/>
-                <w:sz w:val="24"/>
-                <w:szCs w:val="24"/>
-              </w:rPr>
-              <w:t xml:space="preserve">investigation, </w:t>
-            </w:r>
-            <w:r>
-              <w:rPr>
-                <w:b/>
-                <w:sz w:val="24"/>
-                <w:szCs w:val="24"/>
-              </w:rPr>
-              <w:t>if</w:t>
-            </w:r>
-            <w:r>
-              <w:rPr>
-                <w:b/>
-                <w:sz w:val="24"/>
-                <w:szCs w:val="24"/>
-              </w:rPr>
-              <w:t xml:space="preserve"> any question is not applicable, then mention in ans. as “Not Applicable”.</w:t>
-            </w:r>
-          </w:p>
-        </w:tc>
-      </w:tr>
-      <w:tr>
-        <w:trPr>
-          <w:trHeight w:val="7820"/>
-          <w:jc w:val="center"/>
-        </w:trPr>
-        <w:tc>
-          <w:tcPr>
-            <w:tcW w:w="5000" w:type="pct"/>
-            <w:gridSpan w:val="4"/>
-            <w:tcBorders>
-              <w:top w:val="single" w:sz="4" w:space="0" w:color="auto"/>
-              <w:left w:val="single" w:sz="4" w:space="0" w:color="auto"/>
-              <w:bottom w:val="single" w:sz="4" w:space="0" w:color="auto"/>
-              <w:right w:val="single" w:sz="4" w:space="0" w:color="auto"/>
-            </w:tcBorders>
-          </w:tcPr>
-          <w:p>
-            <w:pPr>
-              <w:spacing w:before="60" w:line="276" w:lineRule="auto"/>
-              <w:jc w:val="left"/>
-              <w:rPr>
-                <w:b/>
-                <w:sz w:val="24"/>
-                <w:szCs w:val="24"/>
-              </w:rPr>
-            </w:pPr>
-            <w:r>
-              <w:rPr>
-                <w:b/>
-                <w:sz w:val="24"/>
-                <w:szCs w:val="24"/>
-              </w:rPr>
-              <w:t xml:space="preserve">5 Why Approach (If Applicable):</w:t>
-            </w:r>
-          </w:p>
-          <w:p>
-            <w:pPr>
-              <w:spacing w:before="60" w:line="276" w:lineRule="auto"/>
-              <w:jc w:val="left"/>
-              <w:rPr>
-                <w:sz w:val="24"/>
-                <w:szCs w:val="24"/>
-              </w:rPr>
-            </w:pPr>
-            <w:r>
-              <w:rPr>
-                <w:sz w:val="24"/>
-                <w:szCs w:val="24"/>
-              </w:rPr>
-              <w:t xml:space="preserve">{@fiveWhyNarrativeXml}</w:t>
-            </w:r>
-          </w:p>
-        </w:tc>
-      </w:tr>
-      <w:tr>
-        <w:trPr>
-          <w:trHeight w:val="878"/>
-          <w:jc w:val="center"/>
-        </w:trPr>
-        <w:tc>
-          <w:tcPr>
-            <w:tcW w:w="5000" w:type="pct"/>
-            <w:gridSpan w:val="4"/>
-            <w:tcBorders>
-              <w:top w:val="single" w:sz="4" w:space="0" w:color="auto"/>
-              <w:left w:val="single" w:sz="4" w:space="0" w:color="auto"/>
-              <w:bottom w:val="single" w:sz="4" w:space="0" w:color="auto"/>
-              <w:right w:val="single" w:sz="4" w:space="0" w:color="auto"/>
-            </w:tcBorders>
-          </w:tcPr>
-          <w:p>
-            <w:pPr>
-              <w:spacing w:before="60" w:line="276" w:lineRule="auto"/>
-              <w:jc w:val="left"/>
-              <w:rPr>
-                <w:b/>
-                <w:sz w:val="24"/>
-                <w:szCs w:val="24"/>
-              </w:rPr>
-            </w:pPr>
-            <w:r>
-              <w:rPr>
-                <w:b/>
-                <w:sz w:val="24"/>
-                <w:szCs w:val="24"/>
-              </w:rPr>
-              <w:t xml:space="preserve">Brainstorming:</w:t>
-            </w:r>
-          </w:p>
-          <w:p>
-            <w:pPr>
-              <w:spacing w:before="60" w:line="276" w:lineRule="auto"/>
-              <w:jc w:val="left"/>
-              <w:rPr>
-                <w:sz w:val="24"/>
-                <w:szCs w:val="24"/>
-              </w:rPr>
-            </w:pPr>
-            <w:r>
-              <w:rPr>
-                <w:sz w:val="24"/>
-                <w:szCs w:val="24"/>
-              </w:rPr>
-              <w:t xml:space="preserve">{@brainstormingXml}</w:t>
-            </w:r>
-          </w:p>
-        </w:tc>
-      </w:tr>
-      <w:tr>
-        <w:trPr>
-          <w:trHeight w:val="144"/>
-          <w:jc w:val="center"/>
-        </w:trPr>
-        <w:tc>
-          <w:tcPr>
-            <w:tcW w:w="5000" w:type="pct"/>
-            <w:gridSpan w:val="4"/>
-            <w:tcBorders>
-              <w:top w:val="single" w:sz="4" w:space="0" w:color="auto"/>
-              <w:left w:val="single" w:sz="4" w:space="0" w:color="auto"/>
-              <w:bottom w:val="single" w:sz="4" w:space="0" w:color="auto"/>
-              <w:right w:val="single" w:sz="4" w:space="0" w:color="auto"/>
-            </w:tcBorders>
-          </w:tcPr>
-          <w:p>
-            <w:pPr>
-              <w:spacing w:before="60" w:line="276" w:lineRule="auto"/>
-              <w:jc w:val="left"/>
-              <w:rPr>
-                <w:b/>
-                <w:sz w:val="24"/>
-                <w:szCs w:val="24"/>
-              </w:rPr>
-            </w:pPr>
-            <w:r>
-              <w:rPr>
-                <w:b/>
-                <w:sz w:val="24"/>
-                <w:szCs w:val="24"/>
-              </w:rPr>
-              <w:t xml:space="preserve">Other Tool if Any:</w:t>
-            </w:r>
-          </w:p>
-        </w:tc>
-      </w:tr>
-      <w:tr>
-        <w:trPr>
-          <w:trHeight w:val="863"/>
-          <w:jc w:val="center"/>
-        </w:trPr>
-        <w:tc>
-          <w:tcPr>
-            <w:tcW w:w="5000" w:type="pct"/>
-            <w:gridSpan w:val="4"/>
-            <w:tcBorders>
-              <w:top w:val="single" w:sz="4" w:space="0" w:color="auto"/>
-              <w:left w:val="single" w:sz="4" w:space="0" w:color="auto"/>
-              <w:bottom w:val="single" w:sz="4" w:space="0" w:color="auto"/>
-              <w:right w:val="single" w:sz="4" w:space="0" w:color="auto"/>
-            </w:tcBorders>
-          </w:tcPr>
-          <w:p>
-            <w:pPr>
-              <w:spacing w:before="60" w:line="276" w:lineRule="auto"/>
-              <w:jc w:val="left"/>
-              <w:rPr>
-                <w:b/>
-                <w:sz w:val="24"/>
-                <w:szCs w:val="24"/>
-              </w:rPr>
-            </w:pPr>
-            <w:r>
-              <w:rPr>
-                <w:b/>
-                <w:sz w:val="24"/>
-                <w:szCs w:val="24"/>
-              </w:rPr>
-              <w:t xml:space="preserve">Other Tool if Any:</w:t>
-            </w:r>
-          </w:p>
-          <w:p>
-            <w:pPr>
-              <w:spacing w:before="60" w:line="276" w:lineRule="auto"/>
-              <w:jc w:val="left"/>
-              <w:rPr>
-                <w:sz w:val="24"/>
-                <w:szCs w:val="24"/>
-              </w:rPr>
-            </w:pPr>
-            <w:r>
-              <w:rPr>
-                <w:sz w:val="24"/>
-                <w:szCs w:val="24"/>
-              </w:rPr>
-              <w:t xml:space="preserve">{@analyzeOtherToolsXml}</w:t>
-            </w:r>
-          </w:p>
-        </w:tc>
-      </w:tr>
-      <w:tr>
-        <w:trPr>
-          <w:trHeight w:val="399"/>
-          <w:jc w:val="center"/>
-        </w:trPr>
-        <w:tc>
-          <w:tcPr>
-            <w:tcW w:w="5000" w:type="pct"/>
-            <w:gridSpan w:val="4"/>
-            <w:tcBorders>
-              <w:top w:val="single" w:sz="4" w:space="0" w:color="auto"/>
-              <w:left w:val="single" w:sz="4" w:space="0" w:color="auto"/>
-              <w:bottom w:val="single" w:sz="4" w:space="0" w:color="auto"/>
-              <w:right w:val="single" w:sz="4" w:space="0" w:color="auto"/>
-            </w:tcBorders>
-          </w:tcPr>
-          <w:p>
-            <w:pPr>
-              <w:spacing w:before="60" w:line="276" w:lineRule="auto"/>
-              <w:jc w:val="both"/>
-              <w:rPr>
-                <w:b/>
-                <w:sz w:val="24"/>
-                <w:szCs w:val="24"/>
-              </w:rPr>
-            </w:pPr>
-            <w:r>
-              <w:rPr>
-                <w:b/>
-                <w:sz w:val="24"/>
-                <w:szCs w:val="24"/>
-              </w:rPr>
-              <w:t>Investigation Outcome:</w:t>
-            </w:r>
-          </w:p>
-        </w:tc>
-      </w:tr>
-      <w:tr>
-        <w:trPr>
-          <w:trHeight w:val="5813"/>
-          <w:jc w:val="center"/>
-        </w:trPr>
-        <w:tc>
-          <w:tcPr>
-            <w:tcW w:w="5000" w:type="pct"/>
-            <w:gridSpan w:val="4"/>
-            <w:tcBorders>
-              <w:top w:val="single" w:sz="4" w:space="0" w:color="auto"/>
-              <w:left w:val="single" w:sz="4" w:space="0" w:color="auto"/>
-              <w:bottom w:val="single" w:sz="4" w:space="0" w:color="auto"/>
-              <w:right w:val="single" w:sz="4" w:space="0" w:color="auto"/>
-            </w:tcBorders>
-          </w:tcPr>
-          <w:p>
-            <w:pPr>
-              <w:spacing w:before="60" w:line="276" w:lineRule="auto"/>
-              <w:jc w:val="left"/>
-              <w:rPr>
-                <w:sz w:val="24"/>
-                <w:szCs w:val="24"/>
-              </w:rPr>
-            </w:pPr>
-            <w:r>
-              <w:rPr>
-                <w:sz w:val="24"/>
-                <w:szCs w:val="24"/>
-              </w:rPr>
-              <w:t xml:space="preserve">{@investigationOutcomeXml}</w:t>
-            </w:r>
-          </w:p>
-        </w:tc>
-      </w:tr>
-      <w:tr>
-        <w:trPr>
-          <w:trHeight w:val="276"/>
-          <w:jc w:val="center"/>
-        </w:trPr>
-        <w:tc>
-          <w:tcPr>
-            <w:tcW w:w="5000" w:type="pct"/>
-            <w:gridSpan w:val="4"/>
-            <w:tcBorders>
-              <w:top w:val="single" w:sz="4" w:space="0" w:color="auto"/>
-              <w:left w:val="single" w:sz="4" w:space="0" w:color="auto"/>
-              <w:bottom w:val="single" w:sz="4" w:space="0" w:color="auto"/>
-              <w:right w:val="single" w:sz="4" w:space="0" w:color="auto"/>
-            </w:tcBorders>
-            <w:hideMark/>
-          </w:tcPr>
-          <w:p>
-            <w:pPr>
-              <w:spacing w:before="60" w:line="276" w:lineRule="auto"/>
-              <w:jc w:val="both"/>
-              <w:rPr>
-                <w:b/>
-                <w:sz w:val="24"/>
-                <w:szCs w:val="24"/>
-              </w:rPr>
-            </w:pPr>
-            <w:r>
-              <w:rPr>
-                <w:b/>
-                <w:sz w:val="24"/>
-                <w:szCs w:val="24"/>
-              </w:rPr>
-              <w:t>Identified Root Cause/ Probable Cause:</w:t>
-            </w:r>
-          </w:p>
-        </w:tc>
-      </w:tr>
-      <w:tr>
-        <w:trPr>
-          <w:trHeight w:val="1528"/>
-          <w:jc w:val="center"/>
-        </w:trPr>
-        <w:tc>
-          <w:tcPr>
-            <w:tcW w:w="5000" w:type="pct"/>
-            <w:gridSpan w:val="4"/>
-            <w:tcBorders>
-              <w:top w:val="single" w:sz="4" w:space="0" w:color="auto"/>
-              <w:left w:val="single" w:sz="4" w:space="0" w:color="auto"/>
-              <w:bottom w:val="single" w:sz="4" w:space="0" w:color="auto"/>
-              <w:right w:val="single" w:sz="4" w:space="0" w:color="auto"/>
-            </w:tcBorders>
-          </w:tcPr>
-          <w:p>
-            <w:pPr>
-              <w:spacing w:before="60" w:line="276" w:lineRule="auto"/>
-              <w:jc w:val="left"/>
-              <w:rPr>
-                <w:sz w:val="24"/>
-                <w:szCs w:val="24"/>
-              </w:rPr>
-            </w:pPr>
-            <w:r>
-              <w:rPr>
-                <w:sz w:val="24"/>
-                <w:szCs w:val="24"/>
-              </w:rPr>
-              <w:t xml:space="preserve">{@rootCauseNarrativeXml}</w:t>
-            </w:r>
-          </w:p>
-        </w:tc>
-      </w:tr>
-      <w:tr>
-        <w:trPr>
-          <w:trHeight w:val="425"/>
-          <w:jc w:val="center"/>
-        </w:trPr>
-        <w:tc>
-          <w:tcPr>
-            <w:tcW w:w="5000" w:type="pct"/>
-            <w:gridSpan w:val="4"/>
-            <w:tcBorders>
-              <w:top w:val="single" w:sz="4" w:space="0" w:color="auto"/>
-              <w:left w:val="single" w:sz="4" w:space="0" w:color="auto"/>
-              <w:bottom w:val="single" w:sz="4" w:space="0" w:color="auto"/>
-              <w:right w:val="single" w:sz="4" w:space="0" w:color="auto"/>
-            </w:tcBorders>
-            <w:hideMark/>
-          </w:tcPr>
-          <w:p>
-            <w:pPr>
-              <w:spacing w:before="60" w:line="276" w:lineRule="auto"/>
-              <w:jc w:val="both"/>
-              <w:rPr>
-                <w:b/>
-                <w:sz w:val="24"/>
-                <w:szCs w:val="24"/>
-              </w:rPr>
-            </w:pPr>
-            <w:r>
-              <w:rPr>
-                <w:b/>
-                <w:sz w:val="24"/>
-                <w:szCs w:val="24"/>
-              </w:rPr>
-              <w:t>Impact Assessment (System/ Document/ Product/ Equipment/Patient safety/Past batches):</w:t>
-            </w:r>
-          </w:p>
-        </w:tc>
-      </w:tr>
-      <w:tr>
-        <w:trPr>
-          <w:trHeight w:val="1358"/>
-          <w:jc w:val="center"/>
-        </w:trPr>
-        <w:tc>
-          <w:tcPr>
-            <w:tcW w:w="5000" w:type="pct"/>
-            <w:gridSpan w:val="4"/>
-            <w:tcBorders>
-              <w:top w:val="single" w:sz="4" w:space="0" w:color="auto"/>
-              <w:left w:val="single" w:sz="4" w:space="0" w:color="auto"/>
-              <w:bottom w:val="single" w:sz="4" w:space="0" w:color="auto"/>
-              <w:right w:val="single" w:sz="4" w:space="0" w:color="auto"/>
-            </w:tcBorders>
-          </w:tcPr>
-          <w:p>
-            <w:pPr>
-              <w:spacing w:before="60" w:line="276" w:lineRule="auto"/>
-              <w:jc w:val="left"/>
-              <w:rPr>
-                <w:sz w:val="24"/>
-                <w:szCs w:val="24"/>
-              </w:rPr>
-            </w:pPr>
-            <w:r>
-              <w:rPr>
-                <w:sz w:val="24"/>
-                <w:szCs w:val="24"/>
-              </w:rPr>
-              <w:t xml:space="preserve">{@impactAssessmentXml}</w:t>
-            </w:r>
-          </w:p>
-        </w:tc>
-      </w:tr>
-      <w:tr>
-        <w:trPr>
-          <w:trHeight w:val="4084"/>
-          <w:jc w:val="center"/>
-        </w:trPr>
-        <w:tc>
-          <w:tcPr>
-            <w:tcW w:w="5000" w:type="pct"/>
-            <w:gridSpan w:val="4"/>
-            <w:tcBorders>
-              <w:top w:val="single" w:sz="4" w:space="0" w:color="auto"/>
-              <w:left w:val="single" w:sz="4" w:space="0" w:color="auto"/>
-              <w:bottom w:val="single" w:sz="4" w:space="0" w:color="auto"/>
-              <w:right w:val="single" w:sz="4" w:space="0" w:color="auto"/>
-            </w:tcBorders>
-            <w:hideMark/>
-          </w:tcPr>
-          <w:p>
-            <w:pPr>
-              <w:spacing w:before="60" w:line="276" w:lineRule="auto"/>
-              <w:jc w:val="left"/>
-              <w:rPr>
-                <w:b/>
-                <w:sz w:val="24"/>
-                <w:szCs w:val="24"/>
-              </w:rPr>
-            </w:pPr>
-            <w:r>
-              <w:rPr>
-                <w:b/>
-                <w:sz w:val="24"/>
-                <w:szCs w:val="24"/>
-              </w:rPr>
-              <w:t xml:space="preserve">Improve:</w:t>
-            </w:r>
-          </w:p>
-          <w:p>
-            <w:pPr>
-              <w:spacing w:before="60" w:line="276" w:lineRule="auto"/>
-              <w:jc w:val="left"/>
-              <w:rPr>
-                <w:sz w:val="24"/>
-                <w:szCs w:val="24"/>
-              </w:rPr>
-            </w:pPr>
-            <w:r>
-              <w:rPr>
-                <w:sz w:val="24"/>
-                <w:szCs w:val="24"/>
-              </w:rPr>
-              <w:t xml:space="preserve">{@improveNarrativeXml}</w:t>
-            </w:r>
-          </w:p>
-        </w:tc>
-      </w:tr>
-      <w:tr>
-        <w:trPr>
-          <w:trHeight w:val="368"/>
-          <w:jc w:val="center"/>
-        </w:trPr>
-        <w:tc>
-          <w:tcPr>
-            <w:tcW w:w="5000" w:type="pct"/>
-            <w:gridSpan w:val="4"/>
-            <w:tcBorders>
-              <w:top w:val="single" w:sz="4" w:space="0" w:color="auto"/>
-              <w:left w:val="single" w:sz="4" w:space="0" w:color="auto"/>
-              <w:bottom w:val="single" w:sz="4" w:space="0" w:color="auto"/>
-              <w:right w:val="single" w:sz="4" w:space="0" w:color="auto"/>
-            </w:tcBorders>
-          </w:tcPr>
-          <w:p>
-            <w:pPr>
-              <w:spacing w:before="60" w:line="276" w:lineRule="auto"/>
-              <w:rPr>
-                <w:b/>
-                <w:sz w:val="24"/>
-                <w:szCs w:val="24"/>
-              </w:rPr>
-            </w:pPr>
-            <w:r>
-              <w:rPr>
-                <w:b/>
-                <w:sz w:val="24"/>
-                <w:szCs w:val="24"/>
-              </w:rPr>
-              <w:t>Corrective Action:</w:t>
-            </w:r>
-          </w:p>
-        </w:tc>
-      </w:tr>
-      <w:tr>
-        <w:trPr>
-          <w:trHeight w:val="966"/>
-          <w:jc w:val="center"/>
-        </w:trPr>
-        <w:tc>
-          <w:tcPr>
-            <w:tcW w:w="5000" w:type="pct"/>
-            <w:gridSpan w:val="4"/>
-            <w:tcBorders>
-              <w:top w:val="single" w:sz="4" w:space="0" w:color="auto"/>
-              <w:left w:val="single" w:sz="4" w:space="0" w:color="auto"/>
-              <w:bottom w:val="single" w:sz="4" w:space="0" w:color="auto"/>
-              <w:right w:val="single" w:sz="4" w:space="0" w:color="auto"/>
-            </w:tcBorders>
-          </w:tcPr>
-          <w:p>
-            <w:pPr>
-              <w:spacing w:before="60" w:line="276" w:lineRule="auto"/>
-              <w:jc w:val="left"/>
-              <w:rPr>
-                <w:sz w:val="24"/>
-                <w:szCs w:val="24"/>
-              </w:rPr>
-            </w:pPr>
-            <w:r>
-              <w:rPr>
-                <w:sz w:val="24"/>
-                <w:szCs w:val="24"/>
-              </w:rPr>
-              <w:t xml:space="preserve">{@correctiveActionsXml}</w:t>
-            </w:r>
-          </w:p>
-        </w:tc>
-      </w:tr>
-      <w:tr>
-        <w:trPr>
-          <w:trHeight w:val="7981"/>
-          <w:jc w:val="center"/>
-        </w:trPr>
-        <w:tc>
-          <w:tcPr>
-            <w:tcW w:w="5000" w:type="pct"/>
-            <w:gridSpan w:val="4"/>
-            <w:tcBorders>
-              <w:top w:val="single" w:sz="4" w:space="0" w:color="auto"/>
-              <w:left w:val="single" w:sz="4" w:space="0" w:color="auto"/>
-              <w:bottom w:val="single" w:sz="4" w:space="0" w:color="auto"/>
-              <w:right w:val="single" w:sz="4" w:space="0" w:color="auto"/>
-            </w:tcBorders>
-          </w:tcPr>
-          <w:p>
-            <w:pPr>
-              <w:spacing w:before="60" w:line="276" w:lineRule="auto"/>
-              <w:jc w:val="left"/>
-              <w:rPr>
-                <w:b/>
-                <w:sz w:val="24"/>
-                <w:szCs w:val="24"/>
-              </w:rPr>
-            </w:pPr>
-            <w:r>
-              <w:rPr>
-                <w:b/>
-                <w:sz w:val="24"/>
-                <w:szCs w:val="24"/>
-              </w:rPr>
-              <w:t xml:space="preserve">Control:</w:t>
-            </w:r>
-          </w:p>
-          <w:p>
-            <w:pPr>
-              <w:spacing w:before="60" w:line="276" w:lineRule="auto"/>
-              <w:jc w:val="left"/>
-              <w:rPr>
-                <w:sz w:val="24"/>
-                <w:szCs w:val="24"/>
-              </w:rPr>
-            </w:pPr>
-            <w:r>
-              <w:rPr>
-                <w:sz w:val="24"/>
-                <w:szCs w:val="24"/>
-              </w:rPr>
-              <w:t xml:space="preserve">{@controlNarrativeXml}</w:t>
-            </w:r>
-          </w:p>
-        </w:tc>
-      </w:tr>
-      <w:tr>
-        <w:trPr>
-          <w:trHeight w:val="368"/>
-          <w:jc w:val="center"/>
-        </w:trPr>
-        <w:tc>
-          <w:tcPr>
-            <w:tcW w:w="5000" w:type="pct"/>
-            <w:gridSpan w:val="4"/>
-            <w:tcBorders>
-              <w:top w:val="single" w:sz="4" w:space="0" w:color="auto"/>
-              <w:left w:val="single" w:sz="4" w:space="0" w:color="auto"/>
-              <w:bottom w:val="single" w:sz="4" w:space="0" w:color="auto"/>
-              <w:right w:val="single" w:sz="4" w:space="0" w:color="auto"/>
-            </w:tcBorders>
-          </w:tcPr>
-          <w:p>
-            <w:pPr>
-              <w:spacing w:before="60" w:line="276" w:lineRule="auto"/>
-              <w:rPr>
-                <w:b/>
-                <w:sz w:val="24"/>
-                <w:szCs w:val="24"/>
-              </w:rPr>
-            </w:pPr>
-            <w:r>
-              <w:rPr>
-                <w:b/>
-                <w:sz w:val="24"/>
-                <w:szCs w:val="24"/>
-              </w:rPr>
-              <w:t>Preventive Action:</w:t>
-            </w:r>
-          </w:p>
-        </w:tc>
-      </w:tr>
-      <w:tr>
-        <w:trPr>
-          <w:trHeight w:val="368"/>
-          <w:jc w:val="center"/>
-        </w:trPr>
-        <w:tc>
-          <w:tcPr>
-            <w:tcW w:w="5000" w:type="pct"/>
-            <w:gridSpan w:val="4"/>
-            <w:tcBorders>
-              <w:top w:val="single" w:sz="4" w:space="0" w:color="auto"/>
-              <w:left w:val="single" w:sz="4" w:space="0" w:color="auto"/>
-              <w:bottom w:val="single" w:sz="4" w:space="0" w:color="auto"/>
-              <w:right w:val="single" w:sz="4" w:space="0" w:color="auto"/>
-            </w:tcBorders>
-          </w:tcPr>
-          <w:p>
-            <w:pPr>
-              <w:spacing w:before="60" w:line="276" w:lineRule="auto"/>
-              <w:jc w:val="left"/>
-              <w:rPr>
-                <w:sz w:val="24"/>
-                <w:szCs w:val="24"/>
-              </w:rPr>
-            </w:pPr>
-            <w:r>
-              <w:rPr>
-                <w:sz w:val="24"/>
-                <w:szCs w:val="24"/>
-              </w:rPr>
-              <w:t xml:space="preserve">{@preventiveActionsXml}</w:t>
-            </w:r>
-          </w:p>
-        </w:tc>
-      </w:tr>
-      <w:tr>
-        <w:trPr>
-          <w:trHeight w:val="368"/>
-          <w:jc w:val="center"/>
-        </w:trPr>
-        <w:tc>
-          <w:tcPr>
-            <w:tcW w:w="5000" w:type="pct"/>
-            <w:gridSpan w:val="4"/>
-            <w:tcBorders>
-              <w:top w:val="single" w:sz="4" w:space="0" w:color="auto"/>
-              <w:left w:val="single" w:sz="4" w:space="0" w:color="auto"/>
-              <w:bottom w:val="single" w:sz="4" w:space="0" w:color="auto"/>
-              <w:right w:val="single" w:sz="4" w:space="0" w:color="auto"/>
-            </w:tcBorders>
-          </w:tcPr>
-          <w:p>
-            <w:pPr>
-              <w:spacing w:before="60" w:line="276" w:lineRule="auto"/>
-              <w:jc w:val="left"/>
-              <w:rPr>
-                <w:b/>
-                <w:sz w:val="24"/>
-                <w:szCs w:val="24"/>
-              </w:rPr>
-            </w:pPr>
-            <w:r>
-              <w:rPr>
-                <w:b/>
-                <w:sz w:val="24"/>
-                <w:szCs w:val="24"/>
-              </w:rPr>
-              <w:t xml:space="preserve">Conclusion:</w:t>
-            </w:r>
-          </w:p>
-        </w:tc>
-      </w:tr>
-      <w:tr>
-        <w:trPr>
-          <w:trHeight w:val="368"/>
-          <w:jc w:val="center"/>
-        </w:trPr>
-        <w:tc>
-          <w:tcPr>
-            <w:tcW w:w="5000" w:type="pct"/>
-            <w:gridSpan w:val="4"/>
-            <w:tcBorders>
-              <w:top w:val="single" w:sz="4" w:space="0" w:color="auto"/>
-              <w:left w:val="single" w:sz="4" w:space="0" w:color="auto"/>
-              <w:bottom w:val="single" w:sz="4" w:space="0" w:color="auto"/>
-              <w:right w:val="single" w:sz="4" w:space="0" w:color="auto"/>
-            </w:tcBorders>
-          </w:tcPr>
-          <w:p>
-            <w:pPr>
-              <w:spacing w:before="60" w:line="276" w:lineRule="auto"/>
-              <w:jc w:val="left"/>
-              <w:rPr>
-                <w:sz w:val="24"/>
-                <w:szCs w:val="24"/>
-              </w:rPr>
-            </w:pPr>
-            <w:r>
-              <w:rPr>
-                <w:sz w:val="24"/>
-                <w:szCs w:val="24"/>
-              </w:rPr>
-              <w:t xml:space="preserve">{@conclusionNarrativeXml}</w:t>
-            </w:r>
-          </w:p>
-        </w:tc>
-      </w:tr>
-      <w:tr>
-        <w:trPr>
-          <w:trHeight w:hRule="exact" w:val="448"/>
-          <w:jc w:val="center"/>
-        </w:trPr>
-        <w:tc>
-          <w:tcPr>
-            <w:tcW w:w="5000" w:type="pct"/>
-            <w:gridSpan w:val="4"/>
-            <w:tcBorders>
-              <w:top w:val="single" w:sz="4" w:space="0" w:color="auto"/>
-              <w:left w:val="single" w:sz="4" w:space="0" w:color="auto"/>
-              <w:bottom w:val="single" w:sz="4" w:space="0" w:color="auto"/>
-              <w:right w:val="single" w:sz="4" w:space="0" w:color="auto"/>
-            </w:tcBorders>
-          </w:tcPr>
-          <w:p>
-            <w:pPr>
-              <w:spacing w:before="60" w:line="276" w:lineRule="auto"/>
-              <w:rPr>
-                <w:b/>
-                <w:sz w:val="24"/>
-                <w:szCs w:val="24"/>
-              </w:rPr>
-            </w:pPr>
-            <w:r>
-              <w:rPr>
-                <w:b/>
-                <w:sz w:val="24"/>
-                <w:szCs w:val="24"/>
-              </w:rPr>
-              <w:t>Document Reviewed:</w:t>
-            </w:r>
-          </w:p>
-          <w:p>
-            <w:pPr>
-              <w:pStyle w:val="ListParagraph"/>
-              <w:spacing w:before="60" w:line="276" w:lineRule="auto"/>
-              <w:rPr>
-                <w:bCs/>
-                <w:sz w:val="24"/>
-                <w:szCs w:val="24"/>
-              </w:rPr>
-            </w:pPr>
-          </w:p>
-          <w:p>
-            <w:pPr>
-              <w:pStyle w:val="ListParagraph"/>
-              <w:spacing w:before="60" w:line="276" w:lineRule="auto"/>
-              <w:rPr>
-                <w:bCs/>
-                <w:sz w:val="24"/>
-                <w:szCs w:val="24"/>
-              </w:rPr>
-            </w:pPr>
-          </w:p>
-        </w:tc>
-      </w:tr>
-      <w:tr>
-        <w:trPr>
-          <w:trHeight w:hRule="exact" w:val="802"/>
-          <w:jc w:val="center"/>
-        </w:trPr>
-        <w:tc>
-          <w:tcPr>
-            <w:tcW w:w="5000" w:type="pct"/>
-            <w:gridSpan w:val="4"/>
-            <w:tcBorders>
-              <w:top w:val="single" w:sz="4" w:space="0" w:color="auto"/>
-              <w:left w:val="single" w:sz="4" w:space="0" w:color="auto"/>
-              <w:bottom w:val="single" w:sz="4" w:space="0" w:color="auto"/>
-              <w:right w:val="single" w:sz="4" w:space="0" w:color="auto"/>
-            </w:tcBorders>
-          </w:tcPr>
-          <w:p>
-            <w:pPr>
-              <w:spacing w:before="60" w:line="276" w:lineRule="auto"/>
-              <w:jc w:val="left"/>
-              <w:rPr>
-                <w:sz w:val="24"/>
-                <w:szCs w:val="24"/>
-              </w:rPr>
-            </w:pPr>
-            <w:r>
-              <w:rPr>
-                <w:sz w:val="24"/>
-                <w:szCs w:val="24"/>
-              </w:rPr>
-              <w:t xml:space="preserve">{@documentsReviewedXml}</w:t>
-            </w:r>
-          </w:p>
-        </w:tc>
-      </w:tr>
-      <w:tr>
-        <w:trPr>
-          <w:trHeight w:hRule="exact" w:val="412"/>
-          <w:jc w:val="center"/>
-        </w:trPr>
-        <w:tc>
-          <w:tcPr>
-            <w:tcW w:w="5000" w:type="pct"/>
-            <w:gridSpan w:val="4"/>
-            <w:tcBorders>
-              <w:top w:val="single" w:sz="4" w:space="0" w:color="auto"/>
-              <w:left w:val="single" w:sz="4" w:space="0" w:color="auto"/>
-              <w:bottom w:val="single" w:sz="4" w:space="0" w:color="auto"/>
-              <w:right w:val="single" w:sz="4" w:space="0" w:color="auto"/>
-            </w:tcBorders>
-          </w:tcPr>
-          <w:p>
-            <w:pPr>
-              <w:spacing w:before="60" w:line="276" w:lineRule="auto"/>
-              <w:rPr>
-                <w:b/>
-                <w:sz w:val="24"/>
-                <w:szCs w:val="24"/>
-              </w:rPr>
-            </w:pPr>
-            <w:r>
-              <w:rPr>
-                <w:b/>
-                <w:sz w:val="24"/>
-                <w:szCs w:val="24"/>
-              </w:rPr>
-              <w:t>List of attachment (If applicable):</w:t>
-            </w:r>
-          </w:p>
-        </w:tc>
-      </w:tr>
-      <w:tr>
-        <w:trPr>
-          <w:trHeight w:hRule="exact" w:val="2009"/>
-          <w:jc w:val="center"/>
-        </w:trPr>
-        <w:tc>
-          <w:tcPr>
-            <w:tcW w:w="5000" w:type="pct"/>
-            <w:gridSpan w:val="4"/>
-            <w:tcBorders>
-              <w:top w:val="single" w:sz="4" w:space="0" w:color="auto"/>
-              <w:left w:val="single" w:sz="4" w:space="0" w:color="auto"/>
-              <w:bottom w:val="single" w:sz="4" w:space="0" w:color="auto"/>
-              <w:right w:val="single" w:sz="4" w:space="0" w:color="auto"/>
-            </w:tcBorders>
-          </w:tcPr>
-          <w:p>
-            <w:pPr>
-              <w:spacing w:before="60" w:line="276" w:lineRule="auto"/>
-              <w:jc w:val="left"/>
-              <w:rPr>
-                <w:sz w:val="24"/>
-                <w:szCs w:val="24"/>
-              </w:rPr>
-            </w:pPr>
-            <w:r>
-              <w:rPr>
-                <w:sz w:val="24"/>
-                <w:szCs w:val="24"/>
-              </w:rPr>
-              <w:t xml:space="preserve">{#attachments}</w:t>
-            </w:r>
-          </w:p>
-          <w:p>
-            <w:pPr>
-              <w:spacing w:before="60" w:line="276" w:lineRule="auto"/>
-              <w:jc w:val="left"/>
-              <w:rPr>
-                <w:sz w:val="24"/>
-                <w:szCs w:val="24"/>
-              </w:rPr>
-            </w:pPr>
-            <w:r>
-              <w:rPr>
-                <w:sz w:val="24"/>
-                <w:szCs w:val="24"/>
-              </w:rPr>
-              <w:t xml:space="preserve">Attachment No. {romanNumeral}: {attachmentDescription}</w:t>
-            </w:r>
-          </w:p>
-          <w:p>
-            <w:pPr>
-              <w:spacing w:before="60" w:line="276" w:lineRule="auto"/>
-              <w:jc w:val="left"/>
-              <w:rPr>
-                <w:sz w:val="24"/>
-                <w:szCs w:val="24"/>
-              </w:rPr>
-            </w:pPr>
-            <w:r>
-              <w:rPr>
-                <w:sz w:val="24"/>
-                <w:szCs w:val="24"/>
-              </w:rPr>
-              <w:t xml:space="preserve">{/attachments}</w:t>
+              <w:t xml:space="preserve">{revision}</w:t>
             </w:r>
           </w:p>
         </w:tc>
@@ -1875,602 +317,315 @@
     </w:p>
     <w:p>
       <w:pPr>
-        <w:spacing w:line="276" w:lineRule="auto"/>
-      </w:pPr>
+        <w:spacing w:before="280" w:after="40" w:line="276" w:lineRule="auto"/>
+        <w:rPr>
+          <w:b/>
+          <w:sz w:val="24"/>
+          <w:szCs w:val="24"/>
+        </w:rPr>
+      </w:pPr>
+      <w:r>
+        <w:rPr>
+          <w:b/>
+          <w:sz w:val="24"/>
+          <w:szCs w:val="24"/>
+        </w:rPr>
+        <w:t>Purpose &amp; Scope</w:t>
+      </w:r>
     </w:p>
     <w:p>
       <w:pPr>
+        <w:spacing w:before="80" w:after="40" w:line="276" w:lineRule="auto"/>
+        <w:rPr>
+          <w:sz w:val="24"/>
+          <w:szCs w:val="24"/>
+        </w:rPr>
+      </w:pPr>
+      <w:r>
+        <w:rPr>
+          <w:sz w:val="24"/>
+          <w:szCs w:val="24"/>
+        </w:rPr>
+        <w:t xml:space="preserve">{@purposeScopeXml}</w:t>
+      </w:r>
+    </w:p>
+    <w:p>
+      <w:pPr>
+        <w:spacing w:before="280" w:after="40" w:line="276" w:lineRule="auto"/>
+        <w:rPr>
+          <w:b/>
+          <w:sz w:val="24"/>
+          <w:szCs w:val="24"/>
+        </w:rPr>
+      </w:pPr>
+      <w:r>
+        <w:rPr>
+          <w:b/>
+          <w:sz w:val="24"/>
+          <w:szCs w:val="24"/>
+        </w:rPr>
+        <w:t>References</w:t>
+      </w:r>
+    </w:p>
+    <w:p>
+      <w:pPr>
+        <w:spacing w:before="80" w:after="40" w:line="276" w:lineRule="auto"/>
+        <w:rPr>
+          <w:sz w:val="24"/>
+          <w:szCs w:val="24"/>
+        </w:rPr>
+      </w:pPr>
+      <w:r>
+        <w:rPr>
+          <w:sz w:val="24"/>
+          <w:szCs w:val="24"/>
+        </w:rPr>
+        <w:t xml:space="preserve">{@referencesXml}</w:t>
+      </w:r>
+    </w:p>
+    <w:p>
+      <w:pPr>
+        <w:spacing w:before="280" w:after="40" w:line="276" w:lineRule="auto"/>
+        <w:rPr>
+          <w:b/>
+          <w:sz w:val="24"/>
+          <w:szCs w:val="24"/>
+        </w:rPr>
+      </w:pPr>
+      <w:r>
+        <w:rPr>
+          <w:b/>
+          <w:sz w:val="24"/>
+          <w:szCs w:val="24"/>
+        </w:rPr>
+        <w:t>Traceability</w:t>
+      </w:r>
+    </w:p>
+    <w:p>
+      <w:pPr>
+        <w:spacing w:before="80" w:after="40" w:line="276" w:lineRule="auto"/>
+        <w:rPr>
+          <w:sz w:val="24"/>
+          <w:szCs w:val="24"/>
+        </w:rPr>
+      </w:pPr>
+      <w:r>
+        <w:rPr>
+          <w:sz w:val="24"/>
+          <w:szCs w:val="24"/>
+        </w:rPr>
+        <w:t xml:space="preserve">{@traceabilityXml}</w:t>
+      </w:r>
+    </w:p>
+    <w:p>
+      <w:pPr>
+        <w:spacing w:before="280" w:after="40" w:line="276" w:lineRule="auto"/>
+        <w:rPr>
+          <w:b/>
+          <w:sz w:val="24"/>
+          <w:szCs w:val="24"/>
+        </w:rPr>
+      </w:pPr>
+      <w:r>
+        <w:rPr>
+          <w:b/>
+          <w:sz w:val="24"/>
+          <w:szCs w:val="24"/>
+        </w:rPr>
+        <w:t>Test Methods / Protocol Summary</w:t>
+      </w:r>
+    </w:p>
+    <w:p>
+      <w:pPr>
+        <w:spacing w:before="80" w:after="40" w:line="276" w:lineRule="auto"/>
+        <w:rPr>
+          <w:sz w:val="24"/>
+          <w:szCs w:val="24"/>
+        </w:rPr>
+      </w:pPr>
+      <w:r>
+        <w:rPr>
+          <w:sz w:val="24"/>
+          <w:szCs w:val="24"/>
+        </w:rPr>
+        <w:t xml:space="preserve">{@testMethodsXml}</w:t>
+      </w:r>
+    </w:p>
+    <w:p>
+      <w:pPr>
+        <w:spacing w:before="280" w:after="40" w:line="276" w:lineRule="auto"/>
+        <w:rPr>
+          <w:b/>
+          <w:sz w:val="24"/>
+          <w:szCs w:val="24"/>
+        </w:rPr>
+      </w:pPr>
+      <w:r>
+        <w:rPr>
+          <w:b/>
+          <w:sz w:val="24"/>
+          <w:szCs w:val="24"/>
+        </w:rPr>
+        <w:t>Test Results</w:t>
+      </w:r>
+    </w:p>
+    <w:p>
+      <w:pPr>
+        <w:spacing w:before="80" w:after="40" w:line="276" w:lineRule="auto"/>
+        <w:rPr>
+          <w:sz w:val="24"/>
+          <w:szCs w:val="24"/>
+        </w:rPr>
+      </w:pPr>
+      <w:r>
+        <w:rPr>
+          <w:sz w:val="24"/>
+          <w:szCs w:val="24"/>
+        </w:rPr>
+        <w:t xml:space="preserve">{@testResultsXml}</w:t>
+      </w:r>
+    </w:p>
+    <w:p>
+      <w:pPr>
+        <w:spacing w:before="280" w:after="40" w:line="276" w:lineRule="auto"/>
+        <w:rPr>
+          <w:b/>
+          <w:sz w:val="24"/>
+          <w:szCs w:val="24"/>
+        </w:rPr>
+      </w:pPr>
+      <w:r>
+        <w:rPr>
+          <w:b/>
+          <w:sz w:val="24"/>
+          <w:szCs w:val="24"/>
+        </w:rPr>
+        <w:t>Deviations &amp; Nonconformances</w:t>
+      </w:r>
+    </w:p>
+    <w:p>
+      <w:pPr>
+        <w:spacing w:before="80" w:after="40" w:line="276" w:lineRule="auto"/>
+        <w:rPr>
+          <w:sz w:val="24"/>
+          <w:szCs w:val="24"/>
+        </w:rPr>
+      </w:pPr>
+      <w:r>
+        <w:rPr>
+          <w:sz w:val="24"/>
+          <w:szCs w:val="24"/>
+        </w:rPr>
+        <w:t xml:space="preserve">{@deviationsXml}</w:t>
+      </w:r>
+    </w:p>
+    <w:p>
+      <w:pPr>
+        <w:spacing w:before="280" w:after="40" w:line="276" w:lineRule="auto"/>
+        <w:rPr>
+          <w:b/>
+          <w:sz w:val="24"/>
+          <w:szCs w:val="24"/>
+        </w:rPr>
+      </w:pPr>
+      <w:r>
+        <w:rPr>
+          <w:b/>
+          <w:sz w:val="24"/>
+          <w:szCs w:val="24"/>
+        </w:rPr>
+        <w:t>Conclusion</w:t>
+      </w:r>
+    </w:p>
+    <w:p>
+      <w:pPr>
+        <w:spacing w:before="80" w:after="40" w:line="276" w:lineRule="auto"/>
+        <w:rPr>
+          <w:sz w:val="24"/>
+          <w:szCs w:val="24"/>
+        </w:rPr>
+      </w:pPr>
+      <w:r>
+        <w:rPr>
+          <w:sz w:val="24"/>
+          <w:szCs w:val="24"/>
+        </w:rPr>
+        <w:t xml:space="preserve">{@conclusionXml}</w:t>
+      </w:r>
+    </w:p>
+    <w:p>
+      <w:pPr>
+        <w:spacing w:before="280" w:after="40" w:line="276" w:lineRule="auto"/>
+        <w:rPr>
+          <w:b/>
+          <w:sz w:val="24"/>
+          <w:szCs w:val="24"/>
+        </w:rPr>
+      </w:pPr>
+      <w:r>
+        <w:rPr>
+          <w:b/>
+          <w:sz w:val="24"/>
+          <w:szCs w:val="24"/>
+        </w:rPr>
+        <w:t>Approval / Sign-off</w:t>
+      </w:r>
+    </w:p>
+    <w:p>
+      <w:pPr>
+        <w:spacing w:before="80" w:after="40" w:line="276" w:lineRule="auto"/>
+        <w:rPr>
+          <w:sz w:val="24"/>
+          <w:szCs w:val="24"/>
+        </w:rPr>
+      </w:pPr>
+      <w:r>
+        <w:rPr>
+          <w:sz w:val="24"/>
+          <w:szCs w:val="24"/>
+        </w:rPr>
+        <w:t xml:space="preserve">{@approvalSignoffXml}</w:t>
+      </w:r>
+    </w:p>
+    <w:p>
+      <w:pPr>
+        <w:spacing w:before="280" w:after="40" w:line="276" w:lineRule="auto"/>
+        <w:rPr>
+          <w:b/>
+          <w:sz w:val="24"/>
+          <w:szCs w:val="24"/>
+        </w:rPr>
+      </w:pPr>
+      <w:r>
+        <w:rPr>
+          <w:b/>
+          <w:sz w:val="24"/>
+          <w:szCs w:val="24"/>
+        </w:rPr>
+        <w:t>Appendices</w:t>
+      </w:r>
+    </w:p>
+    <w:p>
+      <w:pPr>
+        <w:spacing w:before="80" w:after="40" w:line="276" w:lineRule="auto"/>
+        <w:rPr>
+          <w:sz w:val="24"/>
+          <w:szCs w:val="24"/>
+        </w:rPr>
+      </w:pPr>
+      <w:r>
+        <w:rPr>
+          <w:sz w:val="24"/>
+          <w:szCs w:val="24"/>
+        </w:rPr>
+        <w:t xml:space="preserve">{@appendicesXml}</w:t>
+      </w:r>
+    </w:p>
+    <w:p>
+      <w:pPr>
         <w:spacing w:line="276" w:lineRule="auto"/>
       </w:pPr>
     </w:p>
-    <w:tbl>
-      <w:tblPr>
-        <w:tblW w:w="10656" w:type="dxa"/>
-        <w:jc w:val="center"/>
-        <w:tblBorders>
-          <w:top w:val="single" w:sz="4" w:space="0" w:color="auto"/>
-          <w:left w:val="single" w:sz="4" w:space="0" w:color="auto"/>
-          <w:bottom w:val="single" w:sz="4" w:space="0" w:color="auto"/>
-          <w:right w:val="single" w:sz="4" w:space="0" w:color="auto"/>
-          <w:insideH w:val="single" w:sz="4" w:space="0" w:color="auto"/>
-          <w:insideV w:val="single" w:sz="4" w:space="0" w:color="auto"/>
-        </w:tblBorders>
-        <w:tblLook w:val="04A0" w:firstRow="1" w:lastRow="0" w:firstColumn="1" w:lastColumn="0" w:noHBand="0" w:noVBand="1"/>
-      </w:tblPr>
-      <w:tr>
-        <w:trPr>
-          <w:trHeight w:val="863"/>
-          <w:jc w:val="center"/>
-        </w:trPr>
-        <w:tc>
-          <w:tcPr>
-            <w:tcW w:w="988" w:type="pct"/>
-            <w:vAlign w:val="center"/>
-          </w:tcPr>
-          <w:p>
-            <w:pPr>
-              <w:pStyle w:val="Header"/>
-              <w:tabs>
-                <w:tab w:val="center" w:pos="4802"/>
-              </w:tabs>
-              <w:spacing w:line="276" w:lineRule="auto"/>
-              <w:ind w:left="-155" w:right="-152"/>
-              <w:jc w:val="center"/>
-              <w:rPr>
-                <w:b/>
-                <w:bCs/>
-                <w:iCs/>
-                <w:sz w:val="24"/>
-                <w:szCs w:val="24"/>
-              </w:rPr>
-            </w:pPr>
-            <w:r>
-              <w:rPr>
-                <w:b/>
-                <w:bCs/>
-                <w:iCs/>
-                <w:sz w:val="24"/>
-                <w:szCs w:val="24"/>
-              </w:rPr>
-              <w:t>Prepared                   By QC</w:t>
-            </w:r>
-          </w:p>
-          <w:p>
-            <w:pPr>
-              <w:pStyle w:val="Header"/>
-              <w:tabs>
-                <w:tab w:val="center" w:pos="4802"/>
-              </w:tabs>
-              <w:spacing w:line="276" w:lineRule="auto"/>
-              <w:ind w:left="-155" w:right="-152"/>
-              <w:jc w:val="center"/>
-              <w:rPr>
-                <w:b/>
-                <w:bCs/>
-                <w:iCs/>
-                <w:sz w:val="24"/>
-                <w:szCs w:val="24"/>
-              </w:rPr>
-            </w:pPr>
-            <w:r>
-              <w:rPr>
-                <w:b/>
-                <w:bCs/>
-                <w:iCs/>
-                <w:sz w:val="24"/>
-                <w:szCs w:val="24"/>
-              </w:rPr>
-              <w:t>(Sign/Date)</w:t>
-            </w:r>
-          </w:p>
-        </w:tc>
-        <w:tc>
-          <w:tcPr>
-            <w:tcW w:w="903" w:type="pct"/>
-            <w:vAlign w:val="center"/>
-          </w:tcPr>
-          <w:p>
-            <w:pPr>
-              <w:pStyle w:val="Header"/>
-              <w:tabs>
-                <w:tab w:val="center" w:pos="4802"/>
-              </w:tabs>
-              <w:spacing w:line="276" w:lineRule="auto"/>
-              <w:ind w:left="-155" w:right="-152"/>
-              <w:jc w:val="center"/>
-              <w:rPr>
-                <w:b/>
-                <w:bCs/>
-                <w:iCs/>
-                <w:sz w:val="24"/>
-                <w:szCs w:val="24"/>
-              </w:rPr>
-            </w:pPr>
-            <w:r>
-              <w:rPr>
-                <w:b/>
-                <w:bCs/>
-                <w:iCs/>
-                <w:sz w:val="24"/>
-                <w:szCs w:val="24"/>
-              </w:rPr>
-              <w:t>Reviewed</w:t>
-            </w:r>
-            <w:r>
-              <w:rPr>
-                <w:b/>
-                <w:bCs/>
-                <w:iCs/>
-                <w:sz w:val="24"/>
-                <w:szCs w:val="24"/>
-              </w:rPr>
-              <w:t xml:space="preserve"> </w:t>
-            </w:r>
-          </w:p>
-          <w:p>
-            <w:pPr>
-              <w:pStyle w:val="Header"/>
-              <w:tabs>
-                <w:tab w:val="center" w:pos="4802"/>
-              </w:tabs>
-              <w:spacing w:line="276" w:lineRule="auto"/>
-              <w:ind w:left="-155" w:right="-152"/>
-              <w:jc w:val="center"/>
-              <w:rPr>
-                <w:b/>
-                <w:bCs/>
-                <w:iCs/>
-                <w:sz w:val="24"/>
-                <w:szCs w:val="24"/>
-              </w:rPr>
-            </w:pPr>
-            <w:r>
-              <w:rPr>
-                <w:b/>
-                <w:bCs/>
-                <w:iCs/>
-                <w:sz w:val="24"/>
-                <w:szCs w:val="24"/>
-              </w:rPr>
-              <w:t>By QC</w:t>
-            </w:r>
-          </w:p>
-          <w:p>
-            <w:pPr>
-              <w:pStyle w:val="Header"/>
-              <w:tabs>
-                <w:tab w:val="center" w:pos="4802"/>
-              </w:tabs>
-              <w:spacing w:line="276" w:lineRule="auto"/>
-              <w:ind w:left="-155" w:right="-152"/>
-              <w:jc w:val="center"/>
-              <w:rPr>
-                <w:b/>
-                <w:bCs/>
-                <w:iCs/>
-                <w:sz w:val="24"/>
-                <w:szCs w:val="24"/>
-              </w:rPr>
-            </w:pPr>
-            <w:r>
-              <w:rPr>
-                <w:b/>
-                <w:bCs/>
-                <w:iCs/>
-                <w:sz w:val="24"/>
-                <w:szCs w:val="24"/>
-              </w:rPr>
-              <w:t>(Sign/Date)</w:t>
-            </w:r>
-          </w:p>
-        </w:tc>
-        <w:tc>
-          <w:tcPr>
-            <w:tcW w:w="1161" w:type="pct"/>
-            <w:vAlign w:val="center"/>
-          </w:tcPr>
-          <w:p>
-            <w:pPr>
-              <w:pStyle w:val="Header"/>
-              <w:tabs>
-                <w:tab w:val="center" w:pos="4802"/>
-              </w:tabs>
-              <w:spacing w:line="276" w:lineRule="auto"/>
-              <w:ind w:left="-155" w:right="-152"/>
-              <w:rPr>
-                <w:b/>
-                <w:bCs/>
-                <w:iCs/>
-                <w:sz w:val="24"/>
-                <w:szCs w:val="24"/>
-              </w:rPr>
-            </w:pPr>
-            <w:r>
-              <w:rPr>
-                <w:b/>
-                <w:bCs/>
-                <w:iCs/>
-                <w:sz w:val="24"/>
-                <w:szCs w:val="24"/>
-              </w:rPr>
-              <w:t xml:space="preserve">           </w:t>
-            </w:r>
-            <w:r>
-              <w:rPr>
-                <w:b/>
-                <w:bCs/>
-                <w:iCs/>
-                <w:sz w:val="24"/>
-                <w:szCs w:val="24"/>
-              </w:rPr>
-              <w:t xml:space="preserve">Reviewed </w:t>
-            </w:r>
-          </w:p>
-          <w:p>
-            <w:pPr>
-              <w:pStyle w:val="Header"/>
-              <w:tabs>
-                <w:tab w:val="center" w:pos="4802"/>
-              </w:tabs>
-              <w:spacing w:line="276" w:lineRule="auto"/>
-              <w:ind w:left="-155" w:right="-152"/>
-              <w:jc w:val="center"/>
-              <w:rPr>
-                <w:b/>
-                <w:bCs/>
-                <w:iCs/>
-                <w:sz w:val="24"/>
-                <w:szCs w:val="24"/>
-              </w:rPr>
-            </w:pPr>
-            <w:r>
-              <w:rPr>
-                <w:b/>
-                <w:bCs/>
-                <w:iCs/>
-                <w:sz w:val="24"/>
-                <w:szCs w:val="24"/>
-              </w:rPr>
-              <w:t>By QC</w:t>
-            </w:r>
-          </w:p>
-          <w:p>
-            <w:pPr>
-              <w:pStyle w:val="Header"/>
-              <w:tabs>
-                <w:tab w:val="center" w:pos="4802"/>
-              </w:tabs>
-              <w:spacing w:line="276" w:lineRule="auto"/>
-              <w:ind w:left="-155" w:right="-152"/>
-              <w:jc w:val="center"/>
-              <w:rPr>
-                <w:b/>
-                <w:bCs/>
-                <w:iCs/>
-                <w:sz w:val="24"/>
-                <w:szCs w:val="24"/>
-              </w:rPr>
-            </w:pPr>
-            <w:r>
-              <w:rPr>
-                <w:b/>
-                <w:bCs/>
-                <w:iCs/>
-                <w:sz w:val="24"/>
-                <w:szCs w:val="24"/>
-              </w:rPr>
-              <w:t>(Sign/Date)</w:t>
-            </w:r>
-          </w:p>
-        </w:tc>
-        <w:tc>
-          <w:tcPr>
-            <w:tcW w:w="1033" w:type="pct"/>
-            <w:vAlign w:val="center"/>
-          </w:tcPr>
-          <w:p>
-            <w:pPr>
-              <w:pStyle w:val="Header"/>
-              <w:tabs>
-                <w:tab w:val="center" w:pos="4802"/>
-              </w:tabs>
-              <w:spacing w:line="276" w:lineRule="auto"/>
-              <w:ind w:left="-155" w:right="-152"/>
-              <w:jc w:val="center"/>
-              <w:rPr>
-                <w:b/>
-                <w:bCs/>
-                <w:iCs/>
-                <w:sz w:val="24"/>
-                <w:szCs w:val="24"/>
-              </w:rPr>
-            </w:pPr>
-            <w:r>
-              <w:rPr>
-                <w:b/>
-                <w:bCs/>
-                <w:iCs/>
-                <w:sz w:val="24"/>
-                <w:szCs w:val="24"/>
-              </w:rPr>
-              <w:t xml:space="preserve">Reviewed </w:t>
-            </w:r>
-          </w:p>
-          <w:p>
-            <w:pPr>
-              <w:pStyle w:val="Header"/>
-              <w:tabs>
-                <w:tab w:val="center" w:pos="4802"/>
-              </w:tabs>
-              <w:spacing w:line="276" w:lineRule="auto"/>
-              <w:ind w:left="-155" w:right="-152"/>
-              <w:jc w:val="center"/>
-              <w:rPr>
-                <w:b/>
-                <w:bCs/>
-                <w:iCs/>
-                <w:sz w:val="24"/>
-                <w:szCs w:val="24"/>
-              </w:rPr>
-            </w:pPr>
-            <w:r>
-              <w:rPr>
-                <w:b/>
-                <w:bCs/>
-                <w:iCs/>
-                <w:sz w:val="24"/>
-                <w:szCs w:val="24"/>
-              </w:rPr>
-              <w:t>By QA</w:t>
-            </w:r>
-          </w:p>
-          <w:p>
-            <w:pPr>
-              <w:pStyle w:val="Header"/>
-              <w:tabs>
-                <w:tab w:val="center" w:pos="4802"/>
-              </w:tabs>
-              <w:spacing w:line="276" w:lineRule="auto"/>
-              <w:ind w:left="-155" w:right="-152"/>
-              <w:jc w:val="center"/>
-              <w:rPr>
-                <w:b/>
-                <w:bCs/>
-                <w:iCs/>
-                <w:sz w:val="24"/>
-                <w:szCs w:val="24"/>
-              </w:rPr>
-            </w:pPr>
-            <w:r>
-              <w:rPr>
-                <w:b/>
-                <w:bCs/>
-                <w:iCs/>
-                <w:sz w:val="24"/>
-                <w:szCs w:val="24"/>
-              </w:rPr>
-              <w:t>(Sign/Date)</w:t>
-            </w:r>
-          </w:p>
-        </w:tc>
-        <w:tc>
-          <w:tcPr>
-            <w:tcW w:w="915" w:type="pct"/>
-            <w:vAlign w:val="center"/>
-          </w:tcPr>
-          <w:p>
-            <w:pPr>
-              <w:pStyle w:val="Header"/>
-              <w:tabs>
-                <w:tab w:val="center" w:pos="4802"/>
-              </w:tabs>
-              <w:spacing w:line="276" w:lineRule="auto"/>
-              <w:ind w:left="-155" w:right="-152"/>
-              <w:jc w:val="center"/>
-              <w:rPr>
-                <w:b/>
-                <w:bCs/>
-                <w:iCs/>
-                <w:sz w:val="24"/>
-                <w:szCs w:val="24"/>
-              </w:rPr>
-            </w:pPr>
-            <w:r>
-              <w:rPr>
-                <w:b/>
-                <w:bCs/>
-                <w:iCs/>
-                <w:sz w:val="24"/>
-                <w:szCs w:val="24"/>
-              </w:rPr>
-              <w:t xml:space="preserve">Approved </w:t>
-            </w:r>
-          </w:p>
-          <w:p>
-            <w:pPr>
-              <w:pStyle w:val="Header"/>
-              <w:tabs>
-                <w:tab w:val="center" w:pos="4802"/>
-              </w:tabs>
-              <w:spacing w:line="276" w:lineRule="auto"/>
-              <w:ind w:left="-155" w:right="-152"/>
-              <w:jc w:val="center"/>
-              <w:rPr>
-                <w:b/>
-                <w:bCs/>
-                <w:iCs/>
-                <w:sz w:val="24"/>
-                <w:szCs w:val="24"/>
-              </w:rPr>
-            </w:pPr>
-            <w:r>
-              <w:rPr>
-                <w:b/>
-                <w:bCs/>
-                <w:iCs/>
-                <w:sz w:val="24"/>
-                <w:szCs w:val="24"/>
-              </w:rPr>
-              <w:t>By QA</w:t>
-            </w:r>
-          </w:p>
-          <w:p>
-            <w:pPr>
-              <w:pStyle w:val="Header"/>
-              <w:tabs>
-                <w:tab w:val="center" w:pos="4802"/>
-              </w:tabs>
-              <w:spacing w:line="276" w:lineRule="auto"/>
-              <w:ind w:left="-155" w:right="-152"/>
-              <w:jc w:val="center"/>
-              <w:rPr>
-                <w:b/>
-                <w:bCs/>
-                <w:iCs/>
-                <w:sz w:val="24"/>
-                <w:szCs w:val="24"/>
-              </w:rPr>
-            </w:pPr>
-            <w:r>
-              <w:rPr>
-                <w:b/>
-                <w:bCs/>
-                <w:iCs/>
-                <w:sz w:val="24"/>
-                <w:szCs w:val="24"/>
-              </w:rPr>
-              <w:t>(Sign/Date)</w:t>
-            </w:r>
-          </w:p>
-        </w:tc>
-      </w:tr>
-      <w:tr>
-        <w:trPr>
-          <w:trHeight w:val="1088"/>
-          <w:jc w:val="center"/>
-        </w:trPr>
-        <w:tc>
-          <w:tcPr>
-            <w:tcW w:w="988" w:type="pct"/>
-          </w:tcPr>
-          <w:p>
-            <w:pPr>
-              <w:pStyle w:val="Header"/>
-              <w:tabs>
-                <w:tab w:val="center" w:pos="4802"/>
-              </w:tabs>
-              <w:spacing w:line="276" w:lineRule="auto"/>
-              <w:rPr>
-                <w:b/>
-                <w:bCs/>
-                <w:iCs/>
-                <w:sz w:val="24"/>
-                <w:szCs w:val="24"/>
-              </w:rPr>
-            </w:pPr>
-          </w:p>
-        </w:tc>
-        <w:tc>
-          <w:tcPr>
-            <w:tcW w:w="903" w:type="pct"/>
-          </w:tcPr>
-          <w:p>
-            <w:pPr>
-              <w:pStyle w:val="Header"/>
-              <w:tabs>
-                <w:tab w:val="center" w:pos="4802"/>
-              </w:tabs>
-              <w:spacing w:line="276" w:lineRule="auto"/>
-              <w:ind w:hanging="720"/>
-              <w:rPr>
-                <w:b/>
-                <w:bCs/>
-                <w:iCs/>
-                <w:sz w:val="24"/>
-                <w:szCs w:val="24"/>
-              </w:rPr>
-            </w:pPr>
-            <w:r>
-              <w:rPr>
-                <w:b/>
-                <w:bCs/>
-                <w:iCs/>
-                <w:sz w:val="24"/>
-                <w:szCs w:val="24"/>
-              </w:rPr>
-              <w:t xml:space="preserve"/>
-            </w:r>
-          </w:p>
-        </w:tc>
-        <w:tc>
-          <w:tcPr>
-            <w:tcW w:w="1161" w:type="pct"/>
-          </w:tcPr>
-          <w:p>
-            <w:pPr>
-              <w:pStyle w:val="Header"/>
-              <w:tabs>
-                <w:tab w:val="center" w:pos="4802"/>
-              </w:tabs>
-              <w:spacing w:line="276" w:lineRule="auto"/>
-              <w:ind w:left="-49" w:hanging="56"/>
-              <w:rPr>
-                <w:b/>
-                <w:bCs/>
-                <w:iCs/>
-                <w:sz w:val="24"/>
-                <w:szCs w:val="24"/>
-              </w:rPr>
-            </w:pPr>
-          </w:p>
-        </w:tc>
-        <w:tc>
-          <w:tcPr>
-            <w:tcW w:w="1033" w:type="pct"/>
-          </w:tcPr>
-          <w:p>
-            <w:pPr>
-              <w:pStyle w:val="Header"/>
-              <w:tabs>
-                <w:tab w:val="center" w:pos="4802"/>
-              </w:tabs>
-              <w:spacing w:line="276" w:lineRule="auto"/>
-              <w:ind w:hanging="720"/>
-              <w:rPr>
-                <w:b/>
-                <w:bCs/>
-                <w:iCs/>
-                <w:sz w:val="24"/>
-                <w:szCs w:val="24"/>
-              </w:rPr>
-            </w:pPr>
-          </w:p>
-        </w:tc>
-        <w:tc>
-          <w:tcPr>
-            <w:tcW w:w="915" w:type="pct"/>
-          </w:tcPr>
-          <w:p>
-            <w:pPr>
-              <w:pStyle w:val="Header"/>
-              <w:tabs>
-                <w:tab w:val="center" w:pos="4802"/>
-              </w:tabs>
-              <w:spacing w:line="276" w:lineRule="auto"/>
-              <w:ind w:hanging="720"/>
-              <w:rPr>
-                <w:b/>
-                <w:bCs/>
-                <w:iCs/>
-                <w:sz w:val="24"/>
-                <w:szCs w:val="24"/>
-              </w:rPr>
-            </w:pPr>
-          </w:p>
-        </w:tc>
-      </w:tr>
-    </w:tbl>
-    <w:p/>
     <w:sectPr>
       <w:headerReference w:type="even" r:id="rId8"/>
       <w:headerReference w:type="default" r:id="rId9"/>
@@ -2754,7 +909,7 @@
         <w:sz w:val="24"/>
         <w:szCs w:val="24"/>
       </w:rPr>
-      <w:t>/DP/QA/008/F04</w:t>
+      <w:t>/DVR</w:t>
     </w:r>
     <w:r>
       <w:rPr>
@@ -2841,110 +996,6 @@
 
 <file path=word/header2.xml><?xml version="1.0" encoding="utf-8"?>
 <w:hdr xmlns:wpc="http://schemas.microsoft.com/office/word/2010/wordprocessingCanvas" xmlns:cx="http://schemas.microsoft.com/office/drawing/2014/chartex" xmlns:cx1="http://schemas.microsoft.com/office/drawing/2015/9/8/chartex" xmlns:cx2="http://schemas.microsoft.com/office/drawing/2015/10/21/chartex" xmlns:cx3="http://schemas.microsoft.com/office/drawing/2016/5/9/chartex" xmlns:cx4="http://schemas.microsoft.com/office/drawing/2016/5/10/chartex" xmlns:cx5="http://schemas.microsoft.com/office/drawing/2016/5/11/chartex" xmlns:cx6="http://schemas.microsoft.com/office/drawing/2016/5/12/chartex" xmlns:cx7="http://schemas.microsoft.com/office/drawing/2016/5/13/chartex" xmlns:cx8="http://schemas.microsoft.com/office/drawing/2016/5/14/chartex" xmlns:mc="http://schemas.openxmlformats.org/markup-compatibility/2006" xmlns:aink="http://schemas.microsoft.com/office/drawing/2016/ink" xmlns:am3d="http://schemas.microsoft.com/office/drawing/2017/model3d" xmlns:o="urn:schemas-microsoft-com:office:office" xmlns:oel="http://schemas.microsoft.com/office/2019/extlst" xmlns:r="http://schemas.openxmlformats.org/officeDocument/2006/relationships" xmlns:m="http://schemas.openxmlformats.org/officeDocument/2006/math" xmlns:v="urn:schemas-microsoft-com:vml" xmlns:wp14="http://schemas.microsoft.com/office/word/2010/wordprocessingDrawing" xmlns:wp="http://schemas.openxmlformats.org/drawingml/2006/wordprocessingDrawing" xmlns:w10="urn:schemas-microsoft-com:office:word" xmlns:w="http://schemas.openxmlformats.org/wordprocessingml/2006/main" xmlns:w14="http://schemas.microsoft.com/office/word/2010/wordml" xmlns:w15="http://schemas.microsoft.com/office/word/2012/wordml" xmlns:w16cex="http://schemas.microsoft.com/office/word/2018/wordml/cex" xmlns:w16cid="http://schemas.microsoft.com/office/word/2016/wordml/cid" xmlns:w16="http://schemas.microsoft.com/office/word/2018/wordml" xmlns:w16du="http://schemas.microsoft.com/office/word/2023/wordml/word16du" xmlns:w16sdtdh="http://schemas.microsoft.com/office/word/2020/wordml/sdtdatahash" xmlns:w16sdtfl="http://schemas.microsoft.com/office/word/2024/wordml/sdtformatlock" xmlns:w16se="http://schemas.microsoft.com/office/word/2015/wordml/symex" xmlns:wpg="http://schemas.microsoft.com/office/word/2010/wordprocessingGroup" xmlns:wpi="http://schemas.microsoft.com/office/word/2010/wordprocessingInk" xmlns:wne="http://schemas.microsoft.com/office/word/2006/wordml" xmlns:wps="http://schemas.microsoft.com/office/word/2010/wordprocessingShape" mc:Ignorable="w14 w15 w16se w16cid w16 w16cex w16sdtdh w16sdtfl w16du wp14">
-  <w:p>
-    <w:pPr>
-      <w:tabs>
-        <w:tab w:val="left" w:pos="1080"/>
-        <w:tab w:val="left" w:pos="7995"/>
-      </w:tabs>
-      <w:spacing w:line="276" w:lineRule="auto"/>
-      <w:ind w:right="-144"/>
-      <w:rPr>
-        <w:b/>
-        <w:sz w:val="24"/>
-        <w:szCs w:val="24"/>
-        <w:u w:val="single"/>
-      </w:rPr>
-    </w:pPr>
-    <w:r>
-      <w:rPr>
-        <w:b/>
-        <w:sz w:val="24"/>
-        <w:szCs w:val="24"/>
-      </w:rPr>
-      <w:t>Ref</w:t>
-    </w:r>
-    <w:r>
-      <w:rPr>
-        <w:b/>
-        <w:sz w:val="24"/>
-        <w:szCs w:val="24"/>
-      </w:rPr>
-      <w:t>e</w:t>
-    </w:r>
-    <w:r>
-      <w:rPr>
-        <w:b/>
-        <w:sz w:val="24"/>
-        <w:szCs w:val="24"/>
-      </w:rPr>
-      <w:t/>
-    </w:r>
-    <w:r>
-      <w:rPr>
-        <w:b/>
-        <w:sz w:val="24"/>
-        <w:szCs w:val="24"/>
-      </w:rPr>
-      <w:t xml:space="preserve"> </w:t>
-    </w:r>
-    <w:r>
-      <w:rPr>
-        <w:b/>
-        <w:sz w:val="24"/>
-        <w:szCs w:val="24"/>
-      </w:rPr>
-      <w:t/>
-    </w:r>
-    <w:r>
-      <w:rPr>
-        <w:b/>
-        <w:sz w:val="24"/>
-        <w:szCs w:val="24"/>
-      </w:rPr>
-      <w:t/>
-    </w:r>
-    <w:r>
-      <w:rPr>
-        <w:b/>
-        <w:sz w:val="24"/>
-        <w:szCs w:val="24"/>
-      </w:rPr>
-      <w:t/>
-    </w:r>
-    <w:r>
-      <w:rPr>
-        <w:b/>
-        <w:sz w:val="24"/>
-        <w:szCs w:val="24"/>
-      </w:rPr>
-      <w:t/>
-    </w:r>
-    <w:r>
-      <w:rPr>
-        <w:b/>
-        <w:sz w:val="24"/>
-        <w:szCs w:val="24"/>
-      </w:rPr>
-      <w:t xml:space="preserve">                                                                           </w:t>
-    </w:r>
-    <w:r>
-      <w:rPr>
-        <w:b/>
-        <w:sz w:val="24"/>
-        <w:szCs w:val="24"/>
-      </w:rPr>
-      <w:t xml:space="preserve">  </w:t>
-    </w:r>
-    <w:r>
-      <w:rPr>
-        <w:b/>
-        <w:sz w:val="24"/>
-        <w:szCs w:val="24"/>
-      </w:rPr>
-      <w:t/>
-    </w:r>
-  </w:p>
   <w:tbl>
     <w:tblPr>
       <w:tblW w:w="5000" w:type="pct"/>
@@ -3009,51 +1060,6 @@
             <w:t>Andrei</w:t>
           </w:r>
         </w:p>
-        <w:p>
-          <w:pPr>
-            <w:pStyle w:val="Heading1"/>
-            <w:spacing w:line="240" w:lineRule="atLeast"/>
-            <w:jc w:val="center"/>
-            <w:rPr>
-              <w:rFonts w:cs="Arial"/>
-              <w:b w:val="0"/>
-              <w:szCs w:val="24"/>
-              <w:lang w:val="en-US" w:eastAsia="en-US"/>
-            </w:rPr>
-          </w:pPr>
-          <w:r>
-            <w:rPr>
-              <w:bCs/>
-              <w:szCs w:val="24"/>
-              <w:lang w:val="en-IN" w:eastAsia="en-US"/>
-            </w:rPr>
-            <w:t/>
-          </w:r>
-          <w:r>
-            <w:rPr>
-              <w:bCs/>
-              <w:szCs w:val="24"/>
-              <w:lang w:val="en-IN" w:eastAsia="en-US"/>
-            </w:rPr>
-            <w:t>,</w:t>
-          </w:r>
-          <w:r>
-            <w:rPr>
-              <w:bCs/>
-              <w:szCs w:val="24"/>
-              <w:lang w:val="en-IN" w:eastAsia="en-US"/>
-            </w:rPr>
-            <w:t xml:space="preserve"/>
-          </w:r>
-          <w:r>
-            <w:rPr>
-              <w:bCs/>
-              <w:szCs w:val="24"/>
-              <w:lang w:val="en-IN" w:eastAsia="en-US"/>
-            </w:rPr>
-            <w:t>.</w:t>
-          </w:r>
-        </w:p>
       </w:tc>
       <w:tc>
         <w:tcPr>
@@ -3082,7 +1088,7 @@
             </w:rPr>
             <w:drawing>
               <wp:inline distT="0" distB="0" distL="0" distR="0" wp14:anchorId="2CF035CD" wp14:editId="164CD796">
-                <wp:extent cx="457200" cy="365760"/>
+                <wp:extent cx="457200" cy="157044"/>
                 <wp:effectExtent l="0" t="0" r="0" b="0"/>
                 <wp:docPr id="250025808" name="Picture 250025808"/>
                 <wp:cNvGraphicFramePr>
@@ -3113,7 +1119,7 @@
                       <pic:spPr bwMode="auto">
                         <a:xfrm>
                           <a:off x="0" y="0"/>
-                          <a:ext cx="457200" cy="365760"/>
+                          <a:ext cx="457200" cy="157044"/>
                         </a:xfrm>
                         <a:prstGeom prst="rect">
                           <a:avLst/>
@@ -3167,7 +1173,7 @@
               <w:sz w:val="24"/>
               <w:szCs w:val="24"/>
             </w:rPr>
-            <w:t>Investigation Report</w:t>
+            <w:t>Design Verification Report</w:t>
           </w:r>
         </w:p>
       </w:tc>

</xml_diff>